<commit_message>
Create file Report for ChallengeA_HW_Week7
</commit_message>
<xml_diff>
--- a/24521351_ChallengeA_Memory.docx
+++ b/24521351_ChallengeA_Memory.docx
@@ -31,8 +31,162 @@
           <w:i/>
           <w:sz w:val="24"/>
         </w:rPr>
-        <w:t>MSSV: 24521351  |  Môn: SE343 – Software Agent Engineering</w:t>
+        <w:t xml:space="preserve">MSSV: </w:t>
       </w:r>
+      <w:proofErr w:type="gramStart"/>
+      <w:r>
+        <w:rPr>
+          <w:rFonts w:ascii="Times New Roman" w:hAnsi="Times New Roman" w:cs="Times New Roman"/>
+          <w:i/>
+          <w:sz w:val="24"/>
+        </w:rPr>
+        <w:t>24521351  |</w:t>
+      </w:r>
+      <w:proofErr w:type="gramEnd"/>
+      <w:r>
+        <w:rPr>
+          <w:rFonts w:ascii="Times New Roman" w:hAnsi="Times New Roman" w:cs="Times New Roman"/>
+          <w:i/>
+          <w:sz w:val="24"/>
+        </w:rPr>
+        <w:t xml:space="preserve">  </w:t>
+      </w:r>
+      <w:proofErr w:type="spellStart"/>
+      <w:r>
+        <w:rPr>
+          <w:rFonts w:ascii="Times New Roman" w:hAnsi="Times New Roman" w:cs="Times New Roman"/>
+          <w:i/>
+          <w:sz w:val="24"/>
+        </w:rPr>
+        <w:t>Lớp</w:t>
+      </w:r>
+      <w:proofErr w:type="spellEnd"/>
+      <w:r>
+        <w:rPr>
+          <w:rFonts w:ascii="Times New Roman" w:hAnsi="Times New Roman" w:cs="Times New Roman"/>
+          <w:i/>
+          <w:sz w:val="24"/>
+        </w:rPr>
+        <w:t xml:space="preserve"> SE373.R11</w:t>
+      </w:r>
+      <w:r>
+        <w:rPr>
+          <w:rFonts w:ascii="Times New Roman" w:hAnsi="Times New Roman" w:cs="Times New Roman"/>
+          <w:i/>
+          <w:sz w:val="24"/>
+        </w:rPr>
+        <w:t xml:space="preserve"> – </w:t>
+      </w:r>
+      <w:proofErr w:type="spellStart"/>
+      <w:r>
+        <w:rPr>
+          <w:rFonts w:ascii="Times New Roman" w:hAnsi="Times New Roman" w:cs="Times New Roman"/>
+          <w:i/>
+          <w:sz w:val="24"/>
+        </w:rPr>
+        <w:t>Kỹ</w:t>
+      </w:r>
+      <w:proofErr w:type="spellEnd"/>
+      <w:r>
+        <w:rPr>
+          <w:rFonts w:ascii="Times New Roman" w:hAnsi="Times New Roman" w:cs="Times New Roman"/>
+          <w:i/>
+          <w:sz w:val="24"/>
+        </w:rPr>
+        <w:t xml:space="preserve"> </w:t>
+      </w:r>
+      <w:proofErr w:type="spellStart"/>
+      <w:r>
+        <w:rPr>
+          <w:rFonts w:ascii="Times New Roman" w:hAnsi="Times New Roman" w:cs="Times New Roman"/>
+          <w:i/>
+          <w:sz w:val="24"/>
+        </w:rPr>
+        <w:t>thuật</w:t>
+      </w:r>
+      <w:proofErr w:type="spellEnd"/>
+      <w:r>
+        <w:rPr>
+          <w:rFonts w:ascii="Times New Roman" w:hAnsi="Times New Roman" w:cs="Times New Roman"/>
+          <w:i/>
+          <w:sz w:val="24"/>
+        </w:rPr>
+        <w:t xml:space="preserve"> </w:t>
+      </w:r>
+      <w:proofErr w:type="spellStart"/>
+      <w:r>
+        <w:rPr>
+          <w:rFonts w:ascii="Times New Roman" w:hAnsi="Times New Roman" w:cs="Times New Roman"/>
+          <w:i/>
+          <w:sz w:val="24"/>
+        </w:rPr>
+        <w:t>xây</w:t>
+      </w:r>
+      <w:proofErr w:type="spellEnd"/>
+      <w:r>
+        <w:rPr>
+          <w:rFonts w:ascii="Times New Roman" w:hAnsi="Times New Roman" w:cs="Times New Roman"/>
+          <w:i/>
+          <w:sz w:val="24"/>
+        </w:rPr>
+        <w:t xml:space="preserve"> </w:t>
+      </w:r>
+      <w:proofErr w:type="spellStart"/>
+      <w:r>
+        <w:rPr>
+          <w:rFonts w:ascii="Times New Roman" w:hAnsi="Times New Roman" w:cs="Times New Roman"/>
+          <w:i/>
+          <w:sz w:val="24"/>
+        </w:rPr>
+        <w:t>dựng</w:t>
+      </w:r>
+      <w:proofErr w:type="spellEnd"/>
+      <w:r>
+        <w:rPr>
+          <w:rFonts w:ascii="Times New Roman" w:hAnsi="Times New Roman" w:cs="Times New Roman"/>
+          <w:i/>
+          <w:sz w:val="24"/>
+        </w:rPr>
+        <w:t xml:space="preserve"> </w:t>
+      </w:r>
+      <w:proofErr w:type="spellStart"/>
+      <w:r>
+        <w:rPr>
+          <w:rFonts w:ascii="Times New Roman" w:hAnsi="Times New Roman" w:cs="Times New Roman"/>
+          <w:i/>
+          <w:sz w:val="24"/>
+        </w:rPr>
+        <w:t>hệ</w:t>
+      </w:r>
+      <w:proofErr w:type="spellEnd"/>
+      <w:r>
+        <w:rPr>
+          <w:rFonts w:ascii="Times New Roman" w:hAnsi="Times New Roman" w:cs="Times New Roman"/>
+          <w:i/>
+          <w:sz w:val="24"/>
+        </w:rPr>
+        <w:t xml:space="preserve"> </w:t>
+      </w:r>
+      <w:proofErr w:type="spellStart"/>
+      <w:r>
+        <w:rPr>
+          <w:rFonts w:ascii="Times New Roman" w:hAnsi="Times New Roman" w:cs="Times New Roman"/>
+          <w:i/>
+          <w:sz w:val="24"/>
+        </w:rPr>
+        <w:t>thống</w:t>
+      </w:r>
+      <w:proofErr w:type="spellEnd"/>
+      <w:r>
+        <w:rPr>
+          <w:rFonts w:ascii="Times New Roman" w:hAnsi="Times New Roman" w:cs="Times New Roman"/>
+          <w:i/>
+          <w:sz w:val="24"/>
+        </w:rPr>
+        <w:t xml:space="preserve"> Agentic AI</w:t>
+      </w:r>
+      <w:bookmarkStart w:id="0" w:name="_GoBack"/>
+      <w:bookmarkEnd w:id="0"/>
     </w:p>
     <w:p>
       <w:pPr>
@@ -53,35 +207,7 @@
           <w:rFonts w:ascii="Times New Roman" w:hAnsi="Times New Roman" w:cs="Times New Roman"/>
           <w:color w:val="000000"/>
         </w:rPr>
-        <w:t>1. Thi</w:t>
-      </w:r>
-      <w:r>
-        <w:rPr>
-          <w:rFonts w:ascii="Times New Roman" w:hAnsi="Times New Roman" w:cs="Times New Roman"/>
-          <w:color w:val="000000"/>
-        </w:rPr>
-        <w:t>ế</w:t>
-      </w:r>
-      <w:r>
-        <w:rPr>
-          <w:rFonts w:ascii="Times New Roman" w:hAnsi="Times New Roman" w:cs="Times New Roman"/>
-          <w:color w:val="000000"/>
-        </w:rPr>
-        <w:t>t k</w:t>
-      </w:r>
-      <w:r>
-        <w:rPr>
-          <w:rFonts w:ascii="Times New Roman" w:hAnsi="Times New Roman" w:cs="Times New Roman"/>
-          <w:color w:val="000000"/>
-        </w:rPr>
-        <w:t>ế</w:t>
-      </w:r>
-      <w:r>
-        <w:rPr>
-          <w:rFonts w:ascii="Times New Roman" w:hAnsi="Times New Roman" w:cs="Times New Roman"/>
-          <w:color w:val="000000"/>
-        </w:rPr>
-        <w:t xml:space="preserve"> Memory</w:t>
+        <w:t>1. Thiết kế Memory</w:t>
       </w:r>
     </w:p>
     <w:p>
@@ -95,77 +221,7 @@
           <w:rFonts w:ascii="Times New Roman" w:hAnsi="Times New Roman" w:cs="Times New Roman"/>
           <w:sz w:val="24"/>
         </w:rPr>
-        <w:t>H</w:t>
-      </w:r>
-      <w:r>
-        <w:rPr>
-          <w:rFonts w:ascii="Times New Roman" w:hAnsi="Times New Roman" w:cs="Times New Roman"/>
-          <w:sz w:val="24"/>
-        </w:rPr>
-        <w:t>ệ</w:t>
-      </w:r>
-      <w:r>
-        <w:rPr>
-          <w:rFonts w:ascii="Times New Roman" w:hAnsi="Times New Roman" w:cs="Times New Roman"/>
-          <w:sz w:val="24"/>
-        </w:rPr>
-        <w:t xml:space="preserve"> th</w:t>
-      </w:r>
-      <w:r>
-        <w:rPr>
-          <w:rFonts w:ascii="Times New Roman" w:hAnsi="Times New Roman" w:cs="Times New Roman"/>
-          <w:sz w:val="24"/>
-        </w:rPr>
-        <w:t>ố</w:t>
-      </w:r>
-      <w:r>
-        <w:rPr>
-          <w:rFonts w:ascii="Times New Roman" w:hAnsi="Times New Roman" w:cs="Times New Roman"/>
-          <w:sz w:val="24"/>
-        </w:rPr>
-        <w:t>ng persistent memory đư</w:t>
-      </w:r>
-      <w:r>
-        <w:rPr>
-          <w:rFonts w:ascii="Times New Roman" w:hAnsi="Times New Roman" w:cs="Times New Roman"/>
-          <w:sz w:val="24"/>
-        </w:rPr>
-        <w:t>ợ</w:t>
-      </w:r>
-      <w:r>
-        <w:rPr>
-          <w:rFonts w:ascii="Times New Roman" w:hAnsi="Times New Roman" w:cs="Times New Roman"/>
-          <w:sz w:val="24"/>
-        </w:rPr>
-        <w:t>c thi</w:t>
-      </w:r>
-      <w:r>
-        <w:rPr>
-          <w:rFonts w:ascii="Times New Roman" w:hAnsi="Times New Roman" w:cs="Times New Roman"/>
-          <w:sz w:val="24"/>
-        </w:rPr>
-        <w:t>ế</w:t>
-      </w:r>
-      <w:r>
-        <w:rPr>
-          <w:rFonts w:ascii="Times New Roman" w:hAnsi="Times New Roman" w:cs="Times New Roman"/>
-          <w:sz w:val="24"/>
-        </w:rPr>
-        <w:t>t k</w:t>
-      </w:r>
-      <w:r>
-        <w:rPr>
-          <w:rFonts w:ascii="Times New Roman" w:hAnsi="Times New Roman" w:cs="Times New Roman"/>
-          <w:sz w:val="24"/>
-        </w:rPr>
-        <w:t>ế</w:t>
-      </w:r>
-      <w:r>
-        <w:rPr>
-          <w:rFonts w:ascii="Times New Roman" w:hAnsi="Times New Roman" w:cs="Times New Roman"/>
-          <w:sz w:val="24"/>
-        </w:rPr>
-        <w:t xml:space="preserve"> theo 5 tiêu chí sau:</w:t>
+        <w:t>Hệ thống persistent memory được thiết kế theo 5 tiêu chí sau:</w:t>
       </w:r>
     </w:p>
     <w:p>
@@ -180,21 +236,7 @@
           <w:rFonts w:ascii="Times New Roman" w:hAnsi="Times New Roman" w:cs="Times New Roman"/>
           <w:color w:val="000000"/>
         </w:rPr>
-        <w:t xml:space="preserve">1.1 Lưu </w:t>
-      </w:r>
-      <w:r>
-        <w:rPr>
-          <w:rFonts w:ascii="Times New Roman" w:hAnsi="Times New Roman" w:cs="Times New Roman"/>
-          <w:color w:val="000000"/>
-        </w:rPr>
-        <w:t>ở</w:t>
-      </w:r>
-      <w:r>
-        <w:rPr>
-          <w:rFonts w:ascii="Times New Roman" w:hAnsi="Times New Roman" w:cs="Times New Roman"/>
-          <w:color w:val="000000"/>
-        </w:rPr>
-        <w:t xml:space="preserve"> đâu</w:t>
+        <w:t>1.1 Lưu ở đâu</w:t>
       </w:r>
     </w:p>
     <w:p>
@@ -208,294 +250,7 @@
           <w:rFonts w:ascii="Times New Roman" w:hAnsi="Times New Roman" w:cs="Times New Roman"/>
           <w:sz w:val="24"/>
         </w:rPr>
-        <w:t>Dùng file JSON (memory.json) lưu cùng thư m</w:t>
-      </w:r>
-      <w:r>
-        <w:rPr>
-          <w:rFonts w:ascii="Times New Roman" w:hAnsi="Times New Roman" w:cs="Times New Roman"/>
-          <w:sz w:val="24"/>
-        </w:rPr>
-        <w:t>ụ</w:t>
-      </w:r>
-      <w:r>
-        <w:rPr>
-          <w:rFonts w:ascii="Times New Roman" w:hAnsi="Times New Roman" w:cs="Times New Roman"/>
-          <w:sz w:val="24"/>
-        </w:rPr>
-        <w:t>c v</w:t>
-      </w:r>
-      <w:r>
-        <w:rPr>
-          <w:rFonts w:ascii="Times New Roman" w:hAnsi="Times New Roman" w:cs="Times New Roman"/>
-          <w:sz w:val="24"/>
-        </w:rPr>
-        <w:t>ớ</w:t>
-      </w:r>
-      <w:r>
-        <w:rPr>
-          <w:rFonts w:ascii="Times New Roman" w:hAnsi="Times New Roman" w:cs="Times New Roman"/>
-          <w:sz w:val="24"/>
-        </w:rPr>
-        <w:t xml:space="preserve">i script. </w:t>
-      </w:r>
-      <w:r>
-        <w:rPr>
-          <w:rFonts w:ascii="Times New Roman" w:hAnsi="Times New Roman" w:cs="Times New Roman"/>
-          <w:sz w:val="24"/>
-        </w:rPr>
-        <w:t>Đ</w:t>
-      </w:r>
-      <w:r>
-        <w:rPr>
-          <w:rFonts w:ascii="Times New Roman" w:hAnsi="Times New Roman" w:cs="Times New Roman"/>
-          <w:sz w:val="24"/>
-        </w:rPr>
-        <w:t>ị</w:t>
-      </w:r>
-      <w:r>
-        <w:rPr>
-          <w:rFonts w:ascii="Times New Roman" w:hAnsi="Times New Roman" w:cs="Times New Roman"/>
-          <w:sz w:val="24"/>
-        </w:rPr>
-        <w:t>nh d</w:t>
-      </w:r>
-      <w:r>
-        <w:rPr>
-          <w:rFonts w:ascii="Times New Roman" w:hAnsi="Times New Roman" w:cs="Times New Roman"/>
-          <w:sz w:val="24"/>
-        </w:rPr>
-        <w:t>ạ</w:t>
-      </w:r>
-      <w:r>
-        <w:rPr>
-          <w:rFonts w:ascii="Times New Roman" w:hAnsi="Times New Roman" w:cs="Times New Roman"/>
-          <w:sz w:val="24"/>
-        </w:rPr>
-        <w:t>ng JSON đơn gi</w:t>
-      </w:r>
-      <w:r>
-        <w:rPr>
-          <w:rFonts w:ascii="Times New Roman" w:hAnsi="Times New Roman" w:cs="Times New Roman"/>
-          <w:sz w:val="24"/>
-        </w:rPr>
-        <w:t>ả</w:t>
-      </w:r>
-      <w:r>
-        <w:rPr>
-          <w:rFonts w:ascii="Times New Roman" w:hAnsi="Times New Roman" w:cs="Times New Roman"/>
-          <w:sz w:val="24"/>
-        </w:rPr>
-        <w:t>n, human-readable, không c</w:t>
-      </w:r>
-      <w:r>
-        <w:rPr>
-          <w:rFonts w:ascii="Times New Roman" w:hAnsi="Times New Roman" w:cs="Times New Roman"/>
-          <w:sz w:val="24"/>
-        </w:rPr>
-        <w:t>ầ</w:t>
-      </w:r>
-      <w:r>
-        <w:rPr>
-          <w:rFonts w:ascii="Times New Roman" w:hAnsi="Times New Roman" w:cs="Times New Roman"/>
-          <w:sz w:val="24"/>
-        </w:rPr>
-        <w:t>n thư vi</w:t>
-      </w:r>
-      <w:r>
-        <w:rPr>
-          <w:rFonts w:ascii="Times New Roman" w:hAnsi="Times New Roman" w:cs="Times New Roman"/>
-          <w:sz w:val="24"/>
-        </w:rPr>
-        <w:t>ệ</w:t>
-      </w:r>
-      <w:r>
-        <w:rPr>
-          <w:rFonts w:ascii="Times New Roman" w:hAnsi="Times New Roman" w:cs="Times New Roman"/>
-          <w:sz w:val="24"/>
-        </w:rPr>
-        <w:t>n ngoài (ngoài thư vi</w:t>
-      </w:r>
-      <w:r>
-        <w:rPr>
-          <w:rFonts w:ascii="Times New Roman" w:hAnsi="Times New Roman" w:cs="Times New Roman"/>
-          <w:sz w:val="24"/>
-        </w:rPr>
-        <w:t>ệ</w:t>
-      </w:r>
-      <w:r>
-        <w:rPr>
-          <w:rFonts w:ascii="Times New Roman" w:hAnsi="Times New Roman" w:cs="Times New Roman"/>
-          <w:sz w:val="24"/>
-        </w:rPr>
-        <w:t>n chu</w:t>
-      </w:r>
-      <w:r>
-        <w:rPr>
-          <w:rFonts w:ascii="Times New Roman" w:hAnsi="Times New Roman" w:cs="Times New Roman"/>
-          <w:sz w:val="24"/>
-        </w:rPr>
-        <w:t>ẩ</w:t>
-      </w:r>
-      <w:r>
-        <w:rPr>
-          <w:rFonts w:ascii="Times New Roman" w:hAnsi="Times New Roman" w:cs="Times New Roman"/>
-          <w:sz w:val="24"/>
-        </w:rPr>
-        <w:t>n json). File đư</w:t>
-      </w:r>
-      <w:r>
-        <w:rPr>
-          <w:rFonts w:ascii="Times New Roman" w:hAnsi="Times New Roman" w:cs="Times New Roman"/>
-          <w:sz w:val="24"/>
-        </w:rPr>
-        <w:t>ợ</w:t>
-      </w:r>
-      <w:r>
-        <w:rPr>
-          <w:rFonts w:ascii="Times New Roman" w:hAnsi="Times New Roman" w:cs="Times New Roman"/>
-          <w:sz w:val="24"/>
-        </w:rPr>
-        <w:t>c c</w:t>
-      </w:r>
-      <w:r>
-        <w:rPr>
-          <w:rFonts w:ascii="Times New Roman" w:hAnsi="Times New Roman" w:cs="Times New Roman"/>
-          <w:sz w:val="24"/>
-        </w:rPr>
-        <w:t>ậ</w:t>
-      </w:r>
-      <w:r>
-        <w:rPr>
-          <w:rFonts w:ascii="Times New Roman" w:hAnsi="Times New Roman" w:cs="Times New Roman"/>
-          <w:sz w:val="24"/>
-        </w:rPr>
-        <w:t>p nh</w:t>
-      </w:r>
-      <w:r>
-        <w:rPr>
-          <w:rFonts w:ascii="Times New Roman" w:hAnsi="Times New Roman" w:cs="Times New Roman"/>
-          <w:sz w:val="24"/>
-        </w:rPr>
-        <w:t>ậ</w:t>
-      </w:r>
-      <w:r>
-        <w:rPr>
-          <w:rFonts w:ascii="Times New Roman" w:hAnsi="Times New Roman" w:cs="Times New Roman"/>
-          <w:sz w:val="24"/>
-        </w:rPr>
-        <w:t>t ngay sau m</w:t>
-      </w:r>
-      <w:r>
-        <w:rPr>
-          <w:rFonts w:ascii="Times New Roman" w:hAnsi="Times New Roman" w:cs="Times New Roman"/>
-          <w:sz w:val="24"/>
-        </w:rPr>
-        <w:t>ỗ</w:t>
-      </w:r>
-      <w:r>
-        <w:rPr>
-          <w:rFonts w:ascii="Times New Roman" w:hAnsi="Times New Roman" w:cs="Times New Roman"/>
-          <w:sz w:val="24"/>
-        </w:rPr>
-        <w:t>i thay đ</w:t>
-      </w:r>
-      <w:r>
-        <w:rPr>
-          <w:rFonts w:ascii="Times New Roman" w:hAnsi="Times New Roman" w:cs="Times New Roman"/>
-          <w:sz w:val="24"/>
-        </w:rPr>
-        <w:t>ổ</w:t>
-      </w:r>
-      <w:r>
-        <w:rPr>
-          <w:rFonts w:ascii="Times New Roman" w:hAnsi="Times New Roman" w:cs="Times New Roman"/>
-          <w:sz w:val="24"/>
-        </w:rPr>
-        <w:t>i (incremental write) đ</w:t>
-      </w:r>
-      <w:r>
-        <w:rPr>
-          <w:rFonts w:ascii="Times New Roman" w:hAnsi="Times New Roman" w:cs="Times New Roman"/>
-          <w:sz w:val="24"/>
-        </w:rPr>
-        <w:t>ể</w:t>
-      </w:r>
-      <w:r>
-        <w:rPr>
-          <w:rFonts w:ascii="Times New Roman" w:hAnsi="Times New Roman" w:cs="Times New Roman"/>
-          <w:sz w:val="24"/>
-        </w:rPr>
-        <w:t xml:space="preserve"> đ</w:t>
-      </w:r>
-      <w:r>
-        <w:rPr>
-          <w:rFonts w:ascii="Times New Roman" w:hAnsi="Times New Roman" w:cs="Times New Roman"/>
-          <w:sz w:val="24"/>
-        </w:rPr>
-        <w:t>ả</w:t>
-      </w:r>
-      <w:r>
-        <w:rPr>
-          <w:rFonts w:ascii="Times New Roman" w:hAnsi="Times New Roman" w:cs="Times New Roman"/>
-          <w:sz w:val="24"/>
-        </w:rPr>
-        <w:t>m b</w:t>
-      </w:r>
-      <w:r>
-        <w:rPr>
-          <w:rFonts w:ascii="Times New Roman" w:hAnsi="Times New Roman" w:cs="Times New Roman"/>
-          <w:sz w:val="24"/>
-        </w:rPr>
-        <w:t>ả</w:t>
-      </w:r>
-      <w:r>
-        <w:rPr>
-          <w:rFonts w:ascii="Times New Roman" w:hAnsi="Times New Roman" w:cs="Times New Roman"/>
-          <w:sz w:val="24"/>
-        </w:rPr>
-        <w:t>o không m</w:t>
-      </w:r>
-      <w:r>
-        <w:rPr>
-          <w:rFonts w:ascii="Times New Roman" w:hAnsi="Times New Roman" w:cs="Times New Roman"/>
-          <w:sz w:val="24"/>
-        </w:rPr>
-        <w:t>ấ</w:t>
-      </w:r>
-      <w:r>
-        <w:rPr>
-          <w:rFonts w:ascii="Times New Roman" w:hAnsi="Times New Roman" w:cs="Times New Roman"/>
-          <w:sz w:val="24"/>
-        </w:rPr>
-        <w:t>t d</w:t>
-      </w:r>
-      <w:r>
-        <w:rPr>
-          <w:rFonts w:ascii="Times New Roman" w:hAnsi="Times New Roman" w:cs="Times New Roman"/>
-          <w:sz w:val="24"/>
-        </w:rPr>
-        <w:t>ữ</w:t>
-      </w:r>
-      <w:r>
-        <w:rPr>
-          <w:rFonts w:ascii="Times New Roman" w:hAnsi="Times New Roman" w:cs="Times New Roman"/>
-          <w:sz w:val="24"/>
-        </w:rPr>
-        <w:t xml:space="preserve"> li</w:t>
-      </w:r>
-      <w:r>
-        <w:rPr>
-          <w:rFonts w:ascii="Times New Roman" w:hAnsi="Times New Roman" w:cs="Times New Roman"/>
-          <w:sz w:val="24"/>
-        </w:rPr>
-        <w:t>ệ</w:t>
-      </w:r>
-      <w:r>
-        <w:rPr>
-          <w:rFonts w:ascii="Times New Roman" w:hAnsi="Times New Roman" w:cs="Times New Roman"/>
-          <w:sz w:val="24"/>
-        </w:rPr>
-        <w:t>u khi crash.</w:t>
+        <w:t>Dùng file JSON (memory.json) lưu cùng thư mục với script. Định dạng JSON đơn giản, human-readable, không cần thư viện ngoài (ngoài thư viện chuẩn json). File được cập nhật ngay sau mỗi thay đổi (incremental write) để đảm bảo không mất dữ liệu khi crash.</w:t>
       </w:r>
     </w:p>
     <w:p>
@@ -509,21 +264,7 @@
           <w:rFonts w:ascii="Times New Roman" w:hAnsi="Times New Roman" w:cs="Times New Roman"/>
           <w:sz w:val="24"/>
         </w:rPr>
-        <w:t>C</w:t>
-      </w:r>
-      <w:r>
-        <w:rPr>
-          <w:rFonts w:ascii="Times New Roman" w:hAnsi="Times New Roman" w:cs="Times New Roman"/>
-          <w:sz w:val="24"/>
-        </w:rPr>
-        <w:t>ấ</w:t>
-      </w:r>
-      <w:r>
-        <w:rPr>
-          <w:rFonts w:ascii="Times New Roman" w:hAnsi="Times New Roman" w:cs="Times New Roman"/>
-          <w:sz w:val="24"/>
-        </w:rPr>
-        <w:t>u trúc file memory.json:</w:t>
+        <w:t>Cấu trúc file memory.json:</w:t>
       </w:r>
     </w:p>
     <w:p>
@@ -556,14 +297,7 @@
           <w:sz w:val="18"/>
         </w:rPr>
         <w:br/>
-        <w:t xml:space="preserve">    "origin"</w:t>
-      </w:r>
-      <w:r>
-        <w:rPr>
-          <w:rFonts w:ascii="Times New Roman" w:hAnsi="Times New Roman" w:cs="Times New Roman"/>
-          <w:sz w:val="18"/>
-        </w:rPr>
-        <w:t>: "SGN",</w:t>
+        <w:t xml:space="preserve">    "origin": "SGN",</w:t>
       </w:r>
       <w:r>
         <w:rPr>
@@ -739,14 +473,7 @@
           <w:sz w:val="18"/>
         </w:rPr>
         <w:br/>
-        <w:t xml:space="preserve">    </w:t>
-      </w:r>
-      <w:r>
-        <w:rPr>
-          <w:rFonts w:ascii="Times New Roman" w:hAnsi="Times New Roman" w:cs="Times New Roman"/>
-          <w:sz w:val="18"/>
-        </w:rPr>
-        <w:t xml:space="preserve">  "result": "DONE"</w:t>
+        <w:t xml:space="preserve">      "result": "DONE"</w:t>
       </w:r>
       <w:r>
         <w:rPr>
@@ -799,105 +526,7 @@
           <w:rFonts w:ascii="Times New Roman" w:hAnsi="Times New Roman" w:cs="Times New Roman"/>
           <w:sz w:val="24"/>
         </w:rPr>
-        <w:t>Harness là ngu</w:t>
-      </w:r>
-      <w:r>
-        <w:rPr>
-          <w:rFonts w:ascii="Times New Roman" w:hAnsi="Times New Roman" w:cs="Times New Roman"/>
-          <w:sz w:val="24"/>
-        </w:rPr>
-        <w:t>ồ</w:t>
-      </w:r>
-      <w:r>
-        <w:rPr>
-          <w:rFonts w:ascii="Times New Roman" w:hAnsi="Times New Roman" w:cs="Times New Roman"/>
-          <w:sz w:val="24"/>
-        </w:rPr>
-        <w:t>n ghi duy nh</w:t>
-      </w:r>
-      <w:r>
-        <w:rPr>
-          <w:rFonts w:ascii="Times New Roman" w:hAnsi="Times New Roman" w:cs="Times New Roman"/>
-          <w:sz w:val="24"/>
-        </w:rPr>
-        <w:t>ấ</w:t>
-      </w:r>
-      <w:r>
-        <w:rPr>
-          <w:rFonts w:ascii="Times New Roman" w:hAnsi="Times New Roman" w:cs="Times New Roman"/>
-          <w:sz w:val="24"/>
-        </w:rPr>
-        <w:t>t — model không đư</w:t>
-      </w:r>
-      <w:r>
-        <w:rPr>
-          <w:rFonts w:ascii="Times New Roman" w:hAnsi="Times New Roman" w:cs="Times New Roman"/>
-          <w:sz w:val="24"/>
-        </w:rPr>
-        <w:t>ợ</w:t>
-      </w:r>
-      <w:r>
-        <w:rPr>
-          <w:rFonts w:ascii="Times New Roman" w:hAnsi="Times New Roman" w:cs="Times New Roman"/>
-          <w:sz w:val="24"/>
-        </w:rPr>
-        <w:t>c phép t</w:t>
-      </w:r>
-      <w:r>
-        <w:rPr>
-          <w:rFonts w:ascii="Times New Roman" w:hAnsi="Times New Roman" w:cs="Times New Roman"/>
-          <w:sz w:val="24"/>
-        </w:rPr>
-        <w:t>ự</w:t>
-      </w:r>
-      <w:r>
-        <w:rPr>
-          <w:rFonts w:ascii="Times New Roman" w:hAnsi="Times New Roman" w:cs="Times New Roman"/>
-          <w:sz w:val="24"/>
-        </w:rPr>
-        <w:t xml:space="preserve"> ghi vào memory. Cơ ch</w:t>
-      </w:r>
-      <w:r>
-        <w:rPr>
-          <w:rFonts w:ascii="Times New Roman" w:hAnsi="Times New Roman" w:cs="Times New Roman"/>
-          <w:sz w:val="24"/>
-        </w:rPr>
-        <w:t>ế</w:t>
-      </w:r>
-      <w:r>
-        <w:rPr>
-          <w:rFonts w:ascii="Times New Roman" w:hAnsi="Times New Roman" w:cs="Times New Roman"/>
-          <w:sz w:val="24"/>
-        </w:rPr>
-        <w:t xml:space="preserve"> ghi g</w:t>
-      </w:r>
-      <w:r>
-        <w:rPr>
-          <w:rFonts w:ascii="Times New Roman" w:hAnsi="Times New Roman" w:cs="Times New Roman"/>
-          <w:sz w:val="24"/>
-        </w:rPr>
-        <w:t>ồ</w:t>
-      </w:r>
-      <w:r>
-        <w:rPr>
-          <w:rFonts w:ascii="Times New Roman" w:hAnsi="Times New Roman" w:cs="Times New Roman"/>
-          <w:sz w:val="24"/>
-        </w:rPr>
-        <w:t>m hai ph</w:t>
-      </w:r>
-      <w:r>
-        <w:rPr>
-          <w:rFonts w:ascii="Times New Roman" w:hAnsi="Times New Roman" w:cs="Times New Roman"/>
-          <w:sz w:val="24"/>
-        </w:rPr>
-        <w:t>ầ</w:t>
-      </w:r>
-      <w:r>
-        <w:rPr>
-          <w:rFonts w:ascii="Times New Roman" w:hAnsi="Times New Roman" w:cs="Times New Roman"/>
-          <w:sz w:val="24"/>
-        </w:rPr>
-        <w:t>n:</w:t>
+        <w:t>Harness là nguồn ghi duy nhất — model không được phép tự ghi vào memory. Cơ chế ghi gồm hai phần:</w:t>
       </w:r>
     </w:p>
     <w:p>
@@ -914,112 +543,7 @@
           <w:sz w:val="24"/>
         </w:rPr>
         <w:lastRenderedPageBreak/>
-        <w:t>Khi session b</w:t>
-      </w:r>
-      <w:r>
-        <w:rPr>
-          <w:rFonts w:ascii="Times New Roman" w:hAnsi="Times New Roman" w:cs="Times New Roman"/>
-          <w:sz w:val="24"/>
-        </w:rPr>
-        <w:t>ắ</w:t>
-      </w:r>
-      <w:r>
-        <w:rPr>
-          <w:rFonts w:ascii="Times New Roman" w:hAnsi="Times New Roman" w:cs="Times New Roman"/>
-          <w:sz w:val="24"/>
-        </w:rPr>
-        <w:t>t đ</w:t>
-      </w:r>
-      <w:r>
-        <w:rPr>
-          <w:rFonts w:ascii="Times New Roman" w:hAnsi="Times New Roman" w:cs="Times New Roman"/>
-          <w:sz w:val="24"/>
-        </w:rPr>
-        <w:t>ầ</w:t>
-      </w:r>
-      <w:r>
-        <w:rPr>
-          <w:rFonts w:ascii="Times New Roman" w:hAnsi="Times New Roman" w:cs="Times New Roman"/>
-          <w:sz w:val="24"/>
-        </w:rPr>
-        <w:t>u: hàm update_conventions() so sánh CONSTRAINTS hi</w:t>
-      </w:r>
-      <w:r>
-        <w:rPr>
-          <w:rFonts w:ascii="Times New Roman" w:hAnsi="Times New Roman" w:cs="Times New Roman"/>
-          <w:sz w:val="24"/>
-        </w:rPr>
-        <w:t>ệ</w:t>
-      </w:r>
-      <w:r>
-        <w:rPr>
-          <w:rFonts w:ascii="Times New Roman" w:hAnsi="Times New Roman" w:cs="Times New Roman"/>
-          <w:sz w:val="24"/>
-        </w:rPr>
-        <w:t>n t</w:t>
-      </w:r>
-      <w:r>
-        <w:rPr>
-          <w:rFonts w:ascii="Times New Roman" w:hAnsi="Times New Roman" w:cs="Times New Roman"/>
-          <w:sz w:val="24"/>
-        </w:rPr>
-        <w:t>ạ</w:t>
-      </w:r>
-      <w:r>
-        <w:rPr>
-          <w:rFonts w:ascii="Times New Roman" w:hAnsi="Times New Roman" w:cs="Times New Roman"/>
-          <w:sz w:val="24"/>
-        </w:rPr>
-        <w:t>i v</w:t>
-      </w:r>
-      <w:r>
-        <w:rPr>
-          <w:rFonts w:ascii="Times New Roman" w:hAnsi="Times New Roman" w:cs="Times New Roman"/>
-          <w:sz w:val="24"/>
-        </w:rPr>
-        <w:t>ớ</w:t>
-      </w:r>
-      <w:r>
-        <w:rPr>
-          <w:rFonts w:ascii="Times New Roman" w:hAnsi="Times New Roman" w:cs="Times New Roman"/>
-          <w:sz w:val="24"/>
-        </w:rPr>
-        <w:t>i b</w:t>
-      </w:r>
-      <w:r>
-        <w:rPr>
-          <w:rFonts w:ascii="Times New Roman" w:hAnsi="Times New Roman" w:cs="Times New Roman"/>
-          <w:sz w:val="24"/>
-        </w:rPr>
-        <w:t>ả</w:t>
-      </w:r>
-      <w:r>
-        <w:rPr>
-          <w:rFonts w:ascii="Times New Roman" w:hAnsi="Times New Roman" w:cs="Times New Roman"/>
-          <w:sz w:val="24"/>
-        </w:rPr>
-        <w:t>n đã lưu và ghi conven</w:t>
-      </w:r>
-      <w:r>
-        <w:rPr>
-          <w:rFonts w:ascii="Times New Roman" w:hAnsi="Times New Roman" w:cs="Times New Roman"/>
-          <w:sz w:val="24"/>
-        </w:rPr>
-        <w:t>tions m</w:t>
-      </w:r>
-      <w:r>
-        <w:rPr>
-          <w:rFonts w:ascii="Times New Roman" w:hAnsi="Times New Roman" w:cs="Times New Roman"/>
-          <w:sz w:val="24"/>
-        </w:rPr>
-        <w:t>ớ</w:t>
-      </w:r>
-      <w:r>
-        <w:rPr>
-          <w:rFonts w:ascii="Times New Roman" w:hAnsi="Times New Roman" w:cs="Times New Roman"/>
-          <w:sz w:val="24"/>
-        </w:rPr>
-        <w:t>i vào memory.json.</w:t>
+        <w:t>Khi session bắt đầu: hàm update_conventions() so sánh CONSTRAINTS hiện tại với bản đã lưu và ghi conventions mới vào memory.json.</w:t>
       </w:r>
     </w:p>
     <w:p>
@@ -1035,105 +559,7 @@
           <w:rFonts w:ascii="Times New Roman" w:hAnsi="Times New Roman" w:cs="Times New Roman"/>
           <w:sz w:val="24"/>
         </w:rPr>
-        <w:t>Sau m</w:t>
-      </w:r>
-      <w:r>
-        <w:rPr>
-          <w:rFonts w:ascii="Times New Roman" w:hAnsi="Times New Roman" w:cs="Times New Roman"/>
-          <w:sz w:val="24"/>
-        </w:rPr>
-        <w:t>ỗ</w:t>
-      </w:r>
-      <w:r>
-        <w:rPr>
-          <w:rFonts w:ascii="Times New Roman" w:hAnsi="Times New Roman" w:cs="Times New Roman"/>
-          <w:sz w:val="24"/>
-        </w:rPr>
-        <w:t>i l</w:t>
-      </w:r>
-      <w:r>
-        <w:rPr>
-          <w:rFonts w:ascii="Times New Roman" w:hAnsi="Times New Roman" w:cs="Times New Roman"/>
-          <w:sz w:val="24"/>
-        </w:rPr>
-        <w:t>ầ</w:t>
-      </w:r>
-      <w:r>
-        <w:rPr>
-          <w:rFonts w:ascii="Times New Roman" w:hAnsi="Times New Roman" w:cs="Times New Roman"/>
-          <w:sz w:val="24"/>
-        </w:rPr>
-        <w:t>n pay thành công: guarded_call() g</w:t>
-      </w:r>
-      <w:r>
-        <w:rPr>
-          <w:rFonts w:ascii="Times New Roman" w:hAnsi="Times New Roman" w:cs="Times New Roman"/>
-          <w:sz w:val="24"/>
-        </w:rPr>
-        <w:t>ọ</w:t>
-      </w:r>
-      <w:r>
-        <w:rPr>
-          <w:rFonts w:ascii="Times New Roman" w:hAnsi="Times New Roman" w:cs="Times New Roman"/>
-          <w:sz w:val="24"/>
-        </w:rPr>
-        <w:t>i record_booking() đ</w:t>
-      </w:r>
-      <w:r>
-        <w:rPr>
-          <w:rFonts w:ascii="Times New Roman" w:hAnsi="Times New Roman" w:cs="Times New Roman"/>
-          <w:sz w:val="24"/>
-        </w:rPr>
-        <w:t>ể</w:t>
-      </w:r>
-      <w:r>
-        <w:rPr>
-          <w:rFonts w:ascii="Times New Roman" w:hAnsi="Times New Roman" w:cs="Times New Roman"/>
-          <w:sz w:val="24"/>
-        </w:rPr>
-        <w:t xml:space="preserve"> ghi thông tin đ</w:t>
-      </w:r>
-      <w:r>
-        <w:rPr>
-          <w:rFonts w:ascii="Times New Roman" w:hAnsi="Times New Roman" w:cs="Times New Roman"/>
-          <w:sz w:val="24"/>
-        </w:rPr>
-        <w:t>ặ</w:t>
-      </w:r>
-      <w:r>
-        <w:rPr>
-          <w:rFonts w:ascii="Times New Roman" w:hAnsi="Times New Roman" w:cs="Times New Roman"/>
-          <w:sz w:val="24"/>
-        </w:rPr>
-        <w:t>t vé (code, flight, depart, price, paid=True) vào session hi</w:t>
-      </w:r>
-      <w:r>
-        <w:rPr>
-          <w:rFonts w:ascii="Times New Roman" w:hAnsi="Times New Roman" w:cs="Times New Roman"/>
-          <w:sz w:val="24"/>
-        </w:rPr>
-        <w:t>ệ</w:t>
-      </w:r>
-      <w:r>
-        <w:rPr>
-          <w:rFonts w:ascii="Times New Roman" w:hAnsi="Times New Roman" w:cs="Times New Roman"/>
-          <w:sz w:val="24"/>
-        </w:rPr>
-        <w:t>n t</w:t>
-      </w:r>
-      <w:r>
-        <w:rPr>
-          <w:rFonts w:ascii="Times New Roman" w:hAnsi="Times New Roman" w:cs="Times New Roman"/>
-          <w:sz w:val="24"/>
-        </w:rPr>
-        <w:t>ạ</w:t>
-      </w:r>
-      <w:r>
-        <w:rPr>
-          <w:rFonts w:ascii="Times New Roman" w:hAnsi="Times New Roman" w:cs="Times New Roman"/>
-          <w:sz w:val="24"/>
-        </w:rPr>
-        <w:t>i.</w:t>
+        <w:t>Sau mỗi lần pay thành công: guarded_call() gọi record_booking() để ghi thông tin đặt vé (code, flight, depart, price, paid=True) vào session hiện tại.</w:t>
       </w:r>
     </w:p>
     <w:p>
@@ -1147,21 +573,7 @@
           <w:rFonts w:ascii="Times New Roman" w:hAnsi="Times New Roman" w:cs="Times New Roman"/>
           <w:sz w:val="24"/>
         </w:rPr>
-        <w:t>Đo</w:t>
-      </w:r>
-      <w:r>
-        <w:rPr>
-          <w:rFonts w:ascii="Times New Roman" w:hAnsi="Times New Roman" w:cs="Times New Roman"/>
-          <w:sz w:val="24"/>
-        </w:rPr>
-        <w:t>ạ</w:t>
-      </w:r>
-      <w:r>
-        <w:rPr>
-          <w:rFonts w:ascii="Times New Roman" w:hAnsi="Times New Roman" w:cs="Times New Roman"/>
-          <w:sz w:val="24"/>
-        </w:rPr>
-        <w:t>n code trong guarded_call():</w:t>
+        <w:t>Đoạn code trong guarded_call():</w:t>
       </w:r>
     </w:p>
     <w:p>
@@ -1178,14 +590,7 @@
           <w:rFonts w:ascii="Times New Roman" w:hAnsi="Times New Roman" w:cs="Times New Roman"/>
           <w:sz w:val="18"/>
         </w:rPr>
-        <w:t># MEMORY: harness auto-records successful paym</w:t>
-      </w:r>
-      <w:r>
-        <w:rPr>
-          <w:rFonts w:ascii="Times New Roman" w:hAnsi="Times New Roman" w:cs="Times New Roman"/>
-          <w:sz w:val="18"/>
-        </w:rPr>
-        <w:t>ents</w:t>
+        <w:t># MEMORY: harness auto-records successful payments</w:t>
       </w:r>
       <w:r>
         <w:rPr>
@@ -1216,21 +621,7 @@
           <w:rFonts w:ascii="Times New Roman" w:hAnsi="Times New Roman" w:cs="Times New Roman"/>
           <w:color w:val="000000"/>
         </w:rPr>
-        <w:t>1.3 Khi nào n</w:t>
-      </w:r>
-      <w:r>
-        <w:rPr>
-          <w:rFonts w:ascii="Times New Roman" w:hAnsi="Times New Roman" w:cs="Times New Roman"/>
-          <w:color w:val="000000"/>
-        </w:rPr>
-        <w:t>ạ</w:t>
-      </w:r>
-      <w:r>
-        <w:rPr>
-          <w:rFonts w:ascii="Times New Roman" w:hAnsi="Times New Roman" w:cs="Times New Roman"/>
-          <w:color w:val="000000"/>
-        </w:rPr>
-        <w:t>p (When to load)</w:t>
+        <w:t>1.3 Khi nào nạp (When to load)</w:t>
       </w:r>
     </w:p>
     <w:p>
@@ -1244,420 +635,7 @@
           <w:rFonts w:ascii="Times New Roman" w:hAnsi="Times New Roman" w:cs="Times New Roman"/>
           <w:sz w:val="24"/>
         </w:rPr>
-        <w:t>Memory đư</w:t>
-      </w:r>
-      <w:r>
-        <w:rPr>
-          <w:rFonts w:ascii="Times New Roman" w:hAnsi="Times New Roman" w:cs="Times New Roman"/>
-          <w:sz w:val="24"/>
-        </w:rPr>
-        <w:t>ợ</w:t>
-      </w:r>
-      <w:r>
-        <w:rPr>
-          <w:rFonts w:ascii="Times New Roman" w:hAnsi="Times New Roman" w:cs="Times New Roman"/>
-          <w:sz w:val="24"/>
-        </w:rPr>
-        <w:t>c n</w:t>
-      </w:r>
-      <w:r>
-        <w:rPr>
-          <w:rFonts w:ascii="Times New Roman" w:hAnsi="Times New Roman" w:cs="Times New Roman"/>
-          <w:sz w:val="24"/>
-        </w:rPr>
-        <w:t>ạ</w:t>
-      </w:r>
-      <w:r>
-        <w:rPr>
-          <w:rFonts w:ascii="Times New Roman" w:hAnsi="Times New Roman" w:cs="Times New Roman"/>
-          <w:sz w:val="24"/>
-        </w:rPr>
-        <w:t>p m</w:t>
-      </w:r>
-      <w:r>
-        <w:rPr>
-          <w:rFonts w:ascii="Times New Roman" w:hAnsi="Times New Roman" w:cs="Times New Roman"/>
-          <w:sz w:val="24"/>
-        </w:rPr>
-        <w:t>ộ</w:t>
-      </w:r>
-      <w:r>
-        <w:rPr>
-          <w:rFonts w:ascii="Times New Roman" w:hAnsi="Times New Roman" w:cs="Times New Roman"/>
-          <w:sz w:val="24"/>
-        </w:rPr>
-        <w:t>t l</w:t>
-      </w:r>
-      <w:r>
-        <w:rPr>
-          <w:rFonts w:ascii="Times New Roman" w:hAnsi="Times New Roman" w:cs="Times New Roman"/>
-          <w:sz w:val="24"/>
-        </w:rPr>
-        <w:t>ầ</w:t>
-      </w:r>
-      <w:r>
-        <w:rPr>
-          <w:rFonts w:ascii="Times New Roman" w:hAnsi="Times New Roman" w:cs="Times New Roman"/>
-          <w:sz w:val="24"/>
-        </w:rPr>
-        <w:t>n duy nh</w:t>
-      </w:r>
-      <w:r>
-        <w:rPr>
-          <w:rFonts w:ascii="Times New Roman" w:hAnsi="Times New Roman" w:cs="Times New Roman"/>
-          <w:sz w:val="24"/>
-        </w:rPr>
-        <w:t>ấ</w:t>
-      </w:r>
-      <w:r>
-        <w:rPr>
-          <w:rFonts w:ascii="Times New Roman" w:hAnsi="Times New Roman" w:cs="Times New Roman"/>
-          <w:sz w:val="24"/>
-        </w:rPr>
-        <w:t xml:space="preserve">t </w:t>
-      </w:r>
-      <w:r>
-        <w:rPr>
-          <w:rFonts w:ascii="Times New Roman" w:hAnsi="Times New Roman" w:cs="Times New Roman"/>
-          <w:sz w:val="24"/>
-        </w:rPr>
-        <w:t>ở</w:t>
-      </w:r>
-      <w:r>
-        <w:rPr>
-          <w:rFonts w:ascii="Times New Roman" w:hAnsi="Times New Roman" w:cs="Times New Roman"/>
-          <w:sz w:val="24"/>
-        </w:rPr>
-        <w:t xml:space="preserve"> đ</w:t>
-      </w:r>
-      <w:r>
-        <w:rPr>
-          <w:rFonts w:ascii="Times New Roman" w:hAnsi="Times New Roman" w:cs="Times New Roman"/>
-          <w:sz w:val="24"/>
-        </w:rPr>
-        <w:t>ầ</w:t>
-      </w:r>
-      <w:r>
-        <w:rPr>
-          <w:rFonts w:ascii="Times New Roman" w:hAnsi="Times New Roman" w:cs="Times New Roman"/>
-          <w:sz w:val="24"/>
-        </w:rPr>
-        <w:t>u m</w:t>
-      </w:r>
-      <w:r>
-        <w:rPr>
-          <w:rFonts w:ascii="Times New Roman" w:hAnsi="Times New Roman" w:cs="Times New Roman"/>
-          <w:sz w:val="24"/>
-        </w:rPr>
-        <w:t>ỗ</w:t>
-      </w:r>
-      <w:r>
-        <w:rPr>
-          <w:rFonts w:ascii="Times New Roman" w:hAnsi="Times New Roman" w:cs="Times New Roman"/>
-          <w:sz w:val="24"/>
-        </w:rPr>
-        <w:t>i session (trư</w:t>
-      </w:r>
-      <w:r>
-        <w:rPr>
-          <w:rFonts w:ascii="Times New Roman" w:hAnsi="Times New Roman" w:cs="Times New Roman"/>
-          <w:sz w:val="24"/>
-        </w:rPr>
-        <w:t>ớ</w:t>
-      </w:r>
-      <w:r>
-        <w:rPr>
-          <w:rFonts w:ascii="Times New Roman" w:hAnsi="Times New Roman" w:cs="Times New Roman"/>
-          <w:sz w:val="24"/>
-        </w:rPr>
-        <w:t>c khi agent ch</w:t>
-      </w:r>
-      <w:r>
-        <w:rPr>
-          <w:rFonts w:ascii="Times New Roman" w:hAnsi="Times New Roman" w:cs="Times New Roman"/>
-          <w:sz w:val="24"/>
-        </w:rPr>
-        <w:t>ạ</w:t>
-      </w:r>
-      <w:r>
-        <w:rPr>
-          <w:rFonts w:ascii="Times New Roman" w:hAnsi="Times New Roman" w:cs="Times New Roman"/>
-          <w:sz w:val="24"/>
-        </w:rPr>
-        <w:t>y) b</w:t>
-      </w:r>
-      <w:r>
-        <w:rPr>
-          <w:rFonts w:ascii="Times New Roman" w:hAnsi="Times New Roman" w:cs="Times New Roman"/>
-          <w:sz w:val="24"/>
-        </w:rPr>
-        <w:t>ằ</w:t>
-      </w:r>
-      <w:r>
-        <w:rPr>
-          <w:rFonts w:ascii="Times New Roman" w:hAnsi="Times New Roman" w:cs="Times New Roman"/>
-          <w:sz w:val="24"/>
-        </w:rPr>
-        <w:t>ng hàm load_memory().</w:t>
-      </w:r>
-      <w:r>
-        <w:rPr>
-          <w:rFonts w:ascii="Times New Roman" w:hAnsi="Times New Roman" w:cs="Times New Roman"/>
-          <w:sz w:val="24"/>
-        </w:rPr>
-        <w:t xml:space="preserve"> N</w:t>
-      </w:r>
-      <w:r>
-        <w:rPr>
-          <w:rFonts w:ascii="Times New Roman" w:hAnsi="Times New Roman" w:cs="Times New Roman"/>
-          <w:sz w:val="24"/>
-        </w:rPr>
-        <w:t>ộ</w:t>
-      </w:r>
-      <w:r>
-        <w:rPr>
-          <w:rFonts w:ascii="Times New Roman" w:hAnsi="Times New Roman" w:cs="Times New Roman"/>
-          <w:sz w:val="24"/>
-        </w:rPr>
-        <w:t>i dung memory sau đó đư</w:t>
-      </w:r>
-      <w:r>
-        <w:rPr>
-          <w:rFonts w:ascii="Times New Roman" w:hAnsi="Times New Roman" w:cs="Times New Roman"/>
-          <w:sz w:val="24"/>
-        </w:rPr>
-        <w:t>ợ</w:t>
-      </w:r>
-      <w:r>
-        <w:rPr>
-          <w:rFonts w:ascii="Times New Roman" w:hAnsi="Times New Roman" w:cs="Times New Roman"/>
-          <w:sz w:val="24"/>
-        </w:rPr>
-        <w:t>c chuy</w:t>
-      </w:r>
-      <w:r>
-        <w:rPr>
-          <w:rFonts w:ascii="Times New Roman" w:hAnsi="Times New Roman" w:cs="Times New Roman"/>
-          <w:sz w:val="24"/>
-        </w:rPr>
-        <w:t>ể</w:t>
-      </w:r>
-      <w:r>
-        <w:rPr>
-          <w:rFonts w:ascii="Times New Roman" w:hAnsi="Times New Roman" w:cs="Times New Roman"/>
-          <w:sz w:val="24"/>
-        </w:rPr>
-        <w:t>n thành chu</w:t>
-      </w:r>
-      <w:r>
-        <w:rPr>
-          <w:rFonts w:ascii="Times New Roman" w:hAnsi="Times New Roman" w:cs="Times New Roman"/>
-          <w:sz w:val="24"/>
-        </w:rPr>
-        <w:t>ỗ</w:t>
-      </w:r>
-      <w:r>
-        <w:rPr>
-          <w:rFonts w:ascii="Times New Roman" w:hAnsi="Times New Roman" w:cs="Times New Roman"/>
-          <w:sz w:val="24"/>
-        </w:rPr>
-        <w:t>i văn b</w:t>
-      </w:r>
-      <w:r>
-        <w:rPr>
-          <w:rFonts w:ascii="Times New Roman" w:hAnsi="Times New Roman" w:cs="Times New Roman"/>
-          <w:sz w:val="24"/>
-        </w:rPr>
-        <w:t>ả</w:t>
-      </w:r>
-      <w:r>
-        <w:rPr>
-          <w:rFonts w:ascii="Times New Roman" w:hAnsi="Times New Roman" w:cs="Times New Roman"/>
-          <w:sz w:val="24"/>
-        </w:rPr>
-        <w:t>n qua memory_to_context() và n</w:t>
-      </w:r>
-      <w:r>
-        <w:rPr>
-          <w:rFonts w:ascii="Times New Roman" w:hAnsi="Times New Roman" w:cs="Times New Roman"/>
-          <w:sz w:val="24"/>
-        </w:rPr>
-        <w:t>ố</w:t>
-      </w:r>
-      <w:r>
-        <w:rPr>
-          <w:rFonts w:ascii="Times New Roman" w:hAnsi="Times New Roman" w:cs="Times New Roman"/>
-          <w:sz w:val="24"/>
-        </w:rPr>
-        <w:t>i vào cu</w:t>
-      </w:r>
-      <w:r>
-        <w:rPr>
-          <w:rFonts w:ascii="Times New Roman" w:hAnsi="Times New Roman" w:cs="Times New Roman"/>
-          <w:sz w:val="24"/>
-        </w:rPr>
-        <w:t>ố</w:t>
-      </w:r>
-      <w:r>
-        <w:rPr>
-          <w:rFonts w:ascii="Times New Roman" w:hAnsi="Times New Roman" w:cs="Times New Roman"/>
-          <w:sz w:val="24"/>
-        </w:rPr>
-        <w:t>i SYSTEM_PROMPT t</w:t>
-      </w:r>
-      <w:r>
-        <w:rPr>
-          <w:rFonts w:ascii="Times New Roman" w:hAnsi="Times New Roman" w:cs="Times New Roman"/>
-          <w:sz w:val="24"/>
-        </w:rPr>
-        <w:t>ạ</w:t>
-      </w:r>
-      <w:r>
-        <w:rPr>
-          <w:rFonts w:ascii="Times New Roman" w:hAnsi="Times New Roman" w:cs="Times New Roman"/>
-          <w:sz w:val="24"/>
-        </w:rPr>
-        <w:t>o thành SYSTEM_PROMPT_WITH_MEMORY. Nh</w:t>
-      </w:r>
-      <w:r>
-        <w:rPr>
-          <w:rFonts w:ascii="Times New Roman" w:hAnsi="Times New Roman" w:cs="Times New Roman"/>
-          <w:sz w:val="24"/>
-        </w:rPr>
-        <w:t>ờ</w:t>
-      </w:r>
-      <w:r>
-        <w:rPr>
-          <w:rFonts w:ascii="Times New Roman" w:hAnsi="Times New Roman" w:cs="Times New Roman"/>
-          <w:sz w:val="24"/>
-        </w:rPr>
-        <w:t xml:space="preserve"> đó, agent luôn 'th</w:t>
-      </w:r>
-      <w:r>
-        <w:rPr>
-          <w:rFonts w:ascii="Times New Roman" w:hAnsi="Times New Roman" w:cs="Times New Roman"/>
-          <w:sz w:val="24"/>
-        </w:rPr>
-        <w:t>ấ</w:t>
-      </w:r>
-      <w:r>
-        <w:rPr>
-          <w:rFonts w:ascii="Times New Roman" w:hAnsi="Times New Roman" w:cs="Times New Roman"/>
-          <w:sz w:val="24"/>
-        </w:rPr>
-        <w:t>y' l</w:t>
-      </w:r>
-      <w:r>
-        <w:rPr>
-          <w:rFonts w:ascii="Times New Roman" w:hAnsi="Times New Roman" w:cs="Times New Roman"/>
-          <w:sz w:val="24"/>
-        </w:rPr>
-        <w:t>ị</w:t>
-      </w:r>
-      <w:r>
-        <w:rPr>
-          <w:rFonts w:ascii="Times New Roman" w:hAnsi="Times New Roman" w:cs="Times New Roman"/>
-          <w:sz w:val="24"/>
-        </w:rPr>
-        <w:t>ch s</w:t>
-      </w:r>
-      <w:r>
-        <w:rPr>
-          <w:rFonts w:ascii="Times New Roman" w:hAnsi="Times New Roman" w:cs="Times New Roman"/>
-          <w:sz w:val="24"/>
-        </w:rPr>
-        <w:t>ử</w:t>
-      </w:r>
-      <w:r>
-        <w:rPr>
-          <w:rFonts w:ascii="Times New Roman" w:hAnsi="Times New Roman" w:cs="Times New Roman"/>
-          <w:sz w:val="24"/>
-        </w:rPr>
-        <w:t xml:space="preserve"> và quy ư</w:t>
-      </w:r>
-      <w:r>
-        <w:rPr>
-          <w:rFonts w:ascii="Times New Roman" w:hAnsi="Times New Roman" w:cs="Times New Roman"/>
-          <w:sz w:val="24"/>
-        </w:rPr>
-        <w:t>ớ</w:t>
-      </w:r>
-      <w:r>
-        <w:rPr>
-          <w:rFonts w:ascii="Times New Roman" w:hAnsi="Times New Roman" w:cs="Times New Roman"/>
-          <w:sz w:val="24"/>
-        </w:rPr>
-        <w:t>c t</w:t>
-      </w:r>
-      <w:r>
-        <w:rPr>
-          <w:rFonts w:ascii="Times New Roman" w:hAnsi="Times New Roman" w:cs="Times New Roman"/>
-          <w:sz w:val="24"/>
-        </w:rPr>
-        <w:t>ừ</w:t>
-      </w:r>
-      <w:r>
-        <w:rPr>
-          <w:rFonts w:ascii="Times New Roman" w:hAnsi="Times New Roman" w:cs="Times New Roman"/>
-          <w:sz w:val="24"/>
-        </w:rPr>
-        <w:t xml:space="preserve"> đ</w:t>
-      </w:r>
-      <w:r>
-        <w:rPr>
-          <w:rFonts w:ascii="Times New Roman" w:hAnsi="Times New Roman" w:cs="Times New Roman"/>
-          <w:sz w:val="24"/>
-        </w:rPr>
-        <w:t>ầ</w:t>
-      </w:r>
-      <w:r>
-        <w:rPr>
-          <w:rFonts w:ascii="Times New Roman" w:hAnsi="Times New Roman" w:cs="Times New Roman"/>
-          <w:sz w:val="24"/>
-        </w:rPr>
-        <w:t>u cu</w:t>
-      </w:r>
-      <w:r>
-        <w:rPr>
-          <w:rFonts w:ascii="Times New Roman" w:hAnsi="Times New Roman" w:cs="Times New Roman"/>
-          <w:sz w:val="24"/>
-        </w:rPr>
-        <w:t>ộ</w:t>
-      </w:r>
-      <w:r>
-        <w:rPr>
-          <w:rFonts w:ascii="Times New Roman" w:hAnsi="Times New Roman" w:cs="Times New Roman"/>
-          <w:sz w:val="24"/>
-        </w:rPr>
-        <w:t>c h</w:t>
-      </w:r>
-      <w:r>
-        <w:rPr>
-          <w:rFonts w:ascii="Times New Roman" w:hAnsi="Times New Roman" w:cs="Times New Roman"/>
-          <w:sz w:val="24"/>
-        </w:rPr>
-        <w:t>ộ</w:t>
-      </w:r>
-      <w:r>
-        <w:rPr>
-          <w:rFonts w:ascii="Times New Roman" w:hAnsi="Times New Roman" w:cs="Times New Roman"/>
-          <w:sz w:val="24"/>
-        </w:rPr>
-        <w:t>i tho</w:t>
-      </w:r>
-      <w:r>
-        <w:rPr>
-          <w:rFonts w:ascii="Times New Roman" w:hAnsi="Times New Roman" w:cs="Times New Roman"/>
-          <w:sz w:val="24"/>
-        </w:rPr>
-        <w:t>ạ</w:t>
-      </w:r>
-      <w:r>
-        <w:rPr>
-          <w:rFonts w:ascii="Times New Roman" w:hAnsi="Times New Roman" w:cs="Times New Roman"/>
-          <w:sz w:val="24"/>
-        </w:rPr>
-        <w:t>i.</w:t>
+        <w:t>Memory được nạp một lần duy nhất ở đầu mỗi session (trước khi agent chạy) bằng hàm load_memory(). Nội dung memory sau đó được chuyển thành chuỗi văn bản qua memory_to_context() và nối vào cuối SYSTEM_PROMPT tạo thành SYSTEM_PROMPT_WITH_MEMORY. Nhờ đó, agent luôn 'thấy' lịch sử và quy ước từ đầu cuộc hội thoại.</w:t>
       </w:r>
     </w:p>
     <w:p>
@@ -1682,14 +660,7 @@
           <w:sz w:val="18"/>
         </w:rPr>
         <w:br/>
-        <w:t>update_conventions</w:t>
-      </w:r>
-      <w:r>
-        <w:rPr>
-          <w:rFonts w:ascii="Times New Roman" w:hAnsi="Times New Roman" w:cs="Times New Roman"/>
-          <w:sz w:val="18"/>
-        </w:rPr>
-        <w:t>(MEMORY, CONSTRAINTS)</w:t>
+        <w:t>update_conventions(MEMORY, CONSTRAINTS)</w:t>
       </w:r>
       <w:r>
         <w:rPr>
@@ -1735,14 +706,7 @@
           <w:sz w:val="18"/>
         </w:rPr>
         <w:br/>
-        <w:t>run_react(CONSTRAINTS.to_prompt(), REACT_SCRIPT[</w:t>
-      </w:r>
-      <w:r>
-        <w:rPr>
-          <w:rFonts w:ascii="Times New Roman" w:hAnsi="Times New Roman" w:cs="Times New Roman"/>
-          <w:sz w:val="18"/>
-        </w:rPr>
-        <w:t>CASE],</w:t>
+        <w:t>run_react(CONSTRAINTS.to_prompt(), REACT_SCRIPT[CASE],</w:t>
       </w:r>
       <w:r>
         <w:rPr>
@@ -1765,35 +729,7 @@
           <w:rFonts w:ascii="Times New Roman" w:hAnsi="Times New Roman" w:cs="Times New Roman"/>
           <w:color w:val="000000"/>
         </w:rPr>
-        <w:t>1.4 Khi quy ư</w:t>
-      </w:r>
-      <w:r>
-        <w:rPr>
-          <w:rFonts w:ascii="Times New Roman" w:hAnsi="Times New Roman" w:cs="Times New Roman"/>
-          <w:color w:val="000000"/>
-        </w:rPr>
-        <w:t>ớ</w:t>
-      </w:r>
-      <w:r>
-        <w:rPr>
-          <w:rFonts w:ascii="Times New Roman" w:hAnsi="Times New Roman" w:cs="Times New Roman"/>
-          <w:color w:val="000000"/>
-        </w:rPr>
-        <w:t>c đ</w:t>
-      </w:r>
-      <w:r>
-        <w:rPr>
-          <w:rFonts w:ascii="Times New Roman" w:hAnsi="Times New Roman" w:cs="Times New Roman"/>
-          <w:color w:val="000000"/>
-        </w:rPr>
-        <w:t>ổ</w:t>
-      </w:r>
-      <w:r>
-        <w:rPr>
-          <w:rFonts w:ascii="Times New Roman" w:hAnsi="Times New Roman" w:cs="Times New Roman"/>
-          <w:color w:val="000000"/>
-        </w:rPr>
-        <w:t>i (Convention change detection)</w:t>
+        <w:t>1.4 Khi quy ước đổi (Convention change detection)</w:t>
       </w:r>
     </w:p>
     <w:p>
@@ -1807,161 +743,7 @@
           <w:rFonts w:ascii="Times New Roman" w:hAnsi="Times New Roman" w:cs="Times New Roman"/>
           <w:sz w:val="24"/>
         </w:rPr>
-        <w:t>Hàm update_conventions() so sánh t</w:t>
-      </w:r>
-      <w:r>
-        <w:rPr>
-          <w:rFonts w:ascii="Times New Roman" w:hAnsi="Times New Roman" w:cs="Times New Roman"/>
-          <w:sz w:val="24"/>
-        </w:rPr>
-        <w:t>ừ</w:t>
-      </w:r>
-      <w:r>
-        <w:rPr>
-          <w:rFonts w:ascii="Times New Roman" w:hAnsi="Times New Roman" w:cs="Times New Roman"/>
-          <w:sz w:val="24"/>
-        </w:rPr>
-        <w:t>ng trư</w:t>
-      </w:r>
-      <w:r>
-        <w:rPr>
-          <w:rFonts w:ascii="Times New Roman" w:hAnsi="Times New Roman" w:cs="Times New Roman"/>
-          <w:sz w:val="24"/>
-        </w:rPr>
-        <w:t>ờ</w:t>
-      </w:r>
-      <w:r>
-        <w:rPr>
-          <w:rFonts w:ascii="Times New Roman" w:hAnsi="Times New Roman" w:cs="Times New Roman"/>
-          <w:sz w:val="24"/>
-        </w:rPr>
-        <w:t>ng c</w:t>
-      </w:r>
-      <w:r>
-        <w:rPr>
-          <w:rFonts w:ascii="Times New Roman" w:hAnsi="Times New Roman" w:cs="Times New Roman"/>
-          <w:sz w:val="24"/>
-        </w:rPr>
-        <w:t>ủ</w:t>
-      </w:r>
-      <w:r>
-        <w:rPr>
-          <w:rFonts w:ascii="Times New Roman" w:hAnsi="Times New Roman" w:cs="Times New Roman"/>
-          <w:sz w:val="24"/>
-        </w:rPr>
-        <w:t>a CONSTRAINTS dataclass v</w:t>
-      </w:r>
-      <w:r>
-        <w:rPr>
-          <w:rFonts w:ascii="Times New Roman" w:hAnsi="Times New Roman" w:cs="Times New Roman"/>
-          <w:sz w:val="24"/>
-        </w:rPr>
-        <w:t>ớ</w:t>
-      </w:r>
-      <w:r>
-        <w:rPr>
-          <w:rFonts w:ascii="Times New Roman" w:hAnsi="Times New Roman" w:cs="Times New Roman"/>
-          <w:sz w:val="24"/>
-        </w:rPr>
-        <w:t>i b</w:t>
-      </w:r>
-      <w:r>
-        <w:rPr>
-          <w:rFonts w:ascii="Times New Roman" w:hAnsi="Times New Roman" w:cs="Times New Roman"/>
-          <w:sz w:val="24"/>
-        </w:rPr>
-        <w:t>ả</w:t>
-      </w:r>
-      <w:r>
-        <w:rPr>
-          <w:rFonts w:ascii="Times New Roman" w:hAnsi="Times New Roman" w:cs="Times New Roman"/>
-          <w:sz w:val="24"/>
-        </w:rPr>
-        <w:t>n đã lưu. N</w:t>
-      </w:r>
-      <w:r>
-        <w:rPr>
-          <w:rFonts w:ascii="Times New Roman" w:hAnsi="Times New Roman" w:cs="Times New Roman"/>
-          <w:sz w:val="24"/>
-        </w:rPr>
-        <w:t>ế</w:t>
-      </w:r>
-      <w:r>
-        <w:rPr>
-          <w:rFonts w:ascii="Times New Roman" w:hAnsi="Times New Roman" w:cs="Times New Roman"/>
-          <w:sz w:val="24"/>
-        </w:rPr>
-        <w:t>u b</w:t>
-      </w:r>
-      <w:r>
-        <w:rPr>
-          <w:rFonts w:ascii="Times New Roman" w:hAnsi="Times New Roman" w:cs="Times New Roman"/>
-          <w:sz w:val="24"/>
-        </w:rPr>
-        <w:t>ấ</w:t>
-      </w:r>
-      <w:r>
-        <w:rPr>
-          <w:rFonts w:ascii="Times New Roman" w:hAnsi="Times New Roman" w:cs="Times New Roman"/>
-          <w:sz w:val="24"/>
-        </w:rPr>
-        <w:t>t k</w:t>
-      </w:r>
-      <w:r>
-        <w:rPr>
-          <w:rFonts w:ascii="Times New Roman" w:hAnsi="Times New Roman" w:cs="Times New Roman"/>
-          <w:sz w:val="24"/>
-        </w:rPr>
-        <w:t>ỳ</w:t>
-      </w:r>
-      <w:r>
-        <w:rPr>
-          <w:rFonts w:ascii="Times New Roman" w:hAnsi="Times New Roman" w:cs="Times New Roman"/>
-          <w:sz w:val="24"/>
-        </w:rPr>
-        <w:t xml:space="preserve"> trư</w:t>
-      </w:r>
-      <w:r>
-        <w:rPr>
-          <w:rFonts w:ascii="Times New Roman" w:hAnsi="Times New Roman" w:cs="Times New Roman"/>
-          <w:sz w:val="24"/>
-        </w:rPr>
-        <w:t>ờ</w:t>
-      </w:r>
-      <w:r>
-        <w:rPr>
-          <w:rFonts w:ascii="Times New Roman" w:hAnsi="Times New Roman" w:cs="Times New Roman"/>
-          <w:sz w:val="24"/>
-        </w:rPr>
-        <w:t>ng nào thay đ</w:t>
-      </w:r>
-      <w:r>
-        <w:rPr>
-          <w:rFonts w:ascii="Times New Roman" w:hAnsi="Times New Roman" w:cs="Times New Roman"/>
-          <w:sz w:val="24"/>
-        </w:rPr>
-        <w:t>ổ</w:t>
-      </w:r>
-      <w:r>
-        <w:rPr>
-          <w:rFonts w:ascii="Times New Roman" w:hAnsi="Times New Roman" w:cs="Times New Roman"/>
-          <w:sz w:val="24"/>
-        </w:rPr>
-        <w:t>i (tr</w:t>
-      </w:r>
-      <w:r>
-        <w:rPr>
-          <w:rFonts w:ascii="Times New Roman" w:hAnsi="Times New Roman" w:cs="Times New Roman"/>
-          <w:sz w:val="24"/>
-        </w:rPr>
-        <w:t>ừ</w:t>
-      </w:r>
-      <w:r>
-        <w:rPr>
-          <w:rFonts w:ascii="Times New Roman" w:hAnsi="Times New Roman" w:cs="Times New Roman"/>
-          <w:sz w:val="24"/>
-        </w:rPr>
-        <w:t xml:space="preserve"> saved_at), hàm:</w:t>
+        <w:t>Hàm update_conventions() so sánh từng trường của CONSTRAINTS dataclass với bản đã lưu. Nếu bất kỳ trường nào thay đổi (trừ saved_at), hàm:</w:t>
       </w:r>
     </w:p>
     <w:p>
@@ -1977,28 +759,7 @@
           <w:rFonts w:ascii="Times New Roman" w:hAnsi="Times New Roman" w:cs="Times New Roman"/>
           <w:sz w:val="24"/>
         </w:rPr>
-        <w:t>Ghi conve</w:t>
-      </w:r>
-      <w:r>
-        <w:rPr>
-          <w:rFonts w:ascii="Times New Roman" w:hAnsi="Times New Roman" w:cs="Times New Roman"/>
-          <w:sz w:val="24"/>
-        </w:rPr>
-        <w:t>ntions m</w:t>
-      </w:r>
-      <w:r>
-        <w:rPr>
-          <w:rFonts w:ascii="Times New Roman" w:hAnsi="Times New Roman" w:cs="Times New Roman"/>
-          <w:sz w:val="24"/>
-        </w:rPr>
-        <w:t>ớ</w:t>
-      </w:r>
-      <w:r>
-        <w:rPr>
-          <w:rFonts w:ascii="Times New Roman" w:hAnsi="Times New Roman" w:cs="Times New Roman"/>
-          <w:sz w:val="24"/>
-        </w:rPr>
-        <w:t>i vào memory.</w:t>
+        <w:t>Ghi conventions mới vào memory.</w:t>
       </w:r>
     </w:p>
     <w:p>
@@ -2014,105 +775,7 @@
           <w:rFonts w:ascii="Times New Roman" w:hAnsi="Times New Roman" w:cs="Times New Roman"/>
           <w:sz w:val="24"/>
         </w:rPr>
-        <w:t>Đánh d</w:t>
-      </w:r>
-      <w:r>
-        <w:rPr>
-          <w:rFonts w:ascii="Times New Roman" w:hAnsi="Times New Roman" w:cs="Times New Roman"/>
-          <w:sz w:val="24"/>
-        </w:rPr>
-        <w:t>ấ</w:t>
-      </w:r>
-      <w:r>
-        <w:rPr>
-          <w:rFonts w:ascii="Times New Roman" w:hAnsi="Times New Roman" w:cs="Times New Roman"/>
-          <w:sz w:val="24"/>
-        </w:rPr>
-        <w:t>u t</w:t>
-      </w:r>
-      <w:r>
-        <w:rPr>
-          <w:rFonts w:ascii="Times New Roman" w:hAnsi="Times New Roman" w:cs="Times New Roman"/>
-          <w:sz w:val="24"/>
-        </w:rPr>
-        <w:t>ấ</w:t>
-      </w:r>
-      <w:r>
-        <w:rPr>
-          <w:rFonts w:ascii="Times New Roman" w:hAnsi="Times New Roman" w:cs="Times New Roman"/>
-          <w:sz w:val="24"/>
-        </w:rPr>
-        <w:t>t c</w:t>
-      </w:r>
-      <w:r>
-        <w:rPr>
-          <w:rFonts w:ascii="Times New Roman" w:hAnsi="Times New Roman" w:cs="Times New Roman"/>
-          <w:sz w:val="24"/>
-        </w:rPr>
-        <w:t>ả</w:t>
-      </w:r>
-      <w:r>
-        <w:rPr>
-          <w:rFonts w:ascii="Times New Roman" w:hAnsi="Times New Roman" w:cs="Times New Roman"/>
-          <w:sz w:val="24"/>
-        </w:rPr>
-        <w:t xml:space="preserve"> session cũ là stale=True đ</w:t>
-      </w:r>
-      <w:r>
-        <w:rPr>
-          <w:rFonts w:ascii="Times New Roman" w:hAnsi="Times New Roman" w:cs="Times New Roman"/>
-          <w:sz w:val="24"/>
-        </w:rPr>
-        <w:t>ể</w:t>
-      </w:r>
-      <w:r>
-        <w:rPr>
-          <w:rFonts w:ascii="Times New Roman" w:hAnsi="Times New Roman" w:cs="Times New Roman"/>
-          <w:sz w:val="24"/>
-        </w:rPr>
-        <w:t xml:space="preserve"> phân bi</w:t>
-      </w:r>
-      <w:r>
-        <w:rPr>
-          <w:rFonts w:ascii="Times New Roman" w:hAnsi="Times New Roman" w:cs="Times New Roman"/>
-          <w:sz w:val="24"/>
-        </w:rPr>
-        <w:t>ệ</w:t>
-      </w:r>
-      <w:r>
-        <w:rPr>
-          <w:rFonts w:ascii="Times New Roman" w:hAnsi="Times New Roman" w:cs="Times New Roman"/>
-          <w:sz w:val="24"/>
-        </w:rPr>
-        <w:t>t v</w:t>
-      </w:r>
-      <w:r>
-        <w:rPr>
-          <w:rFonts w:ascii="Times New Roman" w:hAnsi="Times New Roman" w:cs="Times New Roman"/>
-          <w:sz w:val="24"/>
-        </w:rPr>
-        <w:t>ớ</w:t>
-      </w:r>
-      <w:r>
-        <w:rPr>
-          <w:rFonts w:ascii="Times New Roman" w:hAnsi="Times New Roman" w:cs="Times New Roman"/>
-          <w:sz w:val="24"/>
-        </w:rPr>
-        <w:t>i session m</w:t>
-      </w:r>
-      <w:r>
-        <w:rPr>
-          <w:rFonts w:ascii="Times New Roman" w:hAnsi="Times New Roman" w:cs="Times New Roman"/>
-          <w:sz w:val="24"/>
-        </w:rPr>
-        <w:t>ớ</w:t>
-      </w:r>
-      <w:r>
-        <w:rPr>
-          <w:rFonts w:ascii="Times New Roman" w:hAnsi="Times New Roman" w:cs="Times New Roman"/>
-          <w:sz w:val="24"/>
-        </w:rPr>
-        <w:t>i.</w:t>
+        <w:t>Đánh dấu tất cả session cũ là stale=True để phân biệt với session mới.</w:t>
       </w:r>
     </w:p>
     <w:p>
@@ -2128,63 +791,7 @@
           <w:rFonts w:ascii="Times New Roman" w:hAnsi="Times New Roman" w:cs="Times New Roman"/>
           <w:sz w:val="24"/>
         </w:rPr>
-        <w:t>In thông báo cho ngư</w:t>
-      </w:r>
-      <w:r>
-        <w:rPr>
-          <w:rFonts w:ascii="Times New Roman" w:hAnsi="Times New Roman" w:cs="Times New Roman"/>
-          <w:sz w:val="24"/>
-        </w:rPr>
-        <w:t>ờ</w:t>
-      </w:r>
-      <w:r>
-        <w:rPr>
-          <w:rFonts w:ascii="Times New Roman" w:hAnsi="Times New Roman" w:cs="Times New Roman"/>
-          <w:sz w:val="24"/>
-        </w:rPr>
-        <w:t>i dùng bi</w:t>
-      </w:r>
-      <w:r>
-        <w:rPr>
-          <w:rFonts w:ascii="Times New Roman" w:hAnsi="Times New Roman" w:cs="Times New Roman"/>
-          <w:sz w:val="24"/>
-        </w:rPr>
-        <w:t>ế</w:t>
-      </w:r>
-      <w:r>
-        <w:rPr>
-          <w:rFonts w:ascii="Times New Roman" w:hAnsi="Times New Roman" w:cs="Times New Roman"/>
-          <w:sz w:val="24"/>
-        </w:rPr>
-        <w:t>t trư</w:t>
-      </w:r>
-      <w:r>
-        <w:rPr>
-          <w:rFonts w:ascii="Times New Roman" w:hAnsi="Times New Roman" w:cs="Times New Roman"/>
-          <w:sz w:val="24"/>
-        </w:rPr>
-        <w:t>ờ</w:t>
-      </w:r>
-      <w:r>
-        <w:rPr>
-          <w:rFonts w:ascii="Times New Roman" w:hAnsi="Times New Roman" w:cs="Times New Roman"/>
-          <w:sz w:val="24"/>
-        </w:rPr>
-        <w:t>ng nào đã thay đ</w:t>
-      </w:r>
-      <w:r>
-        <w:rPr>
-          <w:rFonts w:ascii="Times New Roman" w:hAnsi="Times New Roman" w:cs="Times New Roman"/>
-          <w:sz w:val="24"/>
-        </w:rPr>
-        <w:t>ổ</w:t>
-      </w:r>
-      <w:r>
-        <w:rPr>
-          <w:rFonts w:ascii="Times New Roman" w:hAnsi="Times New Roman" w:cs="Times New Roman"/>
-          <w:sz w:val="24"/>
-        </w:rPr>
-        <w:t>i.</w:t>
+        <w:t>In thông báo cho người dùng biết trường nào đã thay đổi.</w:t>
       </w:r>
     </w:p>
     <w:p>
@@ -2209,14 +816,7 @@
           <w:sz w:val="18"/>
         </w:rPr>
         <w:br/>
-        <w:t xml:space="preserve">    new_conv = { "origin": constraints.origin, ..</w:t>
-      </w:r>
-      <w:r>
-        <w:rPr>
-          <w:rFonts w:ascii="Times New Roman" w:hAnsi="Times New Roman" w:cs="Times New Roman"/>
-          <w:sz w:val="18"/>
-        </w:rPr>
-        <w:t>. }</w:t>
+        <w:t xml:space="preserve">    new_conv = { "origin": constraints.origin, ... }</w:t>
       </w:r>
       <w:r>
         <w:rPr>
@@ -2264,14 +864,7 @@
           <w:sz w:val="18"/>
         </w:rPr>
         <w:br/>
-        <w:t xml:space="preserve">            sess["stal</w:t>
-      </w:r>
-      <w:r>
-        <w:rPr>
-          <w:rFonts w:ascii="Times New Roman" w:hAnsi="Times New Roman" w:cs="Times New Roman"/>
-          <w:sz w:val="18"/>
-        </w:rPr>
-        <w:t>e"] = True          # old sessions are now stale</w:t>
+        <w:t xml:space="preserve">            sess["stale"] = True          # old sessions are now stale</w:t>
       </w:r>
       <w:r>
         <w:rPr>
@@ -2319,42 +912,7 @@
           <w:color w:val="000000"/>
         </w:rPr>
         <w:lastRenderedPageBreak/>
-        <w:t>1.5 Ki</w:t>
-      </w:r>
-      <w:r>
-        <w:rPr>
-          <w:rFonts w:ascii="Times New Roman" w:hAnsi="Times New Roman" w:cs="Times New Roman"/>
-          <w:color w:val="000000"/>
-        </w:rPr>
-        <w:t>ể</w:t>
-      </w:r>
-      <w:r>
-        <w:rPr>
-          <w:rFonts w:ascii="Times New Roman" w:hAnsi="Times New Roman" w:cs="Times New Roman"/>
-          <w:color w:val="000000"/>
-        </w:rPr>
-        <w:t>m ch</w:t>
-      </w:r>
-      <w:r>
-        <w:rPr>
-          <w:rFonts w:ascii="Times New Roman" w:hAnsi="Times New Roman" w:cs="Times New Roman"/>
-          <w:color w:val="000000"/>
-        </w:rPr>
-        <w:t>ứ</w:t>
-      </w:r>
-      <w:r>
-        <w:rPr>
-          <w:rFonts w:ascii="Times New Roman" w:hAnsi="Times New Roman" w:cs="Times New Roman"/>
-          <w:color w:val="000000"/>
-        </w:rPr>
-        <w:t>ng (Verificatio</w:t>
-      </w:r>
-      <w:r>
-        <w:rPr>
-          <w:rFonts w:ascii="Times New Roman" w:hAnsi="Times New Roman" w:cs="Times New Roman"/>
-          <w:color w:val="000000"/>
-        </w:rPr>
-        <w:t>n)</w:t>
+        <w:t>1.5 Kiểm chứng (Verification)</w:t>
       </w:r>
     </w:p>
     <w:p>
@@ -2368,266 +926,7 @@
           <w:rFonts w:ascii="Times New Roman" w:hAnsi="Times New Roman" w:cs="Times New Roman"/>
           <w:sz w:val="24"/>
         </w:rPr>
-        <w:t>Ở</w:t>
-      </w:r>
-      <w:r>
-        <w:rPr>
-          <w:rFonts w:ascii="Times New Roman" w:hAnsi="Times New Roman" w:cs="Times New Roman"/>
-          <w:sz w:val="24"/>
-        </w:rPr>
-        <w:t xml:space="preserve"> đ</w:t>
-      </w:r>
-      <w:r>
-        <w:rPr>
-          <w:rFonts w:ascii="Times New Roman" w:hAnsi="Times New Roman" w:cs="Times New Roman"/>
-          <w:sz w:val="24"/>
-        </w:rPr>
-        <w:t>ầ</w:t>
-      </w:r>
-      <w:r>
-        <w:rPr>
-          <w:rFonts w:ascii="Times New Roman" w:hAnsi="Times New Roman" w:cs="Times New Roman"/>
-          <w:sz w:val="24"/>
-        </w:rPr>
-        <w:t>u m</w:t>
-      </w:r>
-      <w:r>
-        <w:rPr>
-          <w:rFonts w:ascii="Times New Roman" w:hAnsi="Times New Roman" w:cs="Times New Roman"/>
-          <w:sz w:val="24"/>
-        </w:rPr>
-        <w:t>ỗ</w:t>
-      </w:r>
-      <w:r>
-        <w:rPr>
-          <w:rFonts w:ascii="Times New Roman" w:hAnsi="Times New Roman" w:cs="Times New Roman"/>
-          <w:sz w:val="24"/>
-        </w:rPr>
-        <w:t>i session, chương trình in ra đúng đo</w:t>
-      </w:r>
-      <w:r>
-        <w:rPr>
-          <w:rFonts w:ascii="Times New Roman" w:hAnsi="Times New Roman" w:cs="Times New Roman"/>
-          <w:sz w:val="24"/>
-        </w:rPr>
-        <w:t>ạ</w:t>
-      </w:r>
-      <w:r>
-        <w:rPr>
-          <w:rFonts w:ascii="Times New Roman" w:hAnsi="Times New Roman" w:cs="Times New Roman"/>
-          <w:sz w:val="24"/>
-        </w:rPr>
-        <w:t>n text s</w:t>
-      </w:r>
-      <w:r>
-        <w:rPr>
-          <w:rFonts w:ascii="Times New Roman" w:hAnsi="Times New Roman" w:cs="Times New Roman"/>
-          <w:sz w:val="24"/>
-        </w:rPr>
-        <w:t>ẽ</w:t>
-      </w:r>
-      <w:r>
-        <w:rPr>
-          <w:rFonts w:ascii="Times New Roman" w:hAnsi="Times New Roman" w:cs="Times New Roman"/>
-          <w:sz w:val="24"/>
-        </w:rPr>
-        <w:t xml:space="preserve"> đư</w:t>
-      </w:r>
-      <w:r>
-        <w:rPr>
-          <w:rFonts w:ascii="Times New Roman" w:hAnsi="Times New Roman" w:cs="Times New Roman"/>
-          <w:sz w:val="24"/>
-        </w:rPr>
-        <w:t>ợ</w:t>
-      </w:r>
-      <w:r>
-        <w:rPr>
-          <w:rFonts w:ascii="Times New Roman" w:hAnsi="Times New Roman" w:cs="Times New Roman"/>
-          <w:sz w:val="24"/>
-        </w:rPr>
-        <w:t>c inject vào context (dư</w:t>
-      </w:r>
-      <w:r>
-        <w:rPr>
-          <w:rFonts w:ascii="Times New Roman" w:hAnsi="Times New Roman" w:cs="Times New Roman"/>
-          <w:sz w:val="24"/>
-        </w:rPr>
-        <w:t>ớ</w:t>
-      </w:r>
-      <w:r>
-        <w:rPr>
-          <w:rFonts w:ascii="Times New Roman" w:hAnsi="Times New Roman" w:cs="Times New Roman"/>
-          <w:sz w:val="24"/>
-        </w:rPr>
-        <w:t>i tiêu đ</w:t>
-      </w:r>
-      <w:r>
-        <w:rPr>
-          <w:rFonts w:ascii="Times New Roman" w:hAnsi="Times New Roman" w:cs="Times New Roman"/>
-          <w:sz w:val="24"/>
-        </w:rPr>
-        <w:t>ề</w:t>
-      </w:r>
-      <w:r>
-        <w:rPr>
-          <w:rFonts w:ascii="Times New Roman" w:hAnsi="Times New Roman" w:cs="Times New Roman"/>
-          <w:sz w:val="24"/>
-        </w:rPr>
-        <w:t xml:space="preserve"> [KI</w:t>
-      </w:r>
-      <w:r>
-        <w:rPr>
-          <w:rFonts w:ascii="Times New Roman" w:hAnsi="Times New Roman" w:cs="Times New Roman"/>
-          <w:sz w:val="24"/>
-        </w:rPr>
-        <w:t>Ể</w:t>
-      </w:r>
-      <w:r>
-        <w:rPr>
-          <w:rFonts w:ascii="Times New Roman" w:hAnsi="Times New Roman" w:cs="Times New Roman"/>
-          <w:sz w:val="24"/>
-        </w:rPr>
-        <w:t>M CH</w:t>
-      </w:r>
-      <w:r>
-        <w:rPr>
-          <w:rFonts w:ascii="Times New Roman" w:hAnsi="Times New Roman" w:cs="Times New Roman"/>
-          <w:sz w:val="24"/>
-        </w:rPr>
-        <w:t>Ứ</w:t>
-      </w:r>
-      <w:r>
-        <w:rPr>
-          <w:rFonts w:ascii="Times New Roman" w:hAnsi="Times New Roman" w:cs="Times New Roman"/>
-          <w:sz w:val="24"/>
-        </w:rPr>
-        <w:t>NG - Memory injected into context]). Ngư</w:t>
-      </w:r>
-      <w:r>
-        <w:rPr>
-          <w:rFonts w:ascii="Times New Roman" w:hAnsi="Times New Roman" w:cs="Times New Roman"/>
-          <w:sz w:val="24"/>
-        </w:rPr>
-        <w:t>ờ</w:t>
-      </w:r>
-      <w:r>
-        <w:rPr>
-          <w:rFonts w:ascii="Times New Roman" w:hAnsi="Times New Roman" w:cs="Times New Roman"/>
-          <w:sz w:val="24"/>
-        </w:rPr>
-        <w:t>i dùng có th</w:t>
-      </w:r>
-      <w:r>
-        <w:rPr>
-          <w:rFonts w:ascii="Times New Roman" w:hAnsi="Times New Roman" w:cs="Times New Roman"/>
-          <w:sz w:val="24"/>
-        </w:rPr>
-        <w:t>ể</w:t>
-      </w:r>
-      <w:r>
-        <w:rPr>
-          <w:rFonts w:ascii="Times New Roman" w:hAnsi="Times New Roman" w:cs="Times New Roman"/>
-          <w:sz w:val="24"/>
-        </w:rPr>
-        <w:t xml:space="preserve"> đ</w:t>
-      </w:r>
-      <w:r>
-        <w:rPr>
-          <w:rFonts w:ascii="Times New Roman" w:hAnsi="Times New Roman" w:cs="Times New Roman"/>
-          <w:sz w:val="24"/>
-        </w:rPr>
-        <w:t>ọ</w:t>
-      </w:r>
-      <w:r>
-        <w:rPr>
-          <w:rFonts w:ascii="Times New Roman" w:hAnsi="Times New Roman" w:cs="Times New Roman"/>
-          <w:sz w:val="24"/>
-        </w:rPr>
-        <w:t>c và xác nh</w:t>
-      </w:r>
-      <w:r>
-        <w:rPr>
-          <w:rFonts w:ascii="Times New Roman" w:hAnsi="Times New Roman" w:cs="Times New Roman"/>
-          <w:sz w:val="24"/>
-        </w:rPr>
-        <w:t>ậ</w:t>
-      </w:r>
-      <w:r>
-        <w:rPr>
-          <w:rFonts w:ascii="Times New Roman" w:hAnsi="Times New Roman" w:cs="Times New Roman"/>
-          <w:sz w:val="24"/>
-        </w:rPr>
-        <w:t>n r</w:t>
-      </w:r>
-      <w:r>
-        <w:rPr>
-          <w:rFonts w:ascii="Times New Roman" w:hAnsi="Times New Roman" w:cs="Times New Roman"/>
-          <w:sz w:val="24"/>
-        </w:rPr>
-        <w:t>ằ</w:t>
-      </w:r>
-      <w:r>
-        <w:rPr>
-          <w:rFonts w:ascii="Times New Roman" w:hAnsi="Times New Roman" w:cs="Times New Roman"/>
-          <w:sz w:val="24"/>
-        </w:rPr>
-        <w:t>ng agent nh</w:t>
-      </w:r>
-      <w:r>
-        <w:rPr>
-          <w:rFonts w:ascii="Times New Roman" w:hAnsi="Times New Roman" w:cs="Times New Roman"/>
-          <w:sz w:val="24"/>
-        </w:rPr>
-        <w:t>ậ</w:t>
-      </w:r>
-      <w:r>
-        <w:rPr>
-          <w:rFonts w:ascii="Times New Roman" w:hAnsi="Times New Roman" w:cs="Times New Roman"/>
-          <w:sz w:val="24"/>
-        </w:rPr>
-        <w:t>n đúng thông tin trư</w:t>
-      </w:r>
-      <w:r>
-        <w:rPr>
-          <w:rFonts w:ascii="Times New Roman" w:hAnsi="Times New Roman" w:cs="Times New Roman"/>
-          <w:sz w:val="24"/>
-        </w:rPr>
-        <w:t>ớ</w:t>
-      </w:r>
-      <w:r>
-        <w:rPr>
-          <w:rFonts w:ascii="Times New Roman" w:hAnsi="Times New Roman" w:cs="Times New Roman"/>
-          <w:sz w:val="24"/>
-        </w:rPr>
-        <w:t>c khi b</w:t>
-      </w:r>
-      <w:r>
-        <w:rPr>
-          <w:rFonts w:ascii="Times New Roman" w:hAnsi="Times New Roman" w:cs="Times New Roman"/>
-          <w:sz w:val="24"/>
-        </w:rPr>
-        <w:t>ắ</w:t>
-      </w:r>
-      <w:r>
-        <w:rPr>
-          <w:rFonts w:ascii="Times New Roman" w:hAnsi="Times New Roman" w:cs="Times New Roman"/>
-          <w:sz w:val="24"/>
-        </w:rPr>
-        <w:t>t đ</w:t>
-      </w:r>
-      <w:r>
-        <w:rPr>
-          <w:rFonts w:ascii="Times New Roman" w:hAnsi="Times New Roman" w:cs="Times New Roman"/>
-          <w:sz w:val="24"/>
-        </w:rPr>
-        <w:t>ầ</w:t>
-      </w:r>
-      <w:r>
-        <w:rPr>
-          <w:rFonts w:ascii="Times New Roman" w:hAnsi="Times New Roman" w:cs="Times New Roman"/>
-          <w:sz w:val="24"/>
-        </w:rPr>
-        <w:t>u.</w:t>
+        <w:t>Ở đầu mỗi session, chương trình in ra đúng đoạn text sẽ được inject vào context (dưới tiêu đề [KIỂM CHỨNG - Memory injected into context]). Người dùng có thể đọc và xác nhận rằng agent nhận đúng thông tin trước khi bắt đầu.</w:t>
       </w:r>
     </w:p>
     <w:p>
@@ -2649,21 +948,7 @@
           <w:rFonts w:ascii="Times New Roman" w:hAnsi="Times New Roman" w:cs="Times New Roman"/>
           <w:color w:val="000000"/>
         </w:rPr>
-        <w:t>2. Ch</w:t>
-      </w:r>
-      <w:r>
-        <w:rPr>
-          <w:rFonts w:ascii="Times New Roman" w:hAnsi="Times New Roman" w:cs="Times New Roman"/>
-          <w:color w:val="000000"/>
-        </w:rPr>
-        <w:t>ứ</w:t>
-      </w:r>
-      <w:r>
-        <w:rPr>
-          <w:rFonts w:ascii="Times New Roman" w:hAnsi="Times New Roman" w:cs="Times New Roman"/>
-          <w:color w:val="000000"/>
-        </w:rPr>
-        <w:t>ng minh</w:t>
+        <w:t>2. Chứng minh</w:t>
       </w:r>
     </w:p>
     <w:p>
@@ -2678,98 +963,7 @@
           <w:rFonts w:ascii="Times New Roman" w:hAnsi="Times New Roman" w:cs="Times New Roman"/>
           <w:color w:val="000000"/>
         </w:rPr>
-        <w:t>Ch</w:t>
-      </w:r>
-      <w:r>
-        <w:rPr>
-          <w:rFonts w:ascii="Times New Roman" w:hAnsi="Times New Roman" w:cs="Times New Roman"/>
-          <w:color w:val="000000"/>
-        </w:rPr>
-        <w:t>ứ</w:t>
-      </w:r>
-      <w:r>
-        <w:rPr>
-          <w:rFonts w:ascii="Times New Roman" w:hAnsi="Times New Roman" w:cs="Times New Roman"/>
-          <w:color w:val="000000"/>
-        </w:rPr>
-        <w:t>ng minh 1 –</w:t>
-      </w:r>
-      <w:r>
-        <w:rPr>
-          <w:rFonts w:ascii="Times New Roman" w:hAnsi="Times New Roman" w:cs="Times New Roman"/>
-          <w:color w:val="000000"/>
-        </w:rPr>
-        <w:t xml:space="preserve"> Session m</w:t>
-      </w:r>
-      <w:r>
-        <w:rPr>
-          <w:rFonts w:ascii="Times New Roman" w:hAnsi="Times New Roman" w:cs="Times New Roman"/>
-          <w:color w:val="000000"/>
-        </w:rPr>
-        <w:t>ớ</w:t>
-      </w:r>
-      <w:r>
-        <w:rPr>
-          <w:rFonts w:ascii="Times New Roman" w:hAnsi="Times New Roman" w:cs="Times New Roman"/>
-          <w:color w:val="000000"/>
-        </w:rPr>
-        <w:t>i v</w:t>
-      </w:r>
-      <w:r>
-        <w:rPr>
-          <w:rFonts w:ascii="Times New Roman" w:hAnsi="Times New Roman" w:cs="Times New Roman"/>
-          <w:color w:val="000000"/>
-        </w:rPr>
-        <w:t>ẫ</w:t>
-      </w:r>
-      <w:r>
-        <w:rPr>
-          <w:rFonts w:ascii="Times New Roman" w:hAnsi="Times New Roman" w:cs="Times New Roman"/>
-          <w:color w:val="000000"/>
-        </w:rPr>
-        <w:t>n dùng đúng quy ư</w:t>
-      </w:r>
-      <w:r>
-        <w:rPr>
-          <w:rFonts w:ascii="Times New Roman" w:hAnsi="Times New Roman" w:cs="Times New Roman"/>
-          <w:color w:val="000000"/>
-        </w:rPr>
-        <w:t>ớ</w:t>
-      </w:r>
-      <w:r>
-        <w:rPr>
-          <w:rFonts w:ascii="Times New Roman" w:hAnsi="Times New Roman" w:cs="Times New Roman"/>
-          <w:color w:val="000000"/>
-        </w:rPr>
-        <w:t>c đã th</w:t>
-      </w:r>
-      <w:r>
-        <w:rPr>
-          <w:rFonts w:ascii="Times New Roman" w:hAnsi="Times New Roman" w:cs="Times New Roman"/>
-          <w:color w:val="000000"/>
-        </w:rPr>
-        <w:t>ố</w:t>
-      </w:r>
-      <w:r>
-        <w:rPr>
-          <w:rFonts w:ascii="Times New Roman" w:hAnsi="Times New Roman" w:cs="Times New Roman"/>
-          <w:color w:val="000000"/>
-        </w:rPr>
-        <w:t>ng nh</w:t>
-      </w:r>
-      <w:r>
-        <w:rPr>
-          <w:rFonts w:ascii="Times New Roman" w:hAnsi="Times New Roman" w:cs="Times New Roman"/>
-          <w:color w:val="000000"/>
-        </w:rPr>
-        <w:t>ấ</w:t>
-      </w:r>
-      <w:r>
-        <w:rPr>
-          <w:rFonts w:ascii="Times New Roman" w:hAnsi="Times New Roman" w:cs="Times New Roman"/>
-          <w:color w:val="000000"/>
-        </w:rPr>
-        <w:t>t</w:t>
+        <w:t>Chứng minh 1 – Session mới vẫn dùng đúng quy ước đã thống nhất</w:t>
       </w:r>
     </w:p>
     <w:p>
@@ -2784,23 +978,7 @@
           <w:b/>
           <w:sz w:val="24"/>
         </w:rPr>
-        <w:t>Mô t</w:t>
-      </w:r>
-      <w:r>
-        <w:rPr>
-          <w:rFonts w:ascii="Times New Roman" w:hAnsi="Times New Roman" w:cs="Times New Roman"/>
-          <w:b/>
-          <w:sz w:val="24"/>
-        </w:rPr>
-        <w:t>ả</w:t>
-      </w:r>
-      <w:r>
-        <w:rPr>
-          <w:rFonts w:ascii="Times New Roman" w:hAnsi="Times New Roman" w:cs="Times New Roman"/>
-          <w:b/>
-          <w:sz w:val="24"/>
-        </w:rPr>
-        <w:t>:</w:t>
+        <w:t>Mô tả:</w:t>
       </w:r>
     </w:p>
     <w:p>
@@ -2814,308 +992,7 @@
           <w:rFonts w:ascii="Times New Roman" w:hAnsi="Times New Roman" w:cs="Times New Roman"/>
           <w:sz w:val="24"/>
         </w:rPr>
-        <w:t>Ch</w:t>
-      </w:r>
-      <w:r>
-        <w:rPr>
-          <w:rFonts w:ascii="Times New Roman" w:hAnsi="Times New Roman" w:cs="Times New Roman"/>
-          <w:sz w:val="24"/>
-        </w:rPr>
-        <w:t>ạ</w:t>
-      </w:r>
-      <w:r>
-        <w:rPr>
-          <w:rFonts w:ascii="Times New Roman" w:hAnsi="Times New Roman" w:cs="Times New Roman"/>
-          <w:sz w:val="24"/>
-        </w:rPr>
-        <w:t>y session đ</w:t>
-      </w:r>
-      <w:r>
-        <w:rPr>
-          <w:rFonts w:ascii="Times New Roman" w:hAnsi="Times New Roman" w:cs="Times New Roman"/>
-          <w:sz w:val="24"/>
-        </w:rPr>
-        <w:t>ầ</w:t>
-      </w:r>
-      <w:r>
-        <w:rPr>
-          <w:rFonts w:ascii="Times New Roman" w:hAnsi="Times New Roman" w:cs="Times New Roman"/>
-          <w:sz w:val="24"/>
-        </w:rPr>
-        <w:t>u tiên (success), sau đó kh</w:t>
-      </w:r>
-      <w:r>
-        <w:rPr>
-          <w:rFonts w:ascii="Times New Roman" w:hAnsi="Times New Roman" w:cs="Times New Roman"/>
-          <w:sz w:val="24"/>
-        </w:rPr>
-        <w:t>ở</w:t>
-      </w:r>
-      <w:r>
-        <w:rPr>
-          <w:rFonts w:ascii="Times New Roman" w:hAnsi="Times New Roman" w:cs="Times New Roman"/>
-          <w:sz w:val="24"/>
-        </w:rPr>
-        <w:t>i đ</w:t>
-      </w:r>
-      <w:r>
-        <w:rPr>
-          <w:rFonts w:ascii="Times New Roman" w:hAnsi="Times New Roman" w:cs="Times New Roman"/>
-          <w:sz w:val="24"/>
-        </w:rPr>
-        <w:t>ộ</w:t>
-      </w:r>
-      <w:r>
-        <w:rPr>
-          <w:rFonts w:ascii="Times New Roman" w:hAnsi="Times New Roman" w:cs="Times New Roman"/>
-          <w:sz w:val="24"/>
-        </w:rPr>
-        <w:t>ng l</w:t>
-      </w:r>
-      <w:r>
-        <w:rPr>
-          <w:rFonts w:ascii="Times New Roman" w:hAnsi="Times New Roman" w:cs="Times New Roman"/>
-          <w:sz w:val="24"/>
-        </w:rPr>
-        <w:t>ạ</w:t>
-      </w:r>
-      <w:r>
-        <w:rPr>
-          <w:rFonts w:ascii="Times New Roman" w:hAnsi="Times New Roman" w:cs="Times New Roman"/>
-          <w:sz w:val="24"/>
-        </w:rPr>
-        <w:t>i chương trình đ</w:t>
-      </w:r>
-      <w:r>
-        <w:rPr>
-          <w:rFonts w:ascii="Times New Roman" w:hAnsi="Times New Roman" w:cs="Times New Roman"/>
-          <w:sz w:val="24"/>
-        </w:rPr>
-        <w:t>ể</w:t>
-      </w:r>
-      <w:r>
-        <w:rPr>
-          <w:rFonts w:ascii="Times New Roman" w:hAnsi="Times New Roman" w:cs="Times New Roman"/>
-          <w:sz w:val="24"/>
-        </w:rPr>
-        <w:t xml:space="preserve"> mô ph</w:t>
-      </w:r>
-      <w:r>
-        <w:rPr>
-          <w:rFonts w:ascii="Times New Roman" w:hAnsi="Times New Roman" w:cs="Times New Roman"/>
-          <w:sz w:val="24"/>
-        </w:rPr>
-        <w:t>ỏ</w:t>
-      </w:r>
-      <w:r>
-        <w:rPr>
-          <w:rFonts w:ascii="Times New Roman" w:hAnsi="Times New Roman" w:cs="Times New Roman"/>
-          <w:sz w:val="24"/>
-        </w:rPr>
-        <w:t>ng session th</w:t>
-      </w:r>
-      <w:r>
-        <w:rPr>
-          <w:rFonts w:ascii="Times New Roman" w:hAnsi="Times New Roman" w:cs="Times New Roman"/>
-          <w:sz w:val="24"/>
-        </w:rPr>
-        <w:t>ứ</w:t>
-      </w:r>
-      <w:r>
-        <w:rPr>
-          <w:rFonts w:ascii="Times New Roman" w:hAnsi="Times New Roman" w:cs="Times New Roman"/>
-          <w:sz w:val="24"/>
-        </w:rPr>
-        <w:t xml:space="preserve"> hai. </w:t>
-      </w:r>
-      <w:r>
-        <w:rPr>
-          <w:rFonts w:ascii="Times New Roman" w:hAnsi="Times New Roman" w:cs="Times New Roman"/>
-          <w:sz w:val="24"/>
-        </w:rPr>
-        <w:t>Ở</w:t>
-      </w:r>
-      <w:r>
-        <w:rPr>
-          <w:rFonts w:ascii="Times New Roman" w:hAnsi="Times New Roman" w:cs="Times New Roman"/>
-          <w:sz w:val="24"/>
-        </w:rPr>
-        <w:t xml:space="preserve"> session th</w:t>
-      </w:r>
-      <w:r>
-        <w:rPr>
-          <w:rFonts w:ascii="Times New Roman" w:hAnsi="Times New Roman" w:cs="Times New Roman"/>
-          <w:sz w:val="24"/>
-        </w:rPr>
-        <w:t>ứ</w:t>
-      </w:r>
-      <w:r>
-        <w:rPr>
-          <w:rFonts w:ascii="Times New Roman" w:hAnsi="Times New Roman" w:cs="Times New Roman"/>
-          <w:sz w:val="24"/>
-        </w:rPr>
-        <w:t xml:space="preserve"> hai, memory đư</w:t>
-      </w:r>
-      <w:r>
-        <w:rPr>
-          <w:rFonts w:ascii="Times New Roman" w:hAnsi="Times New Roman" w:cs="Times New Roman"/>
-          <w:sz w:val="24"/>
-        </w:rPr>
-        <w:t>ợ</w:t>
-      </w:r>
-      <w:r>
-        <w:rPr>
-          <w:rFonts w:ascii="Times New Roman" w:hAnsi="Times New Roman" w:cs="Times New Roman"/>
-          <w:sz w:val="24"/>
-        </w:rPr>
-        <w:t>c n</w:t>
-      </w:r>
-      <w:r>
-        <w:rPr>
-          <w:rFonts w:ascii="Times New Roman" w:hAnsi="Times New Roman" w:cs="Times New Roman"/>
-          <w:sz w:val="24"/>
-        </w:rPr>
-        <w:t>ạ</w:t>
-      </w:r>
-      <w:r>
-        <w:rPr>
-          <w:rFonts w:ascii="Times New Roman" w:hAnsi="Times New Roman" w:cs="Times New Roman"/>
-          <w:sz w:val="24"/>
-        </w:rPr>
-        <w:t>p t</w:t>
-      </w:r>
-      <w:r>
-        <w:rPr>
-          <w:rFonts w:ascii="Times New Roman" w:hAnsi="Times New Roman" w:cs="Times New Roman"/>
-          <w:sz w:val="24"/>
-        </w:rPr>
-        <w:t>ừ</w:t>
-      </w:r>
-      <w:r>
-        <w:rPr>
-          <w:rFonts w:ascii="Times New Roman" w:hAnsi="Times New Roman" w:cs="Times New Roman"/>
-          <w:sz w:val="24"/>
-        </w:rPr>
-        <w:t xml:space="preserve"> file và inject vào context v</w:t>
-      </w:r>
-      <w:r>
-        <w:rPr>
-          <w:rFonts w:ascii="Times New Roman" w:hAnsi="Times New Roman" w:cs="Times New Roman"/>
-          <w:sz w:val="24"/>
-        </w:rPr>
-        <w:t>ớ</w:t>
-      </w:r>
-      <w:r>
-        <w:rPr>
-          <w:rFonts w:ascii="Times New Roman" w:hAnsi="Times New Roman" w:cs="Times New Roman"/>
-          <w:sz w:val="24"/>
-        </w:rPr>
-        <w:t>i đúng conventions t</w:t>
-      </w:r>
-      <w:r>
-        <w:rPr>
-          <w:rFonts w:ascii="Times New Roman" w:hAnsi="Times New Roman" w:cs="Times New Roman"/>
-          <w:sz w:val="24"/>
-        </w:rPr>
-        <w:t>ừ</w:t>
-      </w:r>
-      <w:r>
-        <w:rPr>
-          <w:rFonts w:ascii="Times New Roman" w:hAnsi="Times New Roman" w:cs="Times New Roman"/>
-          <w:sz w:val="24"/>
-        </w:rPr>
-        <w:t xml:space="preserve"> session 1. Agen</w:t>
-      </w:r>
-      <w:r>
-        <w:rPr>
-          <w:rFonts w:ascii="Times New Roman" w:hAnsi="Times New Roman" w:cs="Times New Roman"/>
-          <w:sz w:val="24"/>
-        </w:rPr>
-        <w:t>t không c</w:t>
-      </w:r>
-      <w:r>
-        <w:rPr>
-          <w:rFonts w:ascii="Times New Roman" w:hAnsi="Times New Roman" w:cs="Times New Roman"/>
-          <w:sz w:val="24"/>
-        </w:rPr>
-        <w:t>ầ</w:t>
-      </w:r>
-      <w:r>
-        <w:rPr>
-          <w:rFonts w:ascii="Times New Roman" w:hAnsi="Times New Roman" w:cs="Times New Roman"/>
-          <w:sz w:val="24"/>
-        </w:rPr>
-        <w:t>n ngư</w:t>
-      </w:r>
-      <w:r>
-        <w:rPr>
-          <w:rFonts w:ascii="Times New Roman" w:hAnsi="Times New Roman" w:cs="Times New Roman"/>
-          <w:sz w:val="24"/>
-        </w:rPr>
-        <w:t>ờ</w:t>
-      </w:r>
-      <w:r>
-        <w:rPr>
-          <w:rFonts w:ascii="Times New Roman" w:hAnsi="Times New Roman" w:cs="Times New Roman"/>
-          <w:sz w:val="24"/>
-        </w:rPr>
-        <w:t>i dùng nh</w:t>
-      </w:r>
-      <w:r>
-        <w:rPr>
-          <w:rFonts w:ascii="Times New Roman" w:hAnsi="Times New Roman" w:cs="Times New Roman"/>
-          <w:sz w:val="24"/>
-        </w:rPr>
-        <w:t>ậ</w:t>
-      </w:r>
-      <w:r>
-        <w:rPr>
-          <w:rFonts w:ascii="Times New Roman" w:hAnsi="Times New Roman" w:cs="Times New Roman"/>
-          <w:sz w:val="24"/>
-        </w:rPr>
-        <w:t>p l</w:t>
-      </w:r>
-      <w:r>
-        <w:rPr>
-          <w:rFonts w:ascii="Times New Roman" w:hAnsi="Times New Roman" w:cs="Times New Roman"/>
-          <w:sz w:val="24"/>
-        </w:rPr>
-        <w:t>ạ</w:t>
-      </w:r>
-      <w:r>
-        <w:rPr>
-          <w:rFonts w:ascii="Times New Roman" w:hAnsi="Times New Roman" w:cs="Times New Roman"/>
-          <w:sz w:val="24"/>
-        </w:rPr>
-        <w:t>i tuy</w:t>
-      </w:r>
-      <w:r>
-        <w:rPr>
-          <w:rFonts w:ascii="Times New Roman" w:hAnsi="Times New Roman" w:cs="Times New Roman"/>
-          <w:sz w:val="24"/>
-        </w:rPr>
-        <w:t>ế</w:t>
-      </w:r>
-      <w:r>
-        <w:rPr>
-          <w:rFonts w:ascii="Times New Roman" w:hAnsi="Times New Roman" w:cs="Times New Roman"/>
-          <w:sz w:val="24"/>
-        </w:rPr>
-        <w:t>n bay, ngày, gi</w:t>
-      </w:r>
-      <w:r>
-        <w:rPr>
-          <w:rFonts w:ascii="Times New Roman" w:hAnsi="Times New Roman" w:cs="Times New Roman"/>
-          <w:sz w:val="24"/>
-        </w:rPr>
-        <w:t>ờ</w:t>
-      </w:r>
-      <w:r>
-        <w:rPr>
-          <w:rFonts w:ascii="Times New Roman" w:hAnsi="Times New Roman" w:cs="Times New Roman"/>
-          <w:sz w:val="24"/>
-        </w:rPr>
-        <w:t xml:space="preserve"> hay giá.</w:t>
+        <w:t>Chạy session đầu tiên (success), sau đó khởi động lại chương trình để mô phỏng session thứ hai. Ở session thứ hai, memory được nạp từ file và inject vào context với đúng conventions từ session 1. Agent không cần người dùng nhập lại tuyến bay, ngày, giờ hay giá.</w:t>
       </w:r>
     </w:p>
     <w:p>
@@ -3130,39 +1007,7 @@
           <w:b/>
           <w:sz w:val="24"/>
         </w:rPr>
-        <w:t>Output ví d</w:t>
-      </w:r>
-      <w:r>
-        <w:rPr>
-          <w:rFonts w:ascii="Times New Roman" w:hAnsi="Times New Roman" w:cs="Times New Roman"/>
-          <w:b/>
-          <w:sz w:val="24"/>
-        </w:rPr>
-        <w:t>ụ</w:t>
-      </w:r>
-      <w:r>
-        <w:rPr>
-          <w:rFonts w:ascii="Times New Roman" w:hAnsi="Times New Roman" w:cs="Times New Roman"/>
-          <w:b/>
-          <w:sz w:val="24"/>
-        </w:rPr>
-        <w:t xml:space="preserve"> (session 2, sau khi session 1 đã đ</w:t>
-      </w:r>
-      <w:r>
-        <w:rPr>
-          <w:rFonts w:ascii="Times New Roman" w:hAnsi="Times New Roman" w:cs="Times New Roman"/>
-          <w:b/>
-          <w:sz w:val="24"/>
-        </w:rPr>
-        <w:t>ặ</w:t>
-      </w:r>
-      <w:r>
-        <w:rPr>
-          <w:rFonts w:ascii="Times New Roman" w:hAnsi="Times New Roman" w:cs="Times New Roman"/>
-          <w:b/>
-          <w:sz w:val="24"/>
-        </w:rPr>
-        <w:t>t vé thành công):</w:t>
+        <w:t>Output ví dụ (session 2, sau khi session 1 đã đặt vé thành công):</w:t>
       </w:r>
     </w:p>
     <w:p>
@@ -3179,35 +1024,7 @@
           <w:rFonts w:ascii="Times New Roman" w:hAnsi="Times New Roman" w:cs="Times New Roman"/>
           <w:sz w:val="18"/>
         </w:rPr>
-        <w:t>[KI</w:t>
-      </w:r>
-      <w:r>
-        <w:rPr>
-          <w:rFonts w:ascii="Times New Roman" w:hAnsi="Times New Roman" w:cs="Times New Roman"/>
-          <w:sz w:val="18"/>
-        </w:rPr>
-        <w:t>Ể</w:t>
-      </w:r>
-      <w:r>
-        <w:rPr>
-          <w:rFonts w:ascii="Times New Roman" w:hAnsi="Times New Roman" w:cs="Times New Roman"/>
-          <w:sz w:val="18"/>
-        </w:rPr>
-        <w:t>M CH</w:t>
-      </w:r>
-      <w:r>
-        <w:rPr>
-          <w:rFonts w:ascii="Times New Roman" w:hAnsi="Times New Roman" w:cs="Times New Roman"/>
-          <w:sz w:val="18"/>
-        </w:rPr>
-        <w:t>Ứ</w:t>
-      </w:r>
-      <w:r>
-        <w:rPr>
-          <w:rFonts w:ascii="Times New Roman" w:hAnsi="Times New Roman" w:cs="Times New Roman"/>
-          <w:sz w:val="18"/>
-        </w:rPr>
-        <w:t>NG - Memory injected into context]</w:t>
+        <w:t>[KIỂM CHỨNG - Memory injected into context]</w:t>
       </w:r>
       <w:r>
         <w:rPr>
@@ -3231,14 +1048,7 @@
           <w:sz w:val="18"/>
         </w:rPr>
         <w:br/>
-        <w:t xml:space="preserve">  Dat</w:t>
-      </w:r>
-      <w:r>
-        <w:rPr>
-          <w:rFonts w:ascii="Times New Roman" w:hAnsi="Times New Roman" w:cs="Times New Roman"/>
-          <w:sz w:val="18"/>
-        </w:rPr>
-        <w:t>e: 2026-10-07</w:t>
+        <w:t xml:space="preserve">  Date: 2026-10-07</w:t>
       </w:r>
       <w:r>
         <w:rPr>
@@ -3308,23 +1118,7 @@
           <w:b/>
           <w:sz w:val="24"/>
         </w:rPr>
-        <w:t>Gi</w:t>
-      </w:r>
-      <w:r>
-        <w:rPr>
-          <w:rFonts w:ascii="Times New Roman" w:hAnsi="Times New Roman" w:cs="Times New Roman"/>
-          <w:b/>
-          <w:sz w:val="24"/>
-        </w:rPr>
-        <w:t>ả</w:t>
-      </w:r>
-      <w:r>
-        <w:rPr>
-          <w:rFonts w:ascii="Times New Roman" w:hAnsi="Times New Roman" w:cs="Times New Roman"/>
-          <w:b/>
-          <w:sz w:val="24"/>
-        </w:rPr>
-        <w:t>i thích:</w:t>
+        <w:t>Giải thích:</w:t>
       </w:r>
     </w:p>
     <w:p>
@@ -3338,266 +1132,7 @@
           <w:rFonts w:ascii="Times New Roman" w:hAnsi="Times New Roman" w:cs="Times New Roman"/>
           <w:sz w:val="24"/>
         </w:rPr>
-        <w:t>Session m</w:t>
-      </w:r>
-      <w:r>
-        <w:rPr>
-          <w:rFonts w:ascii="Times New Roman" w:hAnsi="Times New Roman" w:cs="Times New Roman"/>
-          <w:sz w:val="24"/>
-        </w:rPr>
-        <w:t>ớ</w:t>
-      </w:r>
-      <w:r>
-        <w:rPr>
-          <w:rFonts w:ascii="Times New Roman" w:hAnsi="Times New Roman" w:cs="Times New Roman"/>
-          <w:sz w:val="24"/>
-        </w:rPr>
-        <w:t>i đ</w:t>
-      </w:r>
-      <w:r>
-        <w:rPr>
-          <w:rFonts w:ascii="Times New Roman" w:hAnsi="Times New Roman" w:cs="Times New Roman"/>
-          <w:sz w:val="24"/>
-        </w:rPr>
-        <w:t>ọ</w:t>
-      </w:r>
-      <w:r>
-        <w:rPr>
-          <w:rFonts w:ascii="Times New Roman" w:hAnsi="Times New Roman" w:cs="Times New Roman"/>
-          <w:sz w:val="24"/>
-        </w:rPr>
-        <w:t>c conventions đúng (SGN→DAD</w:t>
-      </w:r>
-      <w:r>
-        <w:rPr>
-          <w:rFonts w:ascii="Times New Roman" w:hAnsi="Times New Roman" w:cs="Times New Roman"/>
-          <w:sz w:val="24"/>
-        </w:rPr>
-        <w:t>, trư</w:t>
-      </w:r>
-      <w:r>
-        <w:rPr>
-          <w:rFonts w:ascii="Times New Roman" w:hAnsi="Times New Roman" w:cs="Times New Roman"/>
-          <w:sz w:val="24"/>
-        </w:rPr>
-        <w:t>ớ</w:t>
-      </w:r>
-      <w:r>
-        <w:rPr>
-          <w:rFonts w:ascii="Times New Roman" w:hAnsi="Times New Roman" w:cs="Times New Roman"/>
-          <w:sz w:val="24"/>
-        </w:rPr>
-        <w:t>c 12:00, ≤ 2,000,000 VND) t</w:t>
-      </w:r>
-      <w:r>
-        <w:rPr>
-          <w:rFonts w:ascii="Times New Roman" w:hAnsi="Times New Roman" w:cs="Times New Roman"/>
-          <w:sz w:val="24"/>
-        </w:rPr>
-        <w:t>ừ</w:t>
-      </w:r>
-      <w:r>
-        <w:rPr>
-          <w:rFonts w:ascii="Times New Roman" w:hAnsi="Times New Roman" w:cs="Times New Roman"/>
-          <w:sz w:val="24"/>
-        </w:rPr>
-        <w:t xml:space="preserve"> memory.json, không ph</w:t>
-      </w:r>
-      <w:r>
-        <w:rPr>
-          <w:rFonts w:ascii="Times New Roman" w:hAnsi="Times New Roman" w:cs="Times New Roman"/>
-          <w:sz w:val="24"/>
-        </w:rPr>
-        <w:t>ụ</w:t>
-      </w:r>
-      <w:r>
-        <w:rPr>
-          <w:rFonts w:ascii="Times New Roman" w:hAnsi="Times New Roman" w:cs="Times New Roman"/>
-          <w:sz w:val="24"/>
-        </w:rPr>
-        <w:t xml:space="preserve"> thu</w:t>
-      </w:r>
-      <w:r>
-        <w:rPr>
-          <w:rFonts w:ascii="Times New Roman" w:hAnsi="Times New Roman" w:cs="Times New Roman"/>
-          <w:sz w:val="24"/>
-        </w:rPr>
-        <w:t>ộ</w:t>
-      </w:r>
-      <w:r>
-        <w:rPr>
-          <w:rFonts w:ascii="Times New Roman" w:hAnsi="Times New Roman" w:cs="Times New Roman"/>
-          <w:sz w:val="24"/>
-        </w:rPr>
-        <w:t>c vào vi</w:t>
-      </w:r>
-      <w:r>
-        <w:rPr>
-          <w:rFonts w:ascii="Times New Roman" w:hAnsi="Times New Roman" w:cs="Times New Roman"/>
-          <w:sz w:val="24"/>
-        </w:rPr>
-        <w:t>ệ</w:t>
-      </w:r>
-      <w:r>
-        <w:rPr>
-          <w:rFonts w:ascii="Times New Roman" w:hAnsi="Times New Roman" w:cs="Times New Roman"/>
-          <w:sz w:val="24"/>
-        </w:rPr>
-        <w:t>c ngư</w:t>
-      </w:r>
-      <w:r>
-        <w:rPr>
-          <w:rFonts w:ascii="Times New Roman" w:hAnsi="Times New Roman" w:cs="Times New Roman"/>
-          <w:sz w:val="24"/>
-        </w:rPr>
-        <w:t>ờ</w:t>
-      </w:r>
-      <w:r>
-        <w:rPr>
-          <w:rFonts w:ascii="Times New Roman" w:hAnsi="Times New Roman" w:cs="Times New Roman"/>
-          <w:sz w:val="24"/>
-        </w:rPr>
-        <w:t>i dùng nh</w:t>
-      </w:r>
-      <w:r>
-        <w:rPr>
-          <w:rFonts w:ascii="Times New Roman" w:hAnsi="Times New Roman" w:cs="Times New Roman"/>
-          <w:sz w:val="24"/>
-        </w:rPr>
-        <w:t>ậ</w:t>
-      </w:r>
-      <w:r>
-        <w:rPr>
-          <w:rFonts w:ascii="Times New Roman" w:hAnsi="Times New Roman" w:cs="Times New Roman"/>
-          <w:sz w:val="24"/>
-        </w:rPr>
-        <w:t>p l</w:t>
-      </w:r>
-      <w:r>
-        <w:rPr>
-          <w:rFonts w:ascii="Times New Roman" w:hAnsi="Times New Roman" w:cs="Times New Roman"/>
-          <w:sz w:val="24"/>
-        </w:rPr>
-        <w:t>ạ</w:t>
-      </w:r>
-      <w:r>
-        <w:rPr>
-          <w:rFonts w:ascii="Times New Roman" w:hAnsi="Times New Roman" w:cs="Times New Roman"/>
-          <w:sz w:val="24"/>
-        </w:rPr>
-        <w:t>i. Harness đã ghi đ</w:t>
-      </w:r>
-      <w:r>
-        <w:rPr>
-          <w:rFonts w:ascii="Times New Roman" w:hAnsi="Times New Roman" w:cs="Times New Roman"/>
-          <w:sz w:val="24"/>
-        </w:rPr>
-        <w:t>ầ</w:t>
-      </w:r>
-      <w:r>
-        <w:rPr>
-          <w:rFonts w:ascii="Times New Roman" w:hAnsi="Times New Roman" w:cs="Times New Roman"/>
-          <w:sz w:val="24"/>
-        </w:rPr>
-        <w:t>y đ</w:t>
-      </w:r>
-      <w:r>
-        <w:rPr>
-          <w:rFonts w:ascii="Times New Roman" w:hAnsi="Times New Roman" w:cs="Times New Roman"/>
-          <w:sz w:val="24"/>
-        </w:rPr>
-        <w:t>ủ</w:t>
-      </w:r>
-      <w:r>
-        <w:rPr>
-          <w:rFonts w:ascii="Times New Roman" w:hAnsi="Times New Roman" w:cs="Times New Roman"/>
-          <w:sz w:val="24"/>
-        </w:rPr>
-        <w:t xml:space="preserve"> thông tin này sau session 1 và n</w:t>
-      </w:r>
-      <w:r>
-        <w:rPr>
-          <w:rFonts w:ascii="Times New Roman" w:hAnsi="Times New Roman" w:cs="Times New Roman"/>
-          <w:sz w:val="24"/>
-        </w:rPr>
-        <w:t>ạ</w:t>
-      </w:r>
-      <w:r>
-        <w:rPr>
-          <w:rFonts w:ascii="Times New Roman" w:hAnsi="Times New Roman" w:cs="Times New Roman"/>
-          <w:sz w:val="24"/>
-        </w:rPr>
-        <w:t>p l</w:t>
-      </w:r>
-      <w:r>
-        <w:rPr>
-          <w:rFonts w:ascii="Times New Roman" w:hAnsi="Times New Roman" w:cs="Times New Roman"/>
-          <w:sz w:val="24"/>
-        </w:rPr>
-        <w:t>ạ</w:t>
-      </w:r>
-      <w:r>
-        <w:rPr>
-          <w:rFonts w:ascii="Times New Roman" w:hAnsi="Times New Roman" w:cs="Times New Roman"/>
-          <w:sz w:val="24"/>
-        </w:rPr>
-        <w:t>i cho session 2. Đi</w:t>
-      </w:r>
-      <w:r>
-        <w:rPr>
-          <w:rFonts w:ascii="Times New Roman" w:hAnsi="Times New Roman" w:cs="Times New Roman"/>
-          <w:sz w:val="24"/>
-        </w:rPr>
-        <w:t>ề</w:t>
-      </w:r>
-      <w:r>
-        <w:rPr>
-          <w:rFonts w:ascii="Times New Roman" w:hAnsi="Times New Roman" w:cs="Times New Roman"/>
-          <w:sz w:val="24"/>
-        </w:rPr>
-        <w:t>u này ch</w:t>
-      </w:r>
-      <w:r>
-        <w:rPr>
-          <w:rFonts w:ascii="Times New Roman" w:hAnsi="Times New Roman" w:cs="Times New Roman"/>
-          <w:sz w:val="24"/>
-        </w:rPr>
-        <w:t>ứ</w:t>
-      </w:r>
-      <w:r>
-        <w:rPr>
-          <w:rFonts w:ascii="Times New Roman" w:hAnsi="Times New Roman" w:cs="Times New Roman"/>
-          <w:sz w:val="24"/>
-        </w:rPr>
-        <w:t>ng minh memory ho</w:t>
-      </w:r>
-      <w:r>
-        <w:rPr>
-          <w:rFonts w:ascii="Times New Roman" w:hAnsi="Times New Roman" w:cs="Times New Roman"/>
-          <w:sz w:val="24"/>
-        </w:rPr>
-        <w:t>ạ</w:t>
-      </w:r>
-      <w:r>
-        <w:rPr>
-          <w:rFonts w:ascii="Times New Roman" w:hAnsi="Times New Roman" w:cs="Times New Roman"/>
-          <w:sz w:val="24"/>
-        </w:rPr>
-        <w:t>t đ</w:t>
-      </w:r>
-      <w:r>
-        <w:rPr>
-          <w:rFonts w:ascii="Times New Roman" w:hAnsi="Times New Roman" w:cs="Times New Roman"/>
-          <w:sz w:val="24"/>
-        </w:rPr>
-        <w:t>ộ</w:t>
-      </w:r>
-      <w:r>
-        <w:rPr>
-          <w:rFonts w:ascii="Times New Roman" w:hAnsi="Times New Roman" w:cs="Times New Roman"/>
-          <w:sz w:val="24"/>
-        </w:rPr>
-        <w:t>ng xuyên session.</w:t>
+        <w:t>Session mới đọc conventions đúng (SGN→DAD, trước 12:00, ≤ 2,000,000 VND) từ memory.json, không phụ thuộc vào việc người dùng nhập lại. Harness đã ghi đầy đủ thông tin này sau session 1 và nạp lại cho session 2. Điều này chứng minh memory hoạt động xuyên session.</w:t>
       </w:r>
     </w:p>
     <w:p>
@@ -3619,84 +1154,7 @@
           <w:rFonts w:ascii="Times New Roman" w:hAnsi="Times New Roman" w:cs="Times New Roman"/>
           <w:color w:val="000000"/>
         </w:rPr>
-        <w:t>Ch</w:t>
-      </w:r>
-      <w:r>
-        <w:rPr>
-          <w:rFonts w:ascii="Times New Roman" w:hAnsi="Times New Roman" w:cs="Times New Roman"/>
-          <w:color w:val="000000"/>
-        </w:rPr>
-        <w:t>ứ</w:t>
-      </w:r>
-      <w:r>
-        <w:rPr>
-          <w:rFonts w:ascii="Times New Roman" w:hAnsi="Times New Roman" w:cs="Times New Roman"/>
-          <w:color w:val="000000"/>
-        </w:rPr>
-        <w:t>ng minh 2 – Quy ư</w:t>
-      </w:r>
-      <w:r>
-        <w:rPr>
-          <w:rFonts w:ascii="Times New Roman" w:hAnsi="Times New Roman" w:cs="Times New Roman"/>
-          <w:color w:val="000000"/>
-        </w:rPr>
-        <w:t>ớ</w:t>
-      </w:r>
-      <w:r>
-        <w:rPr>
-          <w:rFonts w:ascii="Times New Roman" w:hAnsi="Times New Roman" w:cs="Times New Roman"/>
-          <w:color w:val="000000"/>
-        </w:rPr>
-        <w:t>c đ</w:t>
-      </w:r>
-      <w:r>
-        <w:rPr>
-          <w:rFonts w:ascii="Times New Roman" w:hAnsi="Times New Roman" w:cs="Times New Roman"/>
-          <w:color w:val="000000"/>
-        </w:rPr>
-        <w:t>ổ</w:t>
-      </w:r>
-      <w:r>
-        <w:rPr>
-          <w:rFonts w:ascii="Times New Roman" w:hAnsi="Times New Roman" w:cs="Times New Roman"/>
-          <w:color w:val="000000"/>
-        </w:rPr>
-        <w:t>i thì cá</w:t>
-      </w:r>
-      <w:r>
-        <w:rPr>
-          <w:rFonts w:ascii="Times New Roman" w:hAnsi="Times New Roman" w:cs="Times New Roman"/>
-          <w:color w:val="000000"/>
-        </w:rPr>
-        <w:t>c session sau dùng quy ư</w:t>
-      </w:r>
-      <w:r>
-        <w:rPr>
-          <w:rFonts w:ascii="Times New Roman" w:hAnsi="Times New Roman" w:cs="Times New Roman"/>
-          <w:color w:val="000000"/>
-        </w:rPr>
-        <w:t>ớ</w:t>
-      </w:r>
-      <w:r>
-        <w:rPr>
-          <w:rFonts w:ascii="Times New Roman" w:hAnsi="Times New Roman" w:cs="Times New Roman"/>
-          <w:color w:val="000000"/>
-        </w:rPr>
-        <w:t>c m</w:t>
-      </w:r>
-      <w:r>
-        <w:rPr>
-          <w:rFonts w:ascii="Times New Roman" w:hAnsi="Times New Roman" w:cs="Times New Roman"/>
-          <w:color w:val="000000"/>
-        </w:rPr>
-        <w:t>ớ</w:t>
-      </w:r>
-      <w:r>
-        <w:rPr>
-          <w:rFonts w:ascii="Times New Roman" w:hAnsi="Times New Roman" w:cs="Times New Roman"/>
-          <w:color w:val="000000"/>
-        </w:rPr>
-        <w:t>i</w:t>
+        <w:t>Chứng minh 2 – Quy ước đổi thì các session sau dùng quy ước mới</w:t>
       </w:r>
     </w:p>
     <w:p>
@@ -3711,23 +1169,7 @@
           <w:b/>
           <w:sz w:val="24"/>
         </w:rPr>
-        <w:t>Mô t</w:t>
-      </w:r>
-      <w:r>
-        <w:rPr>
-          <w:rFonts w:ascii="Times New Roman" w:hAnsi="Times New Roman" w:cs="Times New Roman"/>
-          <w:b/>
-          <w:sz w:val="24"/>
-        </w:rPr>
-        <w:t>ả</w:t>
-      </w:r>
-      <w:r>
-        <w:rPr>
-          <w:rFonts w:ascii="Times New Roman" w:hAnsi="Times New Roman" w:cs="Times New Roman"/>
-          <w:b/>
-          <w:sz w:val="24"/>
-        </w:rPr>
-        <w:t>:</w:t>
+        <w:t>Mô tả:</w:t>
       </w:r>
     </w:p>
     <w:p>
@@ -3741,238 +1183,7 @@
           <w:rFonts w:ascii="Times New Roman" w:hAnsi="Times New Roman" w:cs="Times New Roman"/>
           <w:sz w:val="24"/>
         </w:rPr>
-        <w:t>Thay đ</w:t>
-      </w:r>
-      <w:r>
-        <w:rPr>
-          <w:rFonts w:ascii="Times New Roman" w:hAnsi="Times New Roman" w:cs="Times New Roman"/>
-          <w:sz w:val="24"/>
-        </w:rPr>
-        <w:t>ổ</w:t>
-      </w:r>
-      <w:r>
-        <w:rPr>
-          <w:rFonts w:ascii="Times New Roman" w:hAnsi="Times New Roman" w:cs="Times New Roman"/>
-          <w:sz w:val="24"/>
-        </w:rPr>
-        <w:t>i CONSTRAINTS.max_price = 1_500_000 trong code (ngư</w:t>
-      </w:r>
-      <w:r>
-        <w:rPr>
-          <w:rFonts w:ascii="Times New Roman" w:hAnsi="Times New Roman" w:cs="Times New Roman"/>
-          <w:sz w:val="24"/>
-        </w:rPr>
-        <w:t>ờ</w:t>
-      </w:r>
-      <w:r>
-        <w:rPr>
-          <w:rFonts w:ascii="Times New Roman" w:hAnsi="Times New Roman" w:cs="Times New Roman"/>
-          <w:sz w:val="24"/>
-        </w:rPr>
-        <w:t>i dùng mu</w:t>
-      </w:r>
-      <w:r>
-        <w:rPr>
-          <w:rFonts w:ascii="Times New Roman" w:hAnsi="Times New Roman" w:cs="Times New Roman"/>
-          <w:sz w:val="24"/>
-        </w:rPr>
-        <w:t>ố</w:t>
-      </w:r>
-      <w:r>
-        <w:rPr>
-          <w:rFonts w:ascii="Times New Roman" w:hAnsi="Times New Roman" w:cs="Times New Roman"/>
-          <w:sz w:val="24"/>
-        </w:rPr>
-        <w:t>n gi</w:t>
-      </w:r>
-      <w:r>
-        <w:rPr>
-          <w:rFonts w:ascii="Times New Roman" w:hAnsi="Times New Roman" w:cs="Times New Roman"/>
-          <w:sz w:val="24"/>
-        </w:rPr>
-        <w:t>ớ</w:t>
-      </w:r>
-      <w:r>
-        <w:rPr>
-          <w:rFonts w:ascii="Times New Roman" w:hAnsi="Times New Roman" w:cs="Times New Roman"/>
-          <w:sz w:val="24"/>
-        </w:rPr>
-        <w:t>i h</w:t>
-      </w:r>
-      <w:r>
-        <w:rPr>
-          <w:rFonts w:ascii="Times New Roman" w:hAnsi="Times New Roman" w:cs="Times New Roman"/>
-          <w:sz w:val="24"/>
-        </w:rPr>
-        <w:t>ạ</w:t>
-      </w:r>
-      <w:r>
-        <w:rPr>
-          <w:rFonts w:ascii="Times New Roman" w:hAnsi="Times New Roman" w:cs="Times New Roman"/>
-          <w:sz w:val="24"/>
-        </w:rPr>
-        <w:t>n giá th</w:t>
-      </w:r>
-      <w:r>
-        <w:rPr>
-          <w:rFonts w:ascii="Times New Roman" w:hAnsi="Times New Roman" w:cs="Times New Roman"/>
-          <w:sz w:val="24"/>
-        </w:rPr>
-        <w:t>ấ</w:t>
-      </w:r>
-      <w:r>
-        <w:rPr>
-          <w:rFonts w:ascii="Times New Roman" w:hAnsi="Times New Roman" w:cs="Times New Roman"/>
-          <w:sz w:val="24"/>
-        </w:rPr>
-        <w:t>p hơn). Khi ch</w:t>
-      </w:r>
-      <w:r>
-        <w:rPr>
-          <w:rFonts w:ascii="Times New Roman" w:hAnsi="Times New Roman" w:cs="Times New Roman"/>
-          <w:sz w:val="24"/>
-        </w:rPr>
-        <w:t>ạ</w:t>
-      </w:r>
-      <w:r>
-        <w:rPr>
-          <w:rFonts w:ascii="Times New Roman" w:hAnsi="Times New Roman" w:cs="Times New Roman"/>
-          <w:sz w:val="24"/>
-        </w:rPr>
-        <w:t>y session m</w:t>
-      </w:r>
-      <w:r>
-        <w:rPr>
-          <w:rFonts w:ascii="Times New Roman" w:hAnsi="Times New Roman" w:cs="Times New Roman"/>
-          <w:sz w:val="24"/>
-        </w:rPr>
-        <w:t>ớ</w:t>
-      </w:r>
-      <w:r>
-        <w:rPr>
-          <w:rFonts w:ascii="Times New Roman" w:hAnsi="Times New Roman" w:cs="Times New Roman"/>
-          <w:sz w:val="24"/>
-        </w:rPr>
-        <w:t>i, update_conventions() phát hi</w:t>
-      </w:r>
-      <w:r>
-        <w:rPr>
-          <w:rFonts w:ascii="Times New Roman" w:hAnsi="Times New Roman" w:cs="Times New Roman"/>
-          <w:sz w:val="24"/>
-        </w:rPr>
-        <w:t>ệ</w:t>
-      </w:r>
-      <w:r>
-        <w:rPr>
-          <w:rFonts w:ascii="Times New Roman" w:hAnsi="Times New Roman" w:cs="Times New Roman"/>
-          <w:sz w:val="24"/>
-        </w:rPr>
-        <w:t>n s</w:t>
-      </w:r>
-      <w:r>
-        <w:rPr>
-          <w:rFonts w:ascii="Times New Roman" w:hAnsi="Times New Roman" w:cs="Times New Roman"/>
-          <w:sz w:val="24"/>
-        </w:rPr>
-        <w:t>ự</w:t>
-      </w:r>
-      <w:r>
-        <w:rPr>
-          <w:rFonts w:ascii="Times New Roman" w:hAnsi="Times New Roman" w:cs="Times New Roman"/>
-          <w:sz w:val="24"/>
-        </w:rPr>
-        <w:t xml:space="preserve"> thay đ</w:t>
-      </w:r>
-      <w:r>
-        <w:rPr>
-          <w:rFonts w:ascii="Times New Roman" w:hAnsi="Times New Roman" w:cs="Times New Roman"/>
-          <w:sz w:val="24"/>
-        </w:rPr>
-        <w:t>ổ</w:t>
-      </w:r>
-      <w:r>
-        <w:rPr>
-          <w:rFonts w:ascii="Times New Roman" w:hAnsi="Times New Roman" w:cs="Times New Roman"/>
-          <w:sz w:val="24"/>
-        </w:rPr>
-        <w:t>i, c</w:t>
-      </w:r>
-      <w:r>
-        <w:rPr>
-          <w:rFonts w:ascii="Times New Roman" w:hAnsi="Times New Roman" w:cs="Times New Roman"/>
-          <w:sz w:val="24"/>
-        </w:rPr>
-        <w:t>ậ</w:t>
-      </w:r>
-      <w:r>
-        <w:rPr>
-          <w:rFonts w:ascii="Times New Roman" w:hAnsi="Times New Roman" w:cs="Times New Roman"/>
-          <w:sz w:val="24"/>
-        </w:rPr>
-        <w:t>p nh</w:t>
-      </w:r>
-      <w:r>
-        <w:rPr>
-          <w:rFonts w:ascii="Times New Roman" w:hAnsi="Times New Roman" w:cs="Times New Roman"/>
-          <w:sz w:val="24"/>
-        </w:rPr>
-        <w:t>ậ</w:t>
-      </w:r>
-      <w:r>
-        <w:rPr>
-          <w:rFonts w:ascii="Times New Roman" w:hAnsi="Times New Roman" w:cs="Times New Roman"/>
-          <w:sz w:val="24"/>
-        </w:rPr>
-        <w:t>t memory và đánh d</w:t>
-      </w:r>
-      <w:r>
-        <w:rPr>
-          <w:rFonts w:ascii="Times New Roman" w:hAnsi="Times New Roman" w:cs="Times New Roman"/>
-          <w:sz w:val="24"/>
-        </w:rPr>
-        <w:t>ấ</w:t>
-      </w:r>
-      <w:r>
-        <w:rPr>
-          <w:rFonts w:ascii="Times New Roman" w:hAnsi="Times New Roman" w:cs="Times New Roman"/>
-          <w:sz w:val="24"/>
-        </w:rPr>
-        <w:t>u t</w:t>
-      </w:r>
-      <w:r>
-        <w:rPr>
-          <w:rFonts w:ascii="Times New Roman" w:hAnsi="Times New Roman" w:cs="Times New Roman"/>
-          <w:sz w:val="24"/>
-        </w:rPr>
-        <w:t>ấ</w:t>
-      </w:r>
-      <w:r>
-        <w:rPr>
-          <w:rFonts w:ascii="Times New Roman" w:hAnsi="Times New Roman" w:cs="Times New Roman"/>
-          <w:sz w:val="24"/>
-        </w:rPr>
-        <w:t>t c</w:t>
-      </w:r>
-      <w:r>
-        <w:rPr>
-          <w:rFonts w:ascii="Times New Roman" w:hAnsi="Times New Roman" w:cs="Times New Roman"/>
-          <w:sz w:val="24"/>
-        </w:rPr>
-        <w:t>ả</w:t>
-      </w:r>
-      <w:r>
-        <w:rPr>
-          <w:rFonts w:ascii="Times New Roman" w:hAnsi="Times New Roman" w:cs="Times New Roman"/>
-          <w:sz w:val="24"/>
-        </w:rPr>
-        <w:t xml:space="preserve"> session cũ là </w:t>
-      </w:r>
-      <w:r>
-        <w:rPr>
-          <w:rFonts w:ascii="Times New Roman" w:hAnsi="Times New Roman" w:cs="Times New Roman"/>
-          <w:sz w:val="24"/>
-        </w:rPr>
-        <w:t>stale=True.</w:t>
+        <w:t>Thay đổi CONSTRAINTS.max_price = 1_500_000 trong code (người dùng muốn giới hạn giá thấp hơn). Khi chạy session mới, update_conventions() phát hiện sự thay đổi, cập nhật memory và đánh dấu tất cả session cũ là stale=True.</w:t>
       </w:r>
     </w:p>
     <w:p>
@@ -3988,55 +1199,7 @@
           <w:sz w:val="24"/>
         </w:rPr>
         <w:lastRenderedPageBreak/>
-        <w:t>Output ví d</w:t>
-      </w:r>
-      <w:r>
-        <w:rPr>
-          <w:rFonts w:ascii="Times New Roman" w:hAnsi="Times New Roman" w:cs="Times New Roman"/>
-          <w:b/>
-          <w:sz w:val="24"/>
-        </w:rPr>
-        <w:t>ụ</w:t>
-      </w:r>
-      <w:r>
-        <w:rPr>
-          <w:rFonts w:ascii="Times New Roman" w:hAnsi="Times New Roman" w:cs="Times New Roman"/>
-          <w:b/>
-          <w:sz w:val="24"/>
-        </w:rPr>
-        <w:t xml:space="preserve"> (khi max_price đ</w:t>
-      </w:r>
-      <w:r>
-        <w:rPr>
-          <w:rFonts w:ascii="Times New Roman" w:hAnsi="Times New Roman" w:cs="Times New Roman"/>
-          <w:b/>
-          <w:sz w:val="24"/>
-        </w:rPr>
-        <w:t>ổ</w:t>
-      </w:r>
-      <w:r>
-        <w:rPr>
-          <w:rFonts w:ascii="Times New Roman" w:hAnsi="Times New Roman" w:cs="Times New Roman"/>
-          <w:b/>
-          <w:sz w:val="24"/>
-        </w:rPr>
-        <w:t>i t</w:t>
-      </w:r>
-      <w:r>
-        <w:rPr>
-          <w:rFonts w:ascii="Times New Roman" w:hAnsi="Times New Roman" w:cs="Times New Roman"/>
-          <w:b/>
-          <w:sz w:val="24"/>
-        </w:rPr>
-        <w:t>ừ</w:t>
-      </w:r>
-      <w:r>
-        <w:rPr>
-          <w:rFonts w:ascii="Times New Roman" w:hAnsi="Times New Roman" w:cs="Times New Roman"/>
-          <w:b/>
-          <w:sz w:val="24"/>
-        </w:rPr>
-        <w:t xml:space="preserve"> 2,000,000 → 1,500,000 VND):</w:t>
+        <w:t>Output ví dụ (khi max_price đổi từ 2,000,000 → 1,500,000 VND):</w:t>
       </w:r>
     </w:p>
     <w:p>
@@ -4068,35 +1231,7 @@
           <w:sz w:val="18"/>
         </w:rPr>
         <w:br/>
-        <w:t>[KI</w:t>
-      </w:r>
-      <w:r>
-        <w:rPr>
-          <w:rFonts w:ascii="Times New Roman" w:hAnsi="Times New Roman" w:cs="Times New Roman"/>
-          <w:sz w:val="18"/>
-        </w:rPr>
-        <w:t>Ể</w:t>
-      </w:r>
-      <w:r>
-        <w:rPr>
-          <w:rFonts w:ascii="Times New Roman" w:hAnsi="Times New Roman" w:cs="Times New Roman"/>
-          <w:sz w:val="18"/>
-        </w:rPr>
-        <w:t>M CH</w:t>
-      </w:r>
-      <w:r>
-        <w:rPr>
-          <w:rFonts w:ascii="Times New Roman" w:hAnsi="Times New Roman" w:cs="Times New Roman"/>
-          <w:sz w:val="18"/>
-        </w:rPr>
-        <w:t>Ứ</w:t>
-      </w:r>
-      <w:r>
-        <w:rPr>
-          <w:rFonts w:ascii="Times New Roman" w:hAnsi="Times New Roman" w:cs="Times New Roman"/>
-          <w:sz w:val="18"/>
-        </w:rPr>
-        <w:t>NG - Memory injected into context]</w:t>
+        <w:t>[KIỂM CHỨNG - Memory injected into context]</w:t>
       </w:r>
       <w:r>
         <w:rPr>
@@ -4112,14 +1247,7 @@
           <w:sz w:val="18"/>
         </w:rPr>
         <w:br/>
-        <w:t xml:space="preserve">  Rou</w:t>
-      </w:r>
-      <w:r>
-        <w:rPr>
-          <w:rFonts w:ascii="Times New Roman" w:hAnsi="Times New Roman" w:cs="Times New Roman"/>
-          <w:sz w:val="18"/>
-        </w:rPr>
-        <w:t>te: SGN -&gt; DAD</w:t>
+        <w:t xml:space="preserve">  Route: SGN -&gt; DAD</w:t>
       </w:r>
       <w:r>
         <w:rPr>
@@ -4176,8 +1304,6 @@
         <w:br/>
         <w:t xml:space="preserve">  Bookings: VN122-12A (paid=True)</w:t>
       </w:r>
-      <w:bookmarkStart w:id="0" w:name="_GoBack"/>
-      <w:bookmarkEnd w:id="0"/>
       <w:r>
         <w:rPr>
           <w:rFonts w:ascii="Times New Roman" w:hAnsi="Times New Roman" w:cs="Times New Roman"/>
@@ -4199,23 +1325,7 @@
           <w:b/>
           <w:sz w:val="24"/>
         </w:rPr>
-        <w:t>Gi</w:t>
-      </w:r>
-      <w:r>
-        <w:rPr>
-          <w:rFonts w:ascii="Times New Roman" w:hAnsi="Times New Roman" w:cs="Times New Roman"/>
-          <w:b/>
-          <w:sz w:val="24"/>
-        </w:rPr>
-        <w:t>ả</w:t>
-      </w:r>
-      <w:r>
-        <w:rPr>
-          <w:rFonts w:ascii="Times New Roman" w:hAnsi="Times New Roman" w:cs="Times New Roman"/>
-          <w:b/>
-          <w:sz w:val="24"/>
-        </w:rPr>
-        <w:t>i thích:</w:t>
+        <w:t>Giải thích:</w:t>
       </w:r>
     </w:p>
     <w:p>
@@ -4229,371 +1339,7 @@
           <w:rFonts w:ascii="Times New Roman" w:hAnsi="Times New Roman" w:cs="Times New Roman"/>
           <w:sz w:val="24"/>
         </w:rPr>
-        <w:t>Harness phát hi</w:t>
-      </w:r>
-      <w:r>
-        <w:rPr>
-          <w:rFonts w:ascii="Times New Roman" w:hAnsi="Times New Roman" w:cs="Times New Roman"/>
-          <w:sz w:val="24"/>
-        </w:rPr>
-        <w:t>ệ</w:t>
-      </w:r>
-      <w:r>
-        <w:rPr>
-          <w:rFonts w:ascii="Times New Roman" w:hAnsi="Times New Roman" w:cs="Times New Roman"/>
-          <w:sz w:val="24"/>
-        </w:rPr>
-        <w:t>n max</w:t>
-      </w:r>
-      <w:r>
-        <w:rPr>
-          <w:rFonts w:ascii="Times New Roman" w:hAnsi="Times New Roman" w:cs="Times New Roman"/>
-          <w:sz w:val="24"/>
-        </w:rPr>
-        <w:t>_price thay đ</w:t>
-      </w:r>
-      <w:r>
-        <w:rPr>
-          <w:rFonts w:ascii="Times New Roman" w:hAnsi="Times New Roman" w:cs="Times New Roman"/>
-          <w:sz w:val="24"/>
-        </w:rPr>
-        <w:t>ổ</w:t>
-      </w:r>
-      <w:r>
-        <w:rPr>
-          <w:rFonts w:ascii="Times New Roman" w:hAnsi="Times New Roman" w:cs="Times New Roman"/>
-          <w:sz w:val="24"/>
-        </w:rPr>
-        <w:t>i (2,000,000 → 1,500,000), c</w:t>
-      </w:r>
-      <w:r>
-        <w:rPr>
-          <w:rFonts w:ascii="Times New Roman" w:hAnsi="Times New Roman" w:cs="Times New Roman"/>
-          <w:sz w:val="24"/>
-        </w:rPr>
-        <w:t>ậ</w:t>
-      </w:r>
-      <w:r>
-        <w:rPr>
-          <w:rFonts w:ascii="Times New Roman" w:hAnsi="Times New Roman" w:cs="Times New Roman"/>
-          <w:sz w:val="24"/>
-        </w:rPr>
-        <w:t>p nh</w:t>
-      </w:r>
-      <w:r>
-        <w:rPr>
-          <w:rFonts w:ascii="Times New Roman" w:hAnsi="Times New Roman" w:cs="Times New Roman"/>
-          <w:sz w:val="24"/>
-        </w:rPr>
-        <w:t>ậ</w:t>
-      </w:r>
-      <w:r>
-        <w:rPr>
-          <w:rFonts w:ascii="Times New Roman" w:hAnsi="Times New Roman" w:cs="Times New Roman"/>
-          <w:sz w:val="24"/>
-        </w:rPr>
-        <w:t>t memory và đánh d</w:t>
-      </w:r>
-      <w:r>
-        <w:rPr>
-          <w:rFonts w:ascii="Times New Roman" w:hAnsi="Times New Roman" w:cs="Times New Roman"/>
-          <w:sz w:val="24"/>
-        </w:rPr>
-        <w:t>ấ</w:t>
-      </w:r>
-      <w:r>
-        <w:rPr>
-          <w:rFonts w:ascii="Times New Roman" w:hAnsi="Times New Roman" w:cs="Times New Roman"/>
-          <w:sz w:val="24"/>
-        </w:rPr>
-        <w:t>u t</w:t>
-      </w:r>
-      <w:r>
-        <w:rPr>
-          <w:rFonts w:ascii="Times New Roman" w:hAnsi="Times New Roman" w:cs="Times New Roman"/>
-          <w:sz w:val="24"/>
-        </w:rPr>
-        <w:t>ấ</w:t>
-      </w:r>
-      <w:r>
-        <w:rPr>
-          <w:rFonts w:ascii="Times New Roman" w:hAnsi="Times New Roman" w:cs="Times New Roman"/>
-          <w:sz w:val="24"/>
-        </w:rPr>
-        <w:t>t c</w:t>
-      </w:r>
-      <w:r>
-        <w:rPr>
-          <w:rFonts w:ascii="Times New Roman" w:hAnsi="Times New Roman" w:cs="Times New Roman"/>
-          <w:sz w:val="24"/>
-        </w:rPr>
-        <w:t>ả</w:t>
-      </w:r>
-      <w:r>
-        <w:rPr>
-          <w:rFonts w:ascii="Times New Roman" w:hAnsi="Times New Roman" w:cs="Times New Roman"/>
-          <w:sz w:val="24"/>
-        </w:rPr>
-        <w:t xml:space="preserve"> session cũ là stale. Session m</w:t>
-      </w:r>
-      <w:r>
-        <w:rPr>
-          <w:rFonts w:ascii="Times New Roman" w:hAnsi="Times New Roman" w:cs="Times New Roman"/>
-          <w:sz w:val="24"/>
-        </w:rPr>
-        <w:t>ớ</w:t>
-      </w:r>
-      <w:r>
-        <w:rPr>
-          <w:rFonts w:ascii="Times New Roman" w:hAnsi="Times New Roman" w:cs="Times New Roman"/>
-          <w:sz w:val="24"/>
-        </w:rPr>
-        <w:t>i ch</w:t>
-      </w:r>
-      <w:r>
-        <w:rPr>
-          <w:rFonts w:ascii="Times New Roman" w:hAnsi="Times New Roman" w:cs="Times New Roman"/>
-          <w:sz w:val="24"/>
-        </w:rPr>
-        <w:t>ạ</w:t>
-      </w:r>
-      <w:r>
-        <w:rPr>
-          <w:rFonts w:ascii="Times New Roman" w:hAnsi="Times New Roman" w:cs="Times New Roman"/>
-          <w:sz w:val="24"/>
-        </w:rPr>
-        <w:t>y v</w:t>
-      </w:r>
-      <w:r>
-        <w:rPr>
-          <w:rFonts w:ascii="Times New Roman" w:hAnsi="Times New Roman" w:cs="Times New Roman"/>
-          <w:sz w:val="24"/>
-        </w:rPr>
-        <w:t>ớ</w:t>
-      </w:r>
-      <w:r>
-        <w:rPr>
-          <w:rFonts w:ascii="Times New Roman" w:hAnsi="Times New Roman" w:cs="Times New Roman"/>
-          <w:sz w:val="24"/>
-        </w:rPr>
-        <w:t>i quy ư</w:t>
-      </w:r>
-      <w:r>
-        <w:rPr>
-          <w:rFonts w:ascii="Times New Roman" w:hAnsi="Times New Roman" w:cs="Times New Roman"/>
-          <w:sz w:val="24"/>
-        </w:rPr>
-        <w:t>ớ</w:t>
-      </w:r>
-      <w:r>
-        <w:rPr>
-          <w:rFonts w:ascii="Times New Roman" w:hAnsi="Times New Roman" w:cs="Times New Roman"/>
-          <w:sz w:val="24"/>
-        </w:rPr>
-        <w:t>c m</w:t>
-      </w:r>
-      <w:r>
-        <w:rPr>
-          <w:rFonts w:ascii="Times New Roman" w:hAnsi="Times New Roman" w:cs="Times New Roman"/>
-          <w:sz w:val="24"/>
-        </w:rPr>
-        <w:t>ớ</w:t>
-      </w:r>
-      <w:r>
-        <w:rPr>
-          <w:rFonts w:ascii="Times New Roman" w:hAnsi="Times New Roman" w:cs="Times New Roman"/>
-          <w:sz w:val="24"/>
-        </w:rPr>
-        <w:t>i (max_price = 1,500,000 VND), đ</w:t>
-      </w:r>
-      <w:r>
-        <w:rPr>
-          <w:rFonts w:ascii="Times New Roman" w:hAnsi="Times New Roman" w:cs="Times New Roman"/>
-          <w:sz w:val="24"/>
-        </w:rPr>
-        <w:t>ả</w:t>
-      </w:r>
-      <w:r>
-        <w:rPr>
-          <w:rFonts w:ascii="Times New Roman" w:hAnsi="Times New Roman" w:cs="Times New Roman"/>
-          <w:sz w:val="24"/>
-        </w:rPr>
-        <w:t>m b</w:t>
-      </w:r>
-      <w:r>
-        <w:rPr>
-          <w:rFonts w:ascii="Times New Roman" w:hAnsi="Times New Roman" w:cs="Times New Roman"/>
-          <w:sz w:val="24"/>
-        </w:rPr>
-        <w:t>ả</w:t>
-      </w:r>
-      <w:r>
-        <w:rPr>
-          <w:rFonts w:ascii="Times New Roman" w:hAnsi="Times New Roman" w:cs="Times New Roman"/>
-          <w:sz w:val="24"/>
-        </w:rPr>
-        <w:t>o agent không dùng quy ư</w:t>
-      </w:r>
-      <w:r>
-        <w:rPr>
-          <w:rFonts w:ascii="Times New Roman" w:hAnsi="Times New Roman" w:cs="Times New Roman"/>
-          <w:sz w:val="24"/>
-        </w:rPr>
-        <w:t>ớ</w:t>
-      </w:r>
-      <w:r>
-        <w:rPr>
-          <w:rFonts w:ascii="Times New Roman" w:hAnsi="Times New Roman" w:cs="Times New Roman"/>
-          <w:sz w:val="24"/>
-        </w:rPr>
-        <w:t>c cũ đã l</w:t>
-      </w:r>
-      <w:r>
-        <w:rPr>
-          <w:rFonts w:ascii="Times New Roman" w:hAnsi="Times New Roman" w:cs="Times New Roman"/>
-          <w:sz w:val="24"/>
-        </w:rPr>
-        <w:t>ỗ</w:t>
-      </w:r>
-      <w:r>
-        <w:rPr>
-          <w:rFonts w:ascii="Times New Roman" w:hAnsi="Times New Roman" w:cs="Times New Roman"/>
-          <w:sz w:val="24"/>
-        </w:rPr>
-        <w:t>i th</w:t>
-      </w:r>
-      <w:r>
-        <w:rPr>
-          <w:rFonts w:ascii="Times New Roman" w:hAnsi="Times New Roman" w:cs="Times New Roman"/>
-          <w:sz w:val="24"/>
-        </w:rPr>
-        <w:t>ờ</w:t>
-      </w:r>
-      <w:r>
-        <w:rPr>
-          <w:rFonts w:ascii="Times New Roman" w:hAnsi="Times New Roman" w:cs="Times New Roman"/>
-          <w:sz w:val="24"/>
-        </w:rPr>
-        <w:t>i. Đi</w:t>
-      </w:r>
-      <w:r>
-        <w:rPr>
-          <w:rFonts w:ascii="Times New Roman" w:hAnsi="Times New Roman" w:cs="Times New Roman"/>
-          <w:sz w:val="24"/>
-        </w:rPr>
-        <w:t>ề</w:t>
-      </w:r>
-      <w:r>
-        <w:rPr>
-          <w:rFonts w:ascii="Times New Roman" w:hAnsi="Times New Roman" w:cs="Times New Roman"/>
-          <w:sz w:val="24"/>
-        </w:rPr>
-        <w:t>u này ch</w:t>
-      </w:r>
-      <w:r>
-        <w:rPr>
-          <w:rFonts w:ascii="Times New Roman" w:hAnsi="Times New Roman" w:cs="Times New Roman"/>
-          <w:sz w:val="24"/>
-        </w:rPr>
-        <w:t>ứ</w:t>
-      </w:r>
-      <w:r>
-        <w:rPr>
-          <w:rFonts w:ascii="Times New Roman" w:hAnsi="Times New Roman" w:cs="Times New Roman"/>
-          <w:sz w:val="24"/>
-        </w:rPr>
-        <w:t>ng minh cơ ch</w:t>
-      </w:r>
-      <w:r>
-        <w:rPr>
-          <w:rFonts w:ascii="Times New Roman" w:hAnsi="Times New Roman" w:cs="Times New Roman"/>
-          <w:sz w:val="24"/>
-        </w:rPr>
-        <w:t>ế</w:t>
-      </w:r>
-      <w:r>
-        <w:rPr>
-          <w:rFonts w:ascii="Times New Roman" w:hAnsi="Times New Roman" w:cs="Times New Roman"/>
-          <w:sz w:val="24"/>
-        </w:rPr>
-        <w:t xml:space="preserve"> phát hi</w:t>
-      </w:r>
-      <w:r>
-        <w:rPr>
-          <w:rFonts w:ascii="Times New Roman" w:hAnsi="Times New Roman" w:cs="Times New Roman"/>
-          <w:sz w:val="24"/>
-        </w:rPr>
-        <w:t>ệ</w:t>
-      </w:r>
-      <w:r>
-        <w:rPr>
-          <w:rFonts w:ascii="Times New Roman" w:hAnsi="Times New Roman" w:cs="Times New Roman"/>
-          <w:sz w:val="24"/>
-        </w:rPr>
-        <w:t>n thay đ</w:t>
-      </w:r>
-      <w:r>
-        <w:rPr>
-          <w:rFonts w:ascii="Times New Roman" w:hAnsi="Times New Roman" w:cs="Times New Roman"/>
-          <w:sz w:val="24"/>
-        </w:rPr>
-        <w:t>ổ</w:t>
-      </w:r>
-      <w:r>
-        <w:rPr>
-          <w:rFonts w:ascii="Times New Roman" w:hAnsi="Times New Roman" w:cs="Times New Roman"/>
-          <w:sz w:val="24"/>
-        </w:rPr>
-        <w:t>i qu</w:t>
-      </w:r>
-      <w:r>
-        <w:rPr>
-          <w:rFonts w:ascii="Times New Roman" w:hAnsi="Times New Roman" w:cs="Times New Roman"/>
-          <w:sz w:val="24"/>
-        </w:rPr>
-        <w:t>y ư</w:t>
-      </w:r>
-      <w:r>
-        <w:rPr>
-          <w:rFonts w:ascii="Times New Roman" w:hAnsi="Times New Roman" w:cs="Times New Roman"/>
-          <w:sz w:val="24"/>
-        </w:rPr>
-        <w:t>ớ</w:t>
-      </w:r>
-      <w:r>
-        <w:rPr>
-          <w:rFonts w:ascii="Times New Roman" w:hAnsi="Times New Roman" w:cs="Times New Roman"/>
-          <w:sz w:val="24"/>
-        </w:rPr>
-        <w:t>c ho</w:t>
-      </w:r>
-      <w:r>
-        <w:rPr>
-          <w:rFonts w:ascii="Times New Roman" w:hAnsi="Times New Roman" w:cs="Times New Roman"/>
-          <w:sz w:val="24"/>
-        </w:rPr>
-        <w:t>ạ</w:t>
-      </w:r>
-      <w:r>
-        <w:rPr>
-          <w:rFonts w:ascii="Times New Roman" w:hAnsi="Times New Roman" w:cs="Times New Roman"/>
-          <w:sz w:val="24"/>
-        </w:rPr>
-        <w:t>t đ</w:t>
-      </w:r>
-      <w:r>
-        <w:rPr>
-          <w:rFonts w:ascii="Times New Roman" w:hAnsi="Times New Roman" w:cs="Times New Roman"/>
-          <w:sz w:val="24"/>
-        </w:rPr>
-        <w:t>ộ</w:t>
-      </w:r>
-      <w:r>
-        <w:rPr>
-          <w:rFonts w:ascii="Times New Roman" w:hAnsi="Times New Roman" w:cs="Times New Roman"/>
-          <w:sz w:val="24"/>
-        </w:rPr>
-        <w:t>ng đúng.</w:t>
+        <w:t>Harness phát hiện max_price thay đổi (2,000,000 → 1,500,000), cập nhật memory và đánh dấu tất cả session cũ là stale. Session mới chạy với quy ước mới (max_price = 1,500,000 VND), đảm bảo agent không dùng quy ước cũ đã lỗi thời. Điều này chứng minh cơ chế phát hiện thay đổi quy ước hoạt động đúng.</w:t>
       </w:r>
     </w:p>
     <w:p>
@@ -4615,35 +1361,7 @@
           <w:rFonts w:ascii="Times New Roman" w:hAnsi="Times New Roman" w:cs="Times New Roman"/>
           <w:color w:val="000000"/>
         </w:rPr>
-        <w:t>3. K</w:t>
-      </w:r>
-      <w:r>
-        <w:rPr>
-          <w:rFonts w:ascii="Times New Roman" w:hAnsi="Times New Roman" w:cs="Times New Roman"/>
-          <w:color w:val="000000"/>
-        </w:rPr>
-        <w:t>ế</w:t>
-      </w:r>
-      <w:r>
-        <w:rPr>
-          <w:rFonts w:ascii="Times New Roman" w:hAnsi="Times New Roman" w:cs="Times New Roman"/>
-          <w:color w:val="000000"/>
-        </w:rPr>
-        <w:t>t lu</w:t>
-      </w:r>
-      <w:r>
-        <w:rPr>
-          <w:rFonts w:ascii="Times New Roman" w:hAnsi="Times New Roman" w:cs="Times New Roman"/>
-          <w:color w:val="000000"/>
-        </w:rPr>
-        <w:t>ậ</w:t>
-      </w:r>
-      <w:r>
-        <w:rPr>
-          <w:rFonts w:ascii="Times New Roman" w:hAnsi="Times New Roman" w:cs="Times New Roman"/>
-          <w:color w:val="000000"/>
-        </w:rPr>
-        <w:t>n</w:t>
+        <w:t>3. Kết luận</w:t>
       </w:r>
     </w:p>
     <w:p>
@@ -4657,77 +1375,7 @@
           <w:rFonts w:ascii="Times New Roman" w:hAnsi="Times New Roman" w:cs="Times New Roman"/>
           <w:sz w:val="24"/>
         </w:rPr>
-        <w:t>H</w:t>
-      </w:r>
-      <w:r>
-        <w:rPr>
-          <w:rFonts w:ascii="Times New Roman" w:hAnsi="Times New Roman" w:cs="Times New Roman"/>
-          <w:sz w:val="24"/>
-        </w:rPr>
-        <w:t>ệ</w:t>
-      </w:r>
-      <w:r>
-        <w:rPr>
-          <w:rFonts w:ascii="Times New Roman" w:hAnsi="Times New Roman" w:cs="Times New Roman"/>
-          <w:sz w:val="24"/>
-        </w:rPr>
-        <w:t xml:space="preserve"> th</w:t>
-      </w:r>
-      <w:r>
-        <w:rPr>
-          <w:rFonts w:ascii="Times New Roman" w:hAnsi="Times New Roman" w:cs="Times New Roman"/>
-          <w:sz w:val="24"/>
-        </w:rPr>
-        <w:t>ố</w:t>
-      </w:r>
-      <w:r>
-        <w:rPr>
-          <w:rFonts w:ascii="Times New Roman" w:hAnsi="Times New Roman" w:cs="Times New Roman"/>
-          <w:sz w:val="24"/>
-        </w:rPr>
-        <w:t>ng persistent memory đư</w:t>
-      </w:r>
-      <w:r>
-        <w:rPr>
-          <w:rFonts w:ascii="Times New Roman" w:hAnsi="Times New Roman" w:cs="Times New Roman"/>
-          <w:sz w:val="24"/>
-        </w:rPr>
-        <w:t>ợ</w:t>
-      </w:r>
-      <w:r>
-        <w:rPr>
-          <w:rFonts w:ascii="Times New Roman" w:hAnsi="Times New Roman" w:cs="Times New Roman"/>
-          <w:sz w:val="24"/>
-        </w:rPr>
-        <w:t>c implement theo ba nguyên t</w:t>
-      </w:r>
-      <w:r>
-        <w:rPr>
-          <w:rFonts w:ascii="Times New Roman" w:hAnsi="Times New Roman" w:cs="Times New Roman"/>
-          <w:sz w:val="24"/>
-        </w:rPr>
-        <w:t>ắ</w:t>
-      </w:r>
-      <w:r>
-        <w:rPr>
-          <w:rFonts w:ascii="Times New Roman" w:hAnsi="Times New Roman" w:cs="Times New Roman"/>
-          <w:sz w:val="24"/>
-        </w:rPr>
-        <w:t>c c</w:t>
-      </w:r>
-      <w:r>
-        <w:rPr>
-          <w:rFonts w:ascii="Times New Roman" w:hAnsi="Times New Roman" w:cs="Times New Roman"/>
-          <w:sz w:val="24"/>
-        </w:rPr>
-        <w:t>ố</w:t>
-      </w:r>
-      <w:r>
-        <w:rPr>
-          <w:rFonts w:ascii="Times New Roman" w:hAnsi="Times New Roman" w:cs="Times New Roman"/>
-          <w:sz w:val="24"/>
-        </w:rPr>
-        <w:t>t lõi:</w:t>
+        <w:t>Hệ thống persistent memory được implement theo ba nguyên tắc cốt lõi:</w:t>
       </w:r>
     </w:p>
     <w:p>
@@ -4743,77 +1391,7 @@
           <w:rFonts w:ascii="Times New Roman" w:hAnsi="Times New Roman" w:cs="Times New Roman"/>
           <w:sz w:val="24"/>
         </w:rPr>
-        <w:t>Harness is the source of truth: chính harness ghi memory sau m</w:t>
-      </w:r>
-      <w:r>
-        <w:rPr>
-          <w:rFonts w:ascii="Times New Roman" w:hAnsi="Times New Roman" w:cs="Times New Roman"/>
-          <w:sz w:val="24"/>
-        </w:rPr>
-        <w:t>ỗ</w:t>
-      </w:r>
-      <w:r>
-        <w:rPr>
-          <w:rFonts w:ascii="Times New Roman" w:hAnsi="Times New Roman" w:cs="Times New Roman"/>
-          <w:sz w:val="24"/>
-        </w:rPr>
-        <w:t>i pay thành công, không ph</w:t>
-      </w:r>
-      <w:r>
-        <w:rPr>
-          <w:rFonts w:ascii="Times New Roman" w:hAnsi="Times New Roman" w:cs="Times New Roman"/>
-          <w:sz w:val="24"/>
-        </w:rPr>
-        <w:t>ả</w:t>
-      </w:r>
-      <w:r>
-        <w:rPr>
-          <w:rFonts w:ascii="Times New Roman" w:hAnsi="Times New Roman" w:cs="Times New Roman"/>
-          <w:sz w:val="24"/>
-        </w:rPr>
-        <w:t>i model. Model không th</w:t>
-      </w:r>
-      <w:r>
-        <w:rPr>
-          <w:rFonts w:ascii="Times New Roman" w:hAnsi="Times New Roman" w:cs="Times New Roman"/>
-          <w:sz w:val="24"/>
-        </w:rPr>
-        <w:t>ể</w:t>
-      </w:r>
-      <w:r>
-        <w:rPr>
-          <w:rFonts w:ascii="Times New Roman" w:hAnsi="Times New Roman" w:cs="Times New Roman"/>
-          <w:sz w:val="24"/>
-        </w:rPr>
-        <w:t xml:space="preserve"> t</w:t>
-      </w:r>
-      <w:r>
-        <w:rPr>
-          <w:rFonts w:ascii="Times New Roman" w:hAnsi="Times New Roman" w:cs="Times New Roman"/>
-          <w:sz w:val="24"/>
-        </w:rPr>
-        <w:t>ự</w:t>
-      </w:r>
-      <w:r>
-        <w:rPr>
-          <w:rFonts w:ascii="Times New Roman" w:hAnsi="Times New Roman" w:cs="Times New Roman"/>
-          <w:sz w:val="24"/>
-        </w:rPr>
-        <w:t xml:space="preserve"> ý ghi hay s</w:t>
-      </w:r>
-      <w:r>
-        <w:rPr>
-          <w:rFonts w:ascii="Times New Roman" w:hAnsi="Times New Roman" w:cs="Times New Roman"/>
-          <w:sz w:val="24"/>
-        </w:rPr>
-        <w:t>ử</w:t>
-      </w:r>
-      <w:r>
-        <w:rPr>
-          <w:rFonts w:ascii="Times New Roman" w:hAnsi="Times New Roman" w:cs="Times New Roman"/>
-          <w:sz w:val="24"/>
-        </w:rPr>
-        <w:t>a memory.</w:t>
+        <w:t>Harness is the source of truth: chính harness ghi memory sau mỗi pay thành công, không phải model. Model không thể tự ý ghi hay sửa memory.</w:t>
       </w:r>
     </w:p>
     <w:p>
@@ -4829,196 +1407,7 @@
           <w:rFonts w:ascii="Times New Roman" w:hAnsi="Times New Roman" w:cs="Times New Roman"/>
           <w:sz w:val="24"/>
         </w:rPr>
-        <w:t>Quy ư</w:t>
-      </w:r>
-      <w:r>
-        <w:rPr>
-          <w:rFonts w:ascii="Times New Roman" w:hAnsi="Times New Roman" w:cs="Times New Roman"/>
-          <w:sz w:val="24"/>
-        </w:rPr>
-        <w:t>ớ</w:t>
-      </w:r>
-      <w:r>
-        <w:rPr>
-          <w:rFonts w:ascii="Times New Roman" w:hAnsi="Times New Roman" w:cs="Times New Roman"/>
-          <w:sz w:val="24"/>
-        </w:rPr>
-        <w:t xml:space="preserve">c là </w:t>
-      </w:r>
-      <w:r>
-        <w:rPr>
-          <w:rFonts w:ascii="Times New Roman" w:hAnsi="Times New Roman" w:cs="Times New Roman"/>
-          <w:sz w:val="24"/>
-        </w:rPr>
-        <w:t>DATA (Constraints dataclass): memory là ph</w:t>
-      </w:r>
-      <w:r>
-        <w:rPr>
-          <w:rFonts w:ascii="Times New Roman" w:hAnsi="Times New Roman" w:cs="Times New Roman"/>
-          <w:sz w:val="24"/>
-        </w:rPr>
-        <w:t>ả</w:t>
-      </w:r>
-      <w:r>
-        <w:rPr>
-          <w:rFonts w:ascii="Times New Roman" w:hAnsi="Times New Roman" w:cs="Times New Roman"/>
-          <w:sz w:val="24"/>
-        </w:rPr>
-        <w:t>n chi</w:t>
-      </w:r>
-      <w:r>
-        <w:rPr>
-          <w:rFonts w:ascii="Times New Roman" w:hAnsi="Times New Roman" w:cs="Times New Roman"/>
-          <w:sz w:val="24"/>
-        </w:rPr>
-        <w:t>ế</w:t>
-      </w:r>
-      <w:r>
-        <w:rPr>
-          <w:rFonts w:ascii="Times New Roman" w:hAnsi="Times New Roman" w:cs="Times New Roman"/>
-          <w:sz w:val="24"/>
-        </w:rPr>
-        <w:t>u trung th</w:t>
-      </w:r>
-      <w:r>
-        <w:rPr>
-          <w:rFonts w:ascii="Times New Roman" w:hAnsi="Times New Roman" w:cs="Times New Roman"/>
-          <w:sz w:val="24"/>
-        </w:rPr>
-        <w:t>ự</w:t>
-      </w:r>
-      <w:r>
-        <w:rPr>
-          <w:rFonts w:ascii="Times New Roman" w:hAnsi="Times New Roman" w:cs="Times New Roman"/>
-          <w:sz w:val="24"/>
-        </w:rPr>
-        <w:t>c c</w:t>
-      </w:r>
-      <w:r>
-        <w:rPr>
-          <w:rFonts w:ascii="Times New Roman" w:hAnsi="Times New Roman" w:cs="Times New Roman"/>
-          <w:sz w:val="24"/>
-        </w:rPr>
-        <w:t>ủ</w:t>
-      </w:r>
-      <w:r>
-        <w:rPr>
-          <w:rFonts w:ascii="Times New Roman" w:hAnsi="Times New Roman" w:cs="Times New Roman"/>
-          <w:sz w:val="24"/>
-        </w:rPr>
-        <w:t>a Constraints. Khi Constraints thay đ</w:t>
-      </w:r>
-      <w:r>
-        <w:rPr>
-          <w:rFonts w:ascii="Times New Roman" w:hAnsi="Times New Roman" w:cs="Times New Roman"/>
-          <w:sz w:val="24"/>
-        </w:rPr>
-        <w:t>ổ</w:t>
-      </w:r>
-      <w:r>
-        <w:rPr>
-          <w:rFonts w:ascii="Times New Roman" w:hAnsi="Times New Roman" w:cs="Times New Roman"/>
-          <w:sz w:val="24"/>
-        </w:rPr>
-        <w:t>i, memory đư</w:t>
-      </w:r>
-      <w:r>
-        <w:rPr>
-          <w:rFonts w:ascii="Times New Roman" w:hAnsi="Times New Roman" w:cs="Times New Roman"/>
-          <w:sz w:val="24"/>
-        </w:rPr>
-        <w:t>ợ</w:t>
-      </w:r>
-      <w:r>
-        <w:rPr>
-          <w:rFonts w:ascii="Times New Roman" w:hAnsi="Times New Roman" w:cs="Times New Roman"/>
-          <w:sz w:val="24"/>
-        </w:rPr>
-        <w:t>c c</w:t>
-      </w:r>
-      <w:r>
-        <w:rPr>
-          <w:rFonts w:ascii="Times New Roman" w:hAnsi="Times New Roman" w:cs="Times New Roman"/>
-          <w:sz w:val="24"/>
-        </w:rPr>
-        <w:t>ậ</w:t>
-      </w:r>
-      <w:r>
-        <w:rPr>
-          <w:rFonts w:ascii="Times New Roman" w:hAnsi="Times New Roman" w:cs="Times New Roman"/>
-          <w:sz w:val="24"/>
-        </w:rPr>
-        <w:t>p nh</w:t>
-      </w:r>
-      <w:r>
-        <w:rPr>
-          <w:rFonts w:ascii="Times New Roman" w:hAnsi="Times New Roman" w:cs="Times New Roman"/>
-          <w:sz w:val="24"/>
-        </w:rPr>
-        <w:t>ậ</w:t>
-      </w:r>
-      <w:r>
-        <w:rPr>
-          <w:rFonts w:ascii="Times New Roman" w:hAnsi="Times New Roman" w:cs="Times New Roman"/>
-          <w:sz w:val="24"/>
-        </w:rPr>
-        <w:t>t t</w:t>
-      </w:r>
-      <w:r>
-        <w:rPr>
-          <w:rFonts w:ascii="Times New Roman" w:hAnsi="Times New Roman" w:cs="Times New Roman"/>
-          <w:sz w:val="24"/>
-        </w:rPr>
-        <w:t>ự</w:t>
-      </w:r>
-      <w:r>
-        <w:rPr>
-          <w:rFonts w:ascii="Times New Roman" w:hAnsi="Times New Roman" w:cs="Times New Roman"/>
-          <w:sz w:val="24"/>
-        </w:rPr>
-        <w:t xml:space="preserve"> đ</w:t>
-      </w:r>
-      <w:r>
-        <w:rPr>
-          <w:rFonts w:ascii="Times New Roman" w:hAnsi="Times New Roman" w:cs="Times New Roman"/>
-          <w:sz w:val="24"/>
-        </w:rPr>
-        <w:t>ộ</w:t>
-      </w:r>
-      <w:r>
-        <w:rPr>
-          <w:rFonts w:ascii="Times New Roman" w:hAnsi="Times New Roman" w:cs="Times New Roman"/>
-          <w:sz w:val="24"/>
-        </w:rPr>
-        <w:t>ng và các session cũ đư</w:t>
-      </w:r>
-      <w:r>
-        <w:rPr>
-          <w:rFonts w:ascii="Times New Roman" w:hAnsi="Times New Roman" w:cs="Times New Roman"/>
-          <w:sz w:val="24"/>
-        </w:rPr>
-        <w:t>ợ</w:t>
-      </w:r>
-      <w:r>
-        <w:rPr>
-          <w:rFonts w:ascii="Times New Roman" w:hAnsi="Times New Roman" w:cs="Times New Roman"/>
-          <w:sz w:val="24"/>
-        </w:rPr>
-        <w:t>c đánh d</w:t>
-      </w:r>
-      <w:r>
-        <w:rPr>
-          <w:rFonts w:ascii="Times New Roman" w:hAnsi="Times New Roman" w:cs="Times New Roman"/>
-          <w:sz w:val="24"/>
-        </w:rPr>
-        <w:t>ấ</w:t>
-      </w:r>
-      <w:r>
-        <w:rPr>
-          <w:rFonts w:ascii="Times New Roman" w:hAnsi="Times New Roman" w:cs="Times New Roman"/>
-          <w:sz w:val="24"/>
-        </w:rPr>
-        <w:t>u stale.</w:t>
+        <w:t>Quy ước là DATA (Constraints dataclass): memory là phản chiếu trung thực của Constraints. Khi Constraints thay đổi, memory được cập nhật tự động và các session cũ được đánh dấu stale.</w:t>
       </w:r>
     </w:p>
     <w:p>
@@ -5034,182 +1423,7 @@
           <w:rFonts w:ascii="Times New Roman" w:hAnsi="Times New Roman" w:cs="Times New Roman"/>
           <w:sz w:val="24"/>
         </w:rPr>
-        <w:t>Ki</w:t>
-      </w:r>
-      <w:r>
-        <w:rPr>
-          <w:rFonts w:ascii="Times New Roman" w:hAnsi="Times New Roman" w:cs="Times New Roman"/>
-          <w:sz w:val="24"/>
-        </w:rPr>
-        <w:t>ể</w:t>
-      </w:r>
-      <w:r>
-        <w:rPr>
-          <w:rFonts w:ascii="Times New Roman" w:hAnsi="Times New Roman" w:cs="Times New Roman"/>
-          <w:sz w:val="24"/>
-        </w:rPr>
-        <w:t>m ch</w:t>
-      </w:r>
-      <w:r>
-        <w:rPr>
-          <w:rFonts w:ascii="Times New Roman" w:hAnsi="Times New Roman" w:cs="Times New Roman"/>
-          <w:sz w:val="24"/>
-        </w:rPr>
-        <w:t>ứ</w:t>
-      </w:r>
-      <w:r>
-        <w:rPr>
-          <w:rFonts w:ascii="Times New Roman" w:hAnsi="Times New Roman" w:cs="Times New Roman"/>
-          <w:sz w:val="24"/>
-        </w:rPr>
-        <w:t>ng b</w:t>
-      </w:r>
-      <w:r>
-        <w:rPr>
-          <w:rFonts w:ascii="Times New Roman" w:hAnsi="Times New Roman" w:cs="Times New Roman"/>
-          <w:sz w:val="24"/>
-        </w:rPr>
-        <w:t>ằ</w:t>
-      </w:r>
-      <w:r>
-        <w:rPr>
-          <w:rFonts w:ascii="Times New Roman" w:hAnsi="Times New Roman" w:cs="Times New Roman"/>
-          <w:sz w:val="24"/>
-        </w:rPr>
-        <w:t>ng cách in ra memory trư</w:t>
-      </w:r>
-      <w:r>
-        <w:rPr>
-          <w:rFonts w:ascii="Times New Roman" w:hAnsi="Times New Roman" w:cs="Times New Roman"/>
-          <w:sz w:val="24"/>
-        </w:rPr>
-        <w:t>ớ</w:t>
-      </w:r>
-      <w:r>
-        <w:rPr>
-          <w:rFonts w:ascii="Times New Roman" w:hAnsi="Times New Roman" w:cs="Times New Roman"/>
-          <w:sz w:val="24"/>
-        </w:rPr>
-        <w:t>c khi agent ch</w:t>
-      </w:r>
-      <w:r>
-        <w:rPr>
-          <w:rFonts w:ascii="Times New Roman" w:hAnsi="Times New Roman" w:cs="Times New Roman"/>
-          <w:sz w:val="24"/>
-        </w:rPr>
-        <w:t>ạ</w:t>
-      </w:r>
-      <w:r>
-        <w:rPr>
-          <w:rFonts w:ascii="Times New Roman" w:hAnsi="Times New Roman" w:cs="Times New Roman"/>
-          <w:sz w:val="24"/>
-        </w:rPr>
-        <w:t>y (transparency): ngư</w:t>
-      </w:r>
-      <w:r>
-        <w:rPr>
-          <w:rFonts w:ascii="Times New Roman" w:hAnsi="Times New Roman" w:cs="Times New Roman"/>
-          <w:sz w:val="24"/>
-        </w:rPr>
-        <w:t>ờ</w:t>
-      </w:r>
-      <w:r>
-        <w:rPr>
-          <w:rFonts w:ascii="Times New Roman" w:hAnsi="Times New Roman" w:cs="Times New Roman"/>
-          <w:sz w:val="24"/>
-        </w:rPr>
-        <w:t>i dùng l</w:t>
-      </w:r>
-      <w:r>
-        <w:rPr>
-          <w:rFonts w:ascii="Times New Roman" w:hAnsi="Times New Roman" w:cs="Times New Roman"/>
-          <w:sz w:val="24"/>
-        </w:rPr>
-        <w:t>uôn th</w:t>
-      </w:r>
-      <w:r>
-        <w:rPr>
-          <w:rFonts w:ascii="Times New Roman" w:hAnsi="Times New Roman" w:cs="Times New Roman"/>
-          <w:sz w:val="24"/>
-        </w:rPr>
-        <w:t>ấ</w:t>
-      </w:r>
-      <w:r>
-        <w:rPr>
-          <w:rFonts w:ascii="Times New Roman" w:hAnsi="Times New Roman" w:cs="Times New Roman"/>
-          <w:sz w:val="24"/>
-        </w:rPr>
-        <w:t>y đúng ph</w:t>
-      </w:r>
-      <w:r>
-        <w:rPr>
-          <w:rFonts w:ascii="Times New Roman" w:hAnsi="Times New Roman" w:cs="Times New Roman"/>
-          <w:sz w:val="24"/>
-        </w:rPr>
-        <w:t>ầ</w:t>
-      </w:r>
-      <w:r>
-        <w:rPr>
-          <w:rFonts w:ascii="Times New Roman" w:hAnsi="Times New Roman" w:cs="Times New Roman"/>
-          <w:sz w:val="24"/>
-        </w:rPr>
-        <w:t>n memory đư</w:t>
-      </w:r>
-      <w:r>
-        <w:rPr>
-          <w:rFonts w:ascii="Times New Roman" w:hAnsi="Times New Roman" w:cs="Times New Roman"/>
-          <w:sz w:val="24"/>
-        </w:rPr>
-        <w:t>ợ</w:t>
-      </w:r>
-      <w:r>
-        <w:rPr>
-          <w:rFonts w:ascii="Times New Roman" w:hAnsi="Times New Roman" w:cs="Times New Roman"/>
-          <w:sz w:val="24"/>
-        </w:rPr>
-        <w:t>c inject vào context trư</w:t>
-      </w:r>
-      <w:r>
-        <w:rPr>
-          <w:rFonts w:ascii="Times New Roman" w:hAnsi="Times New Roman" w:cs="Times New Roman"/>
-          <w:sz w:val="24"/>
-        </w:rPr>
-        <w:t>ớ</w:t>
-      </w:r>
-      <w:r>
-        <w:rPr>
-          <w:rFonts w:ascii="Times New Roman" w:hAnsi="Times New Roman" w:cs="Times New Roman"/>
-          <w:sz w:val="24"/>
-        </w:rPr>
-        <w:t>c khi session b</w:t>
-      </w:r>
-      <w:r>
-        <w:rPr>
-          <w:rFonts w:ascii="Times New Roman" w:hAnsi="Times New Roman" w:cs="Times New Roman"/>
-          <w:sz w:val="24"/>
-        </w:rPr>
-        <w:t>ắ</w:t>
-      </w:r>
-      <w:r>
-        <w:rPr>
-          <w:rFonts w:ascii="Times New Roman" w:hAnsi="Times New Roman" w:cs="Times New Roman"/>
-          <w:sz w:val="24"/>
-        </w:rPr>
-        <w:t>t đ</w:t>
-      </w:r>
-      <w:r>
-        <w:rPr>
-          <w:rFonts w:ascii="Times New Roman" w:hAnsi="Times New Roman" w:cs="Times New Roman"/>
-          <w:sz w:val="24"/>
-        </w:rPr>
-        <w:t>ầ</w:t>
-      </w:r>
-      <w:r>
-        <w:rPr>
-          <w:rFonts w:ascii="Times New Roman" w:hAnsi="Times New Roman" w:cs="Times New Roman"/>
-          <w:sz w:val="24"/>
-        </w:rPr>
-        <w:t>u.</w:t>
+        <w:t>Kiểm chứng bằng cách in ra memory trước khi agent chạy (transparency): người dùng luôn thấy đúng phần memory được inject vào context trước khi session bắt đầu.</w:t>
       </w:r>
     </w:p>
     <w:p>
@@ -5230,266 +1444,7 @@
           <w:rFonts w:ascii="Times New Roman" w:hAnsi="Times New Roman" w:cs="Times New Roman"/>
           <w:sz w:val="24"/>
         </w:rPr>
-        <w:t>Thi</w:t>
-      </w:r>
-      <w:r>
-        <w:rPr>
-          <w:rFonts w:ascii="Times New Roman" w:hAnsi="Times New Roman" w:cs="Times New Roman"/>
-          <w:sz w:val="24"/>
-        </w:rPr>
-        <w:t>ế</w:t>
-      </w:r>
-      <w:r>
-        <w:rPr>
-          <w:rFonts w:ascii="Times New Roman" w:hAnsi="Times New Roman" w:cs="Times New Roman"/>
-          <w:sz w:val="24"/>
-        </w:rPr>
-        <w:t>t k</w:t>
-      </w:r>
-      <w:r>
-        <w:rPr>
-          <w:rFonts w:ascii="Times New Roman" w:hAnsi="Times New Roman" w:cs="Times New Roman"/>
-          <w:sz w:val="24"/>
-        </w:rPr>
-        <w:t>ế</w:t>
-      </w:r>
-      <w:r>
-        <w:rPr>
-          <w:rFonts w:ascii="Times New Roman" w:hAnsi="Times New Roman" w:cs="Times New Roman"/>
-          <w:sz w:val="24"/>
-        </w:rPr>
-        <w:t xml:space="preserve"> này đ</w:t>
-      </w:r>
-      <w:r>
-        <w:rPr>
-          <w:rFonts w:ascii="Times New Roman" w:hAnsi="Times New Roman" w:cs="Times New Roman"/>
-          <w:sz w:val="24"/>
-        </w:rPr>
-        <w:t>ả</w:t>
-      </w:r>
-      <w:r>
-        <w:rPr>
-          <w:rFonts w:ascii="Times New Roman" w:hAnsi="Times New Roman" w:cs="Times New Roman"/>
-          <w:sz w:val="24"/>
-        </w:rPr>
-        <w:t>m b</w:t>
-      </w:r>
-      <w:r>
-        <w:rPr>
-          <w:rFonts w:ascii="Times New Roman" w:hAnsi="Times New Roman" w:cs="Times New Roman"/>
-          <w:sz w:val="24"/>
-        </w:rPr>
-        <w:t>ả</w:t>
-      </w:r>
-      <w:r>
-        <w:rPr>
-          <w:rFonts w:ascii="Times New Roman" w:hAnsi="Times New Roman" w:cs="Times New Roman"/>
-          <w:sz w:val="24"/>
-        </w:rPr>
-        <w:t>o tính nh</w:t>
-      </w:r>
-      <w:r>
-        <w:rPr>
-          <w:rFonts w:ascii="Times New Roman" w:hAnsi="Times New Roman" w:cs="Times New Roman"/>
-          <w:sz w:val="24"/>
-        </w:rPr>
-        <w:t>ấ</w:t>
-      </w:r>
-      <w:r>
-        <w:rPr>
-          <w:rFonts w:ascii="Times New Roman" w:hAnsi="Times New Roman" w:cs="Times New Roman"/>
-          <w:sz w:val="24"/>
-        </w:rPr>
-        <w:t>t quán (consistency), minh b</w:t>
-      </w:r>
-      <w:r>
-        <w:rPr>
-          <w:rFonts w:ascii="Times New Roman" w:hAnsi="Times New Roman" w:cs="Times New Roman"/>
-          <w:sz w:val="24"/>
-        </w:rPr>
-        <w:t>ạ</w:t>
-      </w:r>
-      <w:r>
-        <w:rPr>
-          <w:rFonts w:ascii="Times New Roman" w:hAnsi="Times New Roman" w:cs="Times New Roman"/>
-          <w:sz w:val="24"/>
-        </w:rPr>
-        <w:t>ch (transparency) và kh</w:t>
-      </w:r>
-      <w:r>
-        <w:rPr>
-          <w:rFonts w:ascii="Times New Roman" w:hAnsi="Times New Roman" w:cs="Times New Roman"/>
-          <w:sz w:val="24"/>
-        </w:rPr>
-        <w:t>ả</w:t>
-      </w:r>
-      <w:r>
-        <w:rPr>
-          <w:rFonts w:ascii="Times New Roman" w:hAnsi="Times New Roman" w:cs="Times New Roman"/>
-          <w:sz w:val="24"/>
-        </w:rPr>
-        <w:t xml:space="preserve"> năng phát hi</w:t>
-      </w:r>
-      <w:r>
-        <w:rPr>
-          <w:rFonts w:ascii="Times New Roman" w:hAnsi="Times New Roman" w:cs="Times New Roman"/>
-          <w:sz w:val="24"/>
-        </w:rPr>
-        <w:t>ệ</w:t>
-      </w:r>
-      <w:r>
-        <w:rPr>
-          <w:rFonts w:ascii="Times New Roman" w:hAnsi="Times New Roman" w:cs="Times New Roman"/>
-          <w:sz w:val="24"/>
-        </w:rPr>
-        <w:t>n thay đ</w:t>
-      </w:r>
-      <w:r>
-        <w:rPr>
-          <w:rFonts w:ascii="Times New Roman" w:hAnsi="Times New Roman" w:cs="Times New Roman"/>
-          <w:sz w:val="24"/>
-        </w:rPr>
-        <w:t>ổ</w:t>
-      </w:r>
-      <w:r>
-        <w:rPr>
-          <w:rFonts w:ascii="Times New Roman" w:hAnsi="Times New Roman" w:cs="Times New Roman"/>
-          <w:sz w:val="24"/>
-        </w:rPr>
-        <w:t>i (change detection) — ba y</w:t>
-      </w:r>
-      <w:r>
-        <w:rPr>
-          <w:rFonts w:ascii="Times New Roman" w:hAnsi="Times New Roman" w:cs="Times New Roman"/>
-          <w:sz w:val="24"/>
-        </w:rPr>
-        <w:t>ế</w:t>
-      </w:r>
-      <w:r>
-        <w:rPr>
-          <w:rFonts w:ascii="Times New Roman" w:hAnsi="Times New Roman" w:cs="Times New Roman"/>
-          <w:sz w:val="24"/>
-        </w:rPr>
-        <w:t>u t</w:t>
-      </w:r>
-      <w:r>
-        <w:rPr>
-          <w:rFonts w:ascii="Times New Roman" w:hAnsi="Times New Roman" w:cs="Times New Roman"/>
-          <w:sz w:val="24"/>
-        </w:rPr>
-        <w:t>ố</w:t>
-      </w:r>
-      <w:r>
-        <w:rPr>
-          <w:rFonts w:ascii="Times New Roman" w:hAnsi="Times New Roman" w:cs="Times New Roman"/>
-          <w:sz w:val="24"/>
-        </w:rPr>
-        <w:t xml:space="preserve"> quan tr</w:t>
-      </w:r>
-      <w:r>
-        <w:rPr>
-          <w:rFonts w:ascii="Times New Roman" w:hAnsi="Times New Roman" w:cs="Times New Roman"/>
-          <w:sz w:val="24"/>
-        </w:rPr>
-        <w:t>ọ</w:t>
-      </w:r>
-      <w:r>
-        <w:rPr>
-          <w:rFonts w:ascii="Times New Roman" w:hAnsi="Times New Roman" w:cs="Times New Roman"/>
-          <w:sz w:val="24"/>
-        </w:rPr>
-        <w:t>ng trong h</w:t>
-      </w:r>
-      <w:r>
-        <w:rPr>
-          <w:rFonts w:ascii="Times New Roman" w:hAnsi="Times New Roman" w:cs="Times New Roman"/>
-          <w:sz w:val="24"/>
-        </w:rPr>
-        <w:t>ệ</w:t>
-      </w:r>
-      <w:r>
-        <w:rPr>
-          <w:rFonts w:ascii="Times New Roman" w:hAnsi="Times New Roman" w:cs="Times New Roman"/>
-          <w:sz w:val="24"/>
-        </w:rPr>
-        <w:t xml:space="preserve"> th</w:t>
-      </w:r>
-      <w:r>
-        <w:rPr>
-          <w:rFonts w:ascii="Times New Roman" w:hAnsi="Times New Roman" w:cs="Times New Roman"/>
-          <w:sz w:val="24"/>
-        </w:rPr>
-        <w:t>ố</w:t>
-      </w:r>
-      <w:r>
-        <w:rPr>
-          <w:rFonts w:ascii="Times New Roman" w:hAnsi="Times New Roman" w:cs="Times New Roman"/>
-          <w:sz w:val="24"/>
-        </w:rPr>
-        <w:t>ng agent có b</w:t>
-      </w:r>
-      <w:r>
-        <w:rPr>
-          <w:rFonts w:ascii="Times New Roman" w:hAnsi="Times New Roman" w:cs="Times New Roman"/>
-          <w:sz w:val="24"/>
-        </w:rPr>
-        <w:t>ộ</w:t>
-      </w:r>
-      <w:r>
-        <w:rPr>
-          <w:rFonts w:ascii="Times New Roman" w:hAnsi="Times New Roman" w:cs="Times New Roman"/>
-          <w:sz w:val="24"/>
-        </w:rPr>
-        <w:t xml:space="preserve"> </w:t>
-      </w:r>
-      <w:r>
-        <w:rPr>
-          <w:rFonts w:ascii="Times New Roman" w:hAnsi="Times New Roman" w:cs="Times New Roman"/>
-          <w:sz w:val="24"/>
-        </w:rPr>
-        <w:t>nh</w:t>
-      </w:r>
-      <w:r>
-        <w:rPr>
-          <w:rFonts w:ascii="Times New Roman" w:hAnsi="Times New Roman" w:cs="Times New Roman"/>
-          <w:sz w:val="24"/>
-        </w:rPr>
-        <w:t>ớ</w:t>
-      </w:r>
-      <w:r>
-        <w:rPr>
-          <w:rFonts w:ascii="Times New Roman" w:hAnsi="Times New Roman" w:cs="Times New Roman"/>
-          <w:sz w:val="24"/>
-        </w:rPr>
-        <w:t xml:space="preserve"> b</w:t>
-      </w:r>
-      <w:r>
-        <w:rPr>
-          <w:rFonts w:ascii="Times New Roman" w:hAnsi="Times New Roman" w:cs="Times New Roman"/>
-          <w:sz w:val="24"/>
-        </w:rPr>
-        <w:t>ề</w:t>
-      </w:r>
-      <w:r>
-        <w:rPr>
-          <w:rFonts w:ascii="Times New Roman" w:hAnsi="Times New Roman" w:cs="Times New Roman"/>
-          <w:sz w:val="24"/>
-        </w:rPr>
-        <w:t>n v</w:t>
-      </w:r>
-      <w:r>
-        <w:rPr>
-          <w:rFonts w:ascii="Times New Roman" w:hAnsi="Times New Roman" w:cs="Times New Roman"/>
-          <w:sz w:val="24"/>
-        </w:rPr>
-        <w:t>ữ</w:t>
-      </w:r>
-      <w:r>
-        <w:rPr>
-          <w:rFonts w:ascii="Times New Roman" w:hAnsi="Times New Roman" w:cs="Times New Roman"/>
-          <w:sz w:val="24"/>
-        </w:rPr>
-        <w:t>ng.</w:t>
+        <w:t>Thiết kế này đảm bảo tính nhất quán (consistency), minh bạch (transparency) và khả năng phát hiện thay đổi (change detection) — ba yếu tố quan trọng trong hệ thống agent có bộ nhớ bền vững.</w:t>
       </w:r>
     </w:p>
     <w:sectPr>
@@ -17408,7 +13363,7 @@
 </file>
 
 <file path=customXml/itemProps1.xml><?xml version="1.0" encoding="utf-8"?>
-<ds:datastoreItem xmlns:ds="http://schemas.openxmlformats.org/officeDocument/2006/customXml" ds:itemID="{6340CAA4-C97A-403A-8F08-A47A9E837233}">
+<ds:datastoreItem xmlns:ds="http://schemas.openxmlformats.org/officeDocument/2006/customXml" ds:itemID="{6D415518-406C-45DB-AB6D-4800E280ACF5}">
   <ds:schemaRefs>
     <ds:schemaRef ds:uri="http://schemas.openxmlformats.org/officeDocument/2006/bibliography"/>
   </ds:schemaRefs>

</xml_diff>